<commit_message>
Updated documentation: added introduction to cryptography part
</commit_message>
<xml_diff>
--- a/AronPap_thesis.docx
+++ b/AronPap_thesis.docx
@@ -4,19 +4,1492 @@
   <w:body>
     <w:p>
       <w:pPr>
+        <w:pStyle w:val="Cmsor2"/>
+      </w:pPr>
+      <w:r>
+        <w:t>Bevezetés a Kriptográfiába: Az információvédelem tudomány</w:t>
+      </w:r>
+    </w:p>
+    <w:p>
+      <w:pPr>
+        <w:rPr>
+          <w:sz w:val="28"/>
+          <w:szCs w:val="28"/>
+        </w:rPr>
+      </w:pPr>
+      <w:r>
+        <w:rPr>
+          <w:sz w:val="28"/>
+          <w:szCs w:val="28"/>
+        </w:rPr>
+        <w:t>Az információ biztonsága és bizalmassága iránti igény egyidős az irásbeliséggel. A kriptográfia (a görög kryptos = rejtett, graphein = irás szavakból) az a tudományág, amely az üzenetek titkosításával és azok illetéktelenek előli elrejtésével foglalkozik. Míg a múltban ez elsősorban katonai és diplomáciai kiváltság volt, a digitális korban a modern társadalom működésének alapfeltételévé vált.</w:t>
+      </w:r>
+    </w:p>
+    <w:p>
+      <w:pPr>
+        <w:pStyle w:val="Cmsor3"/>
+      </w:pPr>
+      <w:r>
+        <w:t>Történelmi áttekintés: A klasszikus rejtjelezéstől az Enigmáig</w:t>
+      </w:r>
+    </w:p>
+    <w:p>
+      <w:pPr>
+        <w:rPr>
+          <w:sz w:val="28"/>
+          <w:szCs w:val="28"/>
+        </w:rPr>
+      </w:pPr>
+      <w:r>
+        <w:rPr>
+          <w:sz w:val="28"/>
+          <w:szCs w:val="28"/>
+        </w:rPr>
+        <w:t xml:space="preserve">A korai módszerek, mit a híres Caesar rejtjel, egyszerű behelyettesítésen alapultak. </w:t>
+      </w:r>
+    </w:p>
+    <w:p>
+      <w:pPr>
+        <w:pStyle w:val="Listaszerbekezds"/>
+        <w:numPr>
+          <w:ilvl w:val="0"/>
+          <w:numId w:val="4"/>
+        </w:numPr>
+        <w:rPr>
+          <w:sz w:val="28"/>
+          <w:szCs w:val="28"/>
+        </w:rPr>
+      </w:pPr>
+      <w:r>
+        <w:rPr>
+          <w:sz w:val="28"/>
+          <w:szCs w:val="28"/>
+        </w:rPr>
+        <w:t>Az ábécé minden betűjét egy meghatározott számmal eltolták</w:t>
+      </w:r>
+    </w:p>
+    <w:p>
+      <w:pPr>
+        <w:rPr>
+          <w:sz w:val="28"/>
+          <w:szCs w:val="28"/>
+        </w:rPr>
+      </w:pPr>
+      <w:r>
+        <w:rPr>
+          <w:sz w:val="28"/>
+          <w:szCs w:val="28"/>
+        </w:rPr>
+        <w:t>Bár az ókorban hatékony volt, a gyakorságielemzés (a betők előfordulási valószínűségének statisztikai vizsgálata) megjelenése után ezek a rendszerek rendkívűl sebezhetővé váltak.</w:t>
+      </w:r>
+    </w:p>
+    <w:p>
+      <w:pPr>
+        <w:rPr>
+          <w:sz w:val="28"/>
+          <w:szCs w:val="28"/>
+        </w:rPr>
+      </w:pPr>
+      <w:r>
+        <w:rPr>
+          <w:sz w:val="28"/>
+          <w:szCs w:val="28"/>
+        </w:rPr>
+        <w:t>A középkor és az újkor folyamán megjelentek a polialfabetikus rejtjelek (mint például a Vigenére rejtjel), amelyek már több különböző eltolást alkalmaztak egyetlen üzeneten belül, jelentősen megnehezítve a statisztikai feltörést.</w:t>
+      </w:r>
+    </w:p>
+    <w:p>
+      <w:pPr>
+        <w:pStyle w:val="Cmsor3"/>
+      </w:pPr>
+      <w:r>
+        <w:t>A gépi titkosítás korszaka</w:t>
+      </w:r>
+    </w:p>
+    <w:p>
+      <w:pPr>
+        <w:rPr>
+          <w:sz w:val="28"/>
+          <w:szCs w:val="28"/>
+        </w:rPr>
+      </w:pPr>
+      <w:r>
+        <w:rPr>
+          <w:sz w:val="28"/>
+          <w:szCs w:val="28"/>
+        </w:rPr>
+        <w:t>A 20. század és a világhaborúk elhozták a mechanikus és elektromechanikus titkosítógépek korát. Az Enigma és társai olyan komplexitást vittek a folyamatba, amely már elképzelhetetlen volt papír és ceruza módszerekkel. Ez a korszak kényszerítette ki a modern számítástechnika megszületését is (Alan Turing és a Colossus), lefektetve az algoritmikus gondolkodás alapjait.</w:t>
+      </w:r>
+    </w:p>
+    <w:p>
+      <w:pPr>
+        <w:pStyle w:val="Cmsor3"/>
+      </w:pPr>
+      <w:r>
+        <w:t>A modern kriptográfia alapjai</w:t>
+      </w:r>
+    </w:p>
+    <w:p>
+      <w:pPr>
+        <w:rPr>
+          <w:sz w:val="28"/>
+          <w:szCs w:val="28"/>
+        </w:rPr>
+      </w:pPr>
+      <w:r>
+        <w:rPr>
+          <w:sz w:val="28"/>
+          <w:szCs w:val="28"/>
+        </w:rPr>
+        <w:t>A moden számítógépek megjelenésével a kriptográfia elszakadt a betők tologatásától, és a tiszta matematikai, illetve a számelméleti területére költözött. Ma a két fő irányzatot különböztetünk meg, amelyek ismerete elengedhetetlen a titokmegosztási sémák megértéséhez.</w:t>
+      </w:r>
+    </w:p>
+    <w:p>
+      <w:pPr>
+        <w:pStyle w:val="Cmsor3"/>
+      </w:pPr>
+      <w:r>
+        <w:t>Szimmetrikus kulcsú titkosítás</w:t>
+      </w:r>
+    </w:p>
+    <w:p>
+      <w:pPr>
+        <w:rPr>
+          <w:sz w:val="28"/>
+          <w:szCs w:val="28"/>
+        </w:rPr>
+      </w:pPr>
+      <w:r>
+        <w:rPr>
+          <w:sz w:val="28"/>
+          <w:szCs w:val="28"/>
+        </w:rPr>
+        <w:t>Ebben a modellben a küldő és a fogadó ugyanazt a titkos kulcsot használja a titkosításhoz és a visszafejtéshez is.</w:t>
+      </w:r>
+    </w:p>
+    <w:p>
+      <w:pPr>
+        <w:pStyle w:val="Listaszerbekezds"/>
+        <w:numPr>
+          <w:ilvl w:val="0"/>
+          <w:numId w:val="4"/>
+        </w:numPr>
+        <w:rPr>
+          <w:sz w:val="28"/>
+          <w:szCs w:val="28"/>
+        </w:rPr>
+      </w:pPr>
+      <w:r>
+        <w:rPr>
+          <w:sz w:val="28"/>
+          <w:szCs w:val="28"/>
+        </w:rPr>
+        <w:lastRenderedPageBreak/>
+        <w:t xml:space="preserve">Előnye, hogy rendkívűl gyors, nagy adatmennyiségek kezelésére alkalmas, viszont a kulcsot el kell juttatni a fogadóhoz, maga a </w:t>
+      </w:r>
+      <w:r>
+        <w:rPr>
+          <w:sz w:val="28"/>
+          <w:szCs w:val="28"/>
+        </w:rPr>
+        <w:t>csatorna is így biztonsági kockázatot jelent.</w:t>
+      </w:r>
+    </w:p>
+    <w:p>
+      <w:pPr>
+        <w:pStyle w:val="Cmsor3"/>
+      </w:pPr>
+      <w:r>
+        <w:t>Aszimmetrikus kulcsú titkosítás</w:t>
+      </w:r>
+    </w:p>
+    <w:p>
+      <w:pPr>
+        <w:rPr>
+          <w:sz w:val="28"/>
+          <w:szCs w:val="28"/>
+        </w:rPr>
+      </w:pPr>
+      <w:r>
+        <w:rPr>
+          <w:sz w:val="28"/>
+          <w:szCs w:val="28"/>
+        </w:rPr>
+        <w:t>Az 1970-es évek forradalmi áttörése (RSA és Diffie-Hellman). Itt minden résztvevőnek két kulcsa van, az egyik nyilvános (amit mindenki ismer, és mindenki tud számára ezzel titkosítani) és a másik privát (amelyet csak ő ismer, és így csak ő tudja feloldani az üzenetet).</w:t>
+      </w:r>
+    </w:p>
+    <w:p>
+      <w:pPr>
+        <w:pStyle w:val="Listaszerbekezds"/>
+        <w:numPr>
+          <w:ilvl w:val="0"/>
+          <w:numId w:val="4"/>
+        </w:numPr>
+        <w:rPr>
+          <w:sz w:val="28"/>
+          <w:szCs w:val="28"/>
+        </w:rPr>
+      </w:pPr>
+      <w:r>
+        <w:rPr>
+          <w:sz w:val="28"/>
+          <w:szCs w:val="28"/>
+        </w:rPr>
+        <w:t>Ennek az alapja olyan egyirányú függvényekre épül, amelyeket könnyű kiszámolni egyik irányba, de rendkívűl nehéz ezt visszaszámolni.</w:t>
+      </w:r>
+    </w:p>
+    <w:p>
+      <w:pPr>
+        <w:pStyle w:val="Listaszerbekezds"/>
+        <w:numPr>
+          <w:ilvl w:val="0"/>
+          <w:numId w:val="4"/>
+        </w:numPr>
+        <w:rPr>
+          <w:sz w:val="28"/>
+          <w:szCs w:val="28"/>
+        </w:rPr>
+      </w:pPr>
+      <w:r>
+        <w:rPr>
+          <w:sz w:val="28"/>
+          <w:szCs w:val="28"/>
+        </w:rPr>
+        <w:t>Nagy prímek szorzata</w:t>
+      </w:r>
+    </w:p>
+    <w:p>
+      <w:pPr>
+        <w:pStyle w:val="Listaszerbekezds"/>
+        <w:numPr>
+          <w:ilvl w:val="0"/>
+          <w:numId w:val="4"/>
+        </w:numPr>
+        <w:rPr>
+          <w:sz w:val="28"/>
+          <w:szCs w:val="28"/>
+        </w:rPr>
+      </w:pPr>
+      <w:r>
+        <w:rPr>
+          <w:sz w:val="28"/>
+          <w:szCs w:val="28"/>
+        </w:rPr>
+        <w:t>Prímtényezős felbontás</w:t>
+      </w:r>
+    </w:p>
+    <w:p>
+      <w:pPr>
+        <w:pStyle w:val="Cmsor3"/>
+      </w:pPr>
+      <w:r>
+        <w:t>A titokmegosztási sémák elméleti háttere és fejlődéstörténete</w:t>
+      </w:r>
+    </w:p>
+    <w:p>
+      <w:pPr>
+        <w:rPr>
+          <w:sz w:val="28"/>
+          <w:szCs w:val="28"/>
+        </w:rPr>
+      </w:pPr>
+      <w:r>
+        <w:rPr>
+          <w:sz w:val="28"/>
+          <w:szCs w:val="28"/>
+        </w:rPr>
+        <w:t>A titokmegosztás tudománya az 1970-es évek végén vált önálló kutatási területté</w:t>
+      </w:r>
+      <w:r>
+        <w:rPr>
+          <w:sz w:val="28"/>
+          <w:szCs w:val="28"/>
+        </w:rPr>
+        <w:t xml:space="preserve">. </w:t>
+      </w:r>
+    </w:p>
+    <w:p>
+      <w:pPr>
+        <w:pStyle w:val="Cmsor3"/>
+      </w:pPr>
+      <w:r>
+        <w:t>A (t,n) küszöbsémák definíciója és a Shamir-modell</w:t>
+      </w:r>
+    </w:p>
+    <w:p>
+      <w:pPr>
+        <w:rPr>
+          <w:sz w:val="28"/>
+          <w:szCs w:val="28"/>
+        </w:rPr>
+      </w:pPr>
+      <w:r>
+        <w:rPr>
+          <w:sz w:val="28"/>
+          <w:szCs w:val="28"/>
+        </w:rPr>
+        <w:t>A titokmegosztás alapfeladat egy K titok elosztása n résztvevő (P = {p1,p2,p3,p4}) között úgy, hogy a titok rekonstrukciójához egy meghatározott számú rész-titok együttes jelenléte szükséges.</w:t>
+      </w:r>
+    </w:p>
+    <w:p>
+      <w:pPr>
+        <w:rPr>
+          <w:sz w:val="28"/>
+          <w:szCs w:val="28"/>
+        </w:rPr>
+      </w:pPr>
+      <w:r>
+        <w:rPr>
+          <w:sz w:val="28"/>
+          <w:szCs w:val="28"/>
+        </w:rPr>
+        <w:t>Egy titokmegosztási sémát (t,n) küszöbsémának nevezünk (1&lt;=t&lt;=n), ha teljesül az alábbi 2 feltétel:</w:t>
+      </w:r>
+    </w:p>
+    <w:p>
+      <w:pPr>
+        <w:pStyle w:val="Listaszerbekezds"/>
+        <w:numPr>
+          <w:ilvl w:val="0"/>
+          <w:numId w:val="4"/>
+        </w:numPr>
+        <w:rPr>
+          <w:sz w:val="28"/>
+          <w:szCs w:val="28"/>
+        </w:rPr>
+      </w:pPr>
+      <w:r>
+        <w:rPr>
+          <w:sz w:val="28"/>
+          <w:szCs w:val="28"/>
+        </w:rPr>
+        <w:t>Helyesség (Correctness): Bármely t vagy annál több résztvevő képes a titok teljes és pontos visszaállítására.</w:t>
+      </w:r>
+    </w:p>
+    <w:p>
+      <w:pPr>
+        <w:pStyle w:val="Listaszerbekezds"/>
+        <w:numPr>
+          <w:ilvl w:val="0"/>
+          <w:numId w:val="4"/>
+        </w:numPr>
+        <w:rPr>
+          <w:sz w:val="28"/>
+          <w:szCs w:val="28"/>
+        </w:rPr>
+      </w:pPr>
+      <w:r>
+        <w:rPr>
+          <w:sz w:val="28"/>
+          <w:szCs w:val="28"/>
+        </w:rPr>
+        <w:t>Biztonság (Security): Bármely t – 1 vagy kevesebb részvevő semmilyen információt nem tud kinyerni a titokról (tökéletes titokmegosztás)</w:t>
+      </w:r>
+    </w:p>
+    <w:p>
+      <w:pPr>
+        <w:pStyle w:val="Cmsor3"/>
+      </w:pPr>
+      <w:r>
+        <w:t>A Shamir-féle konstrukció</w:t>
+      </w:r>
+    </w:p>
+    <w:p>
+      <w:pPr>
+        <w:rPr>
+          <w:sz w:val="28"/>
+          <w:szCs w:val="28"/>
+        </w:rPr>
+      </w:pPr>
+      <w:r>
+        <w:rPr>
+          <w:sz w:val="28"/>
+          <w:szCs w:val="28"/>
+        </w:rPr>
+        <w:t>Adi Shamir a polinom-interpolációra alapozta a megoldását egy GF(q) véges test felett, ahol q &gt; n. A folyamat lépései:</w:t>
+      </w:r>
+    </w:p>
+    <w:p>
+      <w:pPr>
+        <w:pStyle w:val="Listaszerbekezds"/>
+        <w:numPr>
+          <w:ilvl w:val="0"/>
+          <w:numId w:val="4"/>
+        </w:numPr>
+        <w:rPr>
+          <w:sz w:val="28"/>
+          <w:szCs w:val="28"/>
+        </w:rPr>
+      </w:pPr>
+      <w:r>
+        <w:rPr>
+          <w:sz w:val="28"/>
+          <w:szCs w:val="28"/>
+        </w:rPr>
+        <w:t>Az osztó (dealer) választ egy t – 1 fokszámú polinomot: f(x) = a</w:t>
+      </w:r>
+      <w:r>
+        <w:rPr>
+          <w:sz w:val="28"/>
+          <w:szCs w:val="28"/>
+          <w:vertAlign w:val="subscript"/>
+        </w:rPr>
+        <w:t>0</w:t>
+      </w:r>
+      <w:r>
+        <w:rPr>
+          <w:sz w:val="28"/>
+          <w:szCs w:val="28"/>
+        </w:rPr>
+        <w:t xml:space="preserve"> + a</w:t>
+      </w:r>
+      <w:r>
+        <w:rPr>
+          <w:sz w:val="28"/>
+          <w:szCs w:val="28"/>
+          <w:vertAlign w:val="subscript"/>
+        </w:rPr>
+        <w:t>1</w:t>
+      </w:r>
+      <w:r>
+        <w:rPr>
+          <w:sz w:val="28"/>
+          <w:szCs w:val="28"/>
+        </w:rPr>
+        <w:t>x + a</w:t>
+      </w:r>
+      <w:r>
+        <w:rPr>
+          <w:sz w:val="28"/>
+          <w:szCs w:val="28"/>
+          <w:vertAlign w:val="subscript"/>
+        </w:rPr>
+        <w:t>2</w:t>
+      </w:r>
+      <w:r>
+        <w:rPr>
+          <w:sz w:val="28"/>
+          <w:szCs w:val="28"/>
+        </w:rPr>
+        <w:t>x</w:t>
+      </w:r>
+      <w:r>
+        <w:rPr>
+          <w:sz w:val="28"/>
+          <w:szCs w:val="28"/>
+          <w:vertAlign w:val="superscript"/>
+        </w:rPr>
+        <w:t>2</w:t>
+      </w:r>
+      <w:r>
+        <w:rPr>
+          <w:sz w:val="28"/>
+          <w:szCs w:val="28"/>
+        </w:rPr>
+        <w:t xml:space="preserve"> + … + a</w:t>
+      </w:r>
+      <w:r>
+        <w:rPr>
+          <w:sz w:val="28"/>
+          <w:szCs w:val="28"/>
+          <w:vertAlign w:val="subscript"/>
+        </w:rPr>
+        <w:t>t-1</w:t>
+      </w:r>
+      <w:r>
+        <w:rPr>
+          <w:sz w:val="28"/>
+          <w:szCs w:val="28"/>
+        </w:rPr>
+        <w:t>x</w:t>
+      </w:r>
+      <w:r>
+        <w:rPr>
+          <w:sz w:val="28"/>
+          <w:szCs w:val="28"/>
+          <w:vertAlign w:val="superscript"/>
+        </w:rPr>
+        <w:t>t-1</w:t>
+      </w:r>
+    </w:p>
+    <w:p>
+      <w:pPr>
+        <w:pStyle w:val="Listaszerbekezds"/>
+        <w:numPr>
+          <w:ilvl w:val="0"/>
+          <w:numId w:val="4"/>
+        </w:numPr>
+        <w:rPr>
+          <w:sz w:val="28"/>
+          <w:szCs w:val="28"/>
+        </w:rPr>
+      </w:pPr>
+      <w:r>
+        <w:rPr>
+          <w:sz w:val="28"/>
+          <w:szCs w:val="28"/>
+        </w:rPr>
+        <w:t>A titok a polinom konstans tagja: f(0) = a</w:t>
+      </w:r>
+      <w:r>
+        <w:rPr>
+          <w:sz w:val="28"/>
+          <w:szCs w:val="28"/>
+          <w:vertAlign w:val="subscript"/>
+        </w:rPr>
+        <w:t>0</w:t>
+      </w:r>
+      <w:r>
+        <w:rPr>
+          <w:sz w:val="28"/>
+          <w:szCs w:val="28"/>
+        </w:rPr>
+        <w:t xml:space="preserve"> = K</w:t>
+      </w:r>
+    </w:p>
+    <w:p>
+      <w:pPr>
+        <w:pStyle w:val="Listaszerbekezds"/>
+        <w:numPr>
+          <w:ilvl w:val="0"/>
+          <w:numId w:val="4"/>
+        </w:numPr>
+        <w:rPr>
+          <w:sz w:val="28"/>
+          <w:szCs w:val="28"/>
+        </w:rPr>
+      </w:pPr>
+      <w:r>
+        <w:rPr>
+          <w:sz w:val="28"/>
+          <w:szCs w:val="28"/>
+        </w:rPr>
+        <w:t>Az együtthatók (a</w:t>
+      </w:r>
+      <w:r>
+        <w:rPr>
+          <w:sz w:val="28"/>
+          <w:szCs w:val="28"/>
+          <w:vertAlign w:val="subscript"/>
+        </w:rPr>
+        <w:t>1</w:t>
+      </w:r>
+      <w:r>
+        <w:rPr>
+          <w:sz w:val="28"/>
+          <w:szCs w:val="28"/>
+        </w:rPr>
+        <w:t>, … , a</w:t>
+      </w:r>
+      <w:r>
+        <w:rPr>
+          <w:sz w:val="28"/>
+          <w:szCs w:val="28"/>
+          <w:vertAlign w:val="subscript"/>
+        </w:rPr>
+        <w:t>t-1</w:t>
+      </w:r>
+      <w:r>
+        <w:rPr>
+          <w:sz w:val="28"/>
+          <w:szCs w:val="28"/>
+        </w:rPr>
+        <w:t>) véletlenszerűen választja a véges testből</w:t>
+      </w:r>
+    </w:p>
+    <w:p>
+      <w:pPr>
+        <w:pStyle w:val="Listaszerbekezds"/>
+        <w:numPr>
+          <w:ilvl w:val="0"/>
+          <w:numId w:val="4"/>
+        </w:numPr>
+        <w:rPr>
+          <w:sz w:val="28"/>
+          <w:szCs w:val="28"/>
+        </w:rPr>
+      </w:pPr>
+      <w:r>
+        <w:rPr>
+          <w:sz w:val="28"/>
+          <w:szCs w:val="28"/>
+        </w:rPr>
+        <w:t>Minden pi résztvevő kap egy (x</w:t>
+      </w:r>
+      <w:r>
+        <w:rPr>
+          <w:sz w:val="28"/>
+          <w:szCs w:val="28"/>
+          <w:vertAlign w:val="subscript"/>
+        </w:rPr>
+        <w:t>i</w:t>
+      </w:r>
+      <w:r>
+        <w:rPr>
+          <w:sz w:val="28"/>
+          <w:szCs w:val="28"/>
+        </w:rPr>
+        <w:t>, f(x</w:t>
+      </w:r>
+      <w:r>
+        <w:rPr>
+          <w:sz w:val="28"/>
+          <w:szCs w:val="28"/>
+          <w:vertAlign w:val="subscript"/>
+        </w:rPr>
+        <w:t>i</w:t>
+      </w:r>
+      <w:r>
+        <w:rPr>
+          <w:sz w:val="28"/>
+          <w:szCs w:val="28"/>
+        </w:rPr>
+        <w:t>)) pontot, ahol xi != 0</w:t>
+      </w:r>
+    </w:p>
+    <w:p>
+      <w:pPr>
+        <w:rPr>
+          <w:sz w:val="28"/>
+          <w:szCs w:val="28"/>
+        </w:rPr>
+      </w:pPr>
+      <w:r>
+        <w:rPr>
+          <w:sz w:val="28"/>
+          <w:szCs w:val="28"/>
+        </w:rPr>
+        <w:lastRenderedPageBreak/>
+        <w:t>A matematikai alapvetés itt az, hogy egy t – 1 fokszámú polinomot pontosan t darab pont határoz meg egyértelműen. Ha csak t – 1 pontunk van, a konstant tag (a</w:t>
+      </w:r>
+      <w:r>
+        <w:rPr>
+          <w:sz w:val="28"/>
+          <w:szCs w:val="28"/>
+          <w:vertAlign w:val="subscript"/>
+        </w:rPr>
+        <w:t>0</w:t>
+      </w:r>
+      <w:r>
+        <w:rPr>
+          <w:sz w:val="28"/>
+          <w:szCs w:val="28"/>
+        </w:rPr>
+        <w:t xml:space="preserve"> = K) bármilyen értéket felvehet a véges testben, így a titok kitalálhatatlan marad.</w:t>
+      </w:r>
+    </w:p>
+    <w:p>
+      <w:pPr>
+        <w:pStyle w:val="Cmsor3"/>
+      </w:pPr>
+      <w:r>
+        <w:t>Hozzáférési struktúra</w:t>
+      </w:r>
+    </w:p>
+    <w:p>
+      <w:pPr>
+        <w:rPr>
+          <w:sz w:val="28"/>
+          <w:szCs w:val="28"/>
+        </w:rPr>
+      </w:pPr>
+      <w:r>
+        <w:rPr>
+          <w:sz w:val="28"/>
+          <w:szCs w:val="28"/>
+        </w:rPr>
+        <w:t xml:space="preserve">Nem minden esetben elegendő egyszerűen meghatározni egy küszöbszámot. A valás életben a jogosultsági körök bonyolultabbak. </w:t>
+      </w:r>
+    </w:p>
+    <w:p>
+      <w:pPr>
+        <w:pStyle w:val="Listaszerbekezds"/>
+        <w:numPr>
+          <w:ilvl w:val="0"/>
+          <w:numId w:val="4"/>
+        </w:numPr>
+        <w:rPr>
+          <w:sz w:val="28"/>
+          <w:szCs w:val="28"/>
+        </w:rPr>
+      </w:pPr>
+      <w:r>
+        <w:rPr>
+          <w:sz w:val="28"/>
+          <w:szCs w:val="28"/>
+        </w:rPr>
+        <w:t xml:space="preserve">Legyen P a résztvevők halmaza. </w:t>
+      </w:r>
+      <w:r>
+        <w:rPr>
+          <w:sz w:val="28"/>
+          <w:szCs w:val="28"/>
+        </w:rPr>
+        <w:t>Γ</w:t>
+      </w:r>
+      <w:r>
+        <w:rPr>
+          <w:sz w:val="28"/>
+          <w:szCs w:val="28"/>
+        </w:rPr>
+        <w:t xml:space="preserve"> halmazcsaládot hozzáférési struktúrának nevezzók, ha tartalmazza az összes olyan részhalmazt, amely képes a titok visszafejtésére. Ezekt a halmazokat kvalifikált részhalmazoknak nevezünk.</w:t>
+      </w:r>
+    </w:p>
+    <w:p>
+      <w:pPr>
+        <w:pStyle w:val="Listaszerbekezds"/>
+        <w:numPr>
+          <w:ilvl w:val="0"/>
+          <w:numId w:val="4"/>
+        </w:numPr>
+        <w:rPr>
+          <w:sz w:val="28"/>
+          <w:szCs w:val="28"/>
+        </w:rPr>
+      </w:pPr>
+      <w:r>
+        <w:rPr>
+          <w:sz w:val="28"/>
+          <w:szCs w:val="28"/>
+        </w:rPr>
+        <w:t>A monotonitás elve szerint egy hozzáférési struktúra akkor monton, ha igaz rá, hogy amennyiben egy A csoport képes a titok feltörésére, akkor minden olyan B csoport is képes rá, amely tartalmazza A-t. Ez a feltétel a gyakorlatban alapvetően: ha egy csoportnak joga van a titokhoz, akkor az ő segítségükkel egy nagyobb csoportnak is joga kell legyen.</w:t>
+      </w:r>
+    </w:p>
+    <w:p>
+      <w:pPr>
+        <w:pStyle w:val="Cmsor3"/>
+      </w:pPr>
+      <w:r>
+        <w:t>Az információs ráta</w:t>
+      </w:r>
+    </w:p>
+    <w:p>
+      <w:pPr>
+        <w:rPr>
+          <w:sz w:val="28"/>
+          <w:szCs w:val="28"/>
+        </w:rPr>
+      </w:pPr>
+      <w:r>
+        <w:rPr>
+          <w:sz w:val="28"/>
+          <w:szCs w:val="28"/>
+        </w:rPr>
+        <w:t xml:space="preserve">A hatékonysági mércét információs rátával jelöljük. </w:t>
+      </w:r>
+    </w:p>
+    <w:p>
+      <w:pPr>
+        <w:rPr>
+          <w:sz w:val="28"/>
+          <w:szCs w:val="28"/>
+        </w:rPr>
+      </w:pPr>
+      <w:r>
+        <w:rPr>
+          <w:sz w:val="28"/>
+          <w:szCs w:val="28"/>
+        </w:rPr>
+        <w:t>A szakdolgozatban jelentős figyelem van a séma hatékonyságán is. A szakirodalom az információs rátát így definiálta:</w:t>
+      </w:r>
+    </w:p>
+    <w:p>
+      <w:pPr>
+        <w:pStyle w:val="Listaszerbekezds"/>
+        <w:numPr>
+          <w:ilvl w:val="0"/>
+          <w:numId w:val="4"/>
+        </w:numPr>
+        <w:rPr>
+          <w:sz w:val="28"/>
+          <w:szCs w:val="28"/>
+        </w:rPr>
+      </w:pPr>
+      <w:r>
+        <w:rPr>
+          <w:sz w:val="28"/>
+          <w:szCs w:val="28"/>
+        </w:rPr>
+        <w:t xml:space="preserve">Legyen K a titkok halmaza és S a lehetséges rész-titkok halmaza. Az információs ráta = </w:t>
+      </w:r>
+      <m:oMath>
+        <m:r>
+          <w:rPr>
+            <w:rFonts w:ascii="Cambria Math" w:hAnsi="Cambria Math"/>
+            <w:sz w:val="28"/>
+            <w:szCs w:val="28"/>
+          </w:rPr>
+          <m:t>p=</m:t>
+        </m:r>
+        <m:f>
+          <m:fPr>
+            <m:ctrlPr>
+              <w:rPr>
+                <w:rFonts w:ascii="Cambria Math" w:hAnsi="Cambria Math"/>
+                <w:i/>
+                <w:sz w:val="28"/>
+                <w:szCs w:val="28"/>
+              </w:rPr>
+            </m:ctrlPr>
+          </m:fPr>
+          <m:num>
+            <m:func>
+              <m:funcPr>
+                <m:ctrlPr>
+                  <w:rPr>
+                    <w:rFonts w:ascii="Cambria Math" w:hAnsi="Cambria Math"/>
+                    <w:i/>
+                    <w:sz w:val="28"/>
+                    <w:szCs w:val="28"/>
+                  </w:rPr>
+                </m:ctrlPr>
+              </m:funcPr>
+              <m:fName>
+                <m:sSub>
+                  <m:sSubPr>
+                    <m:ctrlPr>
+                      <w:rPr>
+                        <w:rFonts w:ascii="Cambria Math" w:hAnsi="Cambria Math"/>
+                        <w:i/>
+                        <w:sz w:val="28"/>
+                        <w:szCs w:val="28"/>
+                      </w:rPr>
+                    </m:ctrlPr>
+                  </m:sSubPr>
+                  <m:e>
+                    <m:r>
+                      <w:rPr>
+                        <w:rFonts w:ascii="Cambria Math" w:hAnsi="Cambria Math"/>
+                        <w:sz w:val="28"/>
+                        <w:szCs w:val="28"/>
+                      </w:rPr>
+                      <m:t>log</m:t>
+                    </m:r>
+                  </m:e>
+                  <m:sub>
+                    <m:r>
+                      <w:rPr>
+                        <w:rFonts w:ascii="Cambria Math" w:hAnsi="Cambria Math"/>
+                        <w:sz w:val="28"/>
+                        <w:szCs w:val="28"/>
+                      </w:rPr>
+                      <m:t>2</m:t>
+                    </m:r>
+                  </m:sub>
+                </m:sSub>
+              </m:fName>
+              <m:e>
+                <m:d>
+                  <m:dPr>
+                    <m:begChr m:val="|"/>
+                    <m:endChr m:val="|"/>
+                    <m:ctrlPr>
+                      <w:rPr>
+                        <w:rFonts w:ascii="Cambria Math" w:hAnsi="Cambria Math"/>
+                        <w:i/>
+                        <w:sz w:val="28"/>
+                        <w:szCs w:val="28"/>
+                      </w:rPr>
+                    </m:ctrlPr>
+                  </m:dPr>
+                  <m:e>
+                    <m:r>
+                      <w:rPr>
+                        <w:rFonts w:ascii="Cambria Math" w:hAnsi="Cambria Math"/>
+                        <w:sz w:val="28"/>
+                        <w:szCs w:val="28"/>
+                      </w:rPr>
+                      <m:t>k</m:t>
+                    </m:r>
+                  </m:e>
+                </m:d>
+              </m:e>
+            </m:func>
+          </m:num>
+          <m:den>
+            <m:limLow>
+              <m:limLowPr>
+                <m:ctrlPr>
+                  <w:rPr>
+                    <w:rFonts w:ascii="Cambria Math" w:hAnsi="Cambria Math"/>
+                    <w:i/>
+                    <w:sz w:val="28"/>
+                    <w:szCs w:val="28"/>
+                  </w:rPr>
+                </m:ctrlPr>
+              </m:limLowPr>
+              <m:e>
+                <m:r>
+                  <w:rPr>
+                    <w:rFonts w:ascii="Cambria Math" w:hAnsi="Cambria Math"/>
+                    <w:sz w:val="28"/>
+                    <w:szCs w:val="28"/>
+                  </w:rPr>
+                  <m:t>max</m:t>
+                </m:r>
+              </m:e>
+              <m:lim>
+                <m:r>
+                  <w:rPr>
+                    <w:rFonts w:ascii="Cambria Math" w:hAnsi="Cambria Math"/>
+                    <w:sz w:val="28"/>
+                    <w:szCs w:val="28"/>
+                  </w:rPr>
+                  <m:t>1≤ⅈ≤n</m:t>
+                </m:r>
+              </m:lim>
+            </m:limLow>
+            <m:func>
+              <m:funcPr>
+                <m:ctrlPr>
+                  <w:rPr>
+                    <w:rFonts w:ascii="Cambria Math" w:hAnsi="Cambria Math"/>
+                    <w:i/>
+                    <w:sz w:val="28"/>
+                    <w:szCs w:val="28"/>
+                  </w:rPr>
+                </m:ctrlPr>
+              </m:funcPr>
+              <m:fName>
+                <m:sSub>
+                  <m:sSubPr>
+                    <m:ctrlPr>
+                      <w:rPr>
+                        <w:rFonts w:ascii="Cambria Math" w:hAnsi="Cambria Math"/>
+                        <w:i/>
+                        <w:sz w:val="28"/>
+                        <w:szCs w:val="28"/>
+                      </w:rPr>
+                    </m:ctrlPr>
+                  </m:sSubPr>
+                  <m:e>
+                    <m:r>
+                      <w:rPr>
+                        <w:rFonts w:ascii="Cambria Math" w:hAnsi="Cambria Math"/>
+                        <w:sz w:val="28"/>
+                        <w:szCs w:val="28"/>
+                      </w:rPr>
+                      <m:t>log</m:t>
+                    </m:r>
+                  </m:e>
+                  <m:sub>
+                    <m:r>
+                      <w:rPr>
+                        <w:rFonts w:ascii="Cambria Math" w:hAnsi="Cambria Math"/>
+                        <w:sz w:val="28"/>
+                        <w:szCs w:val="28"/>
+                      </w:rPr>
+                      <m:t>2</m:t>
+                    </m:r>
+                  </m:sub>
+                </m:sSub>
+              </m:fName>
+              <m:e>
+                <m:d>
+                  <m:dPr>
+                    <m:begChr m:val="|"/>
+                    <m:endChr m:val="|"/>
+                    <m:ctrlPr>
+                      <w:rPr>
+                        <w:rFonts w:ascii="Cambria Math" w:hAnsi="Cambria Math"/>
+                        <w:i/>
+                        <w:sz w:val="28"/>
+                        <w:szCs w:val="28"/>
+                      </w:rPr>
+                    </m:ctrlPr>
+                  </m:dPr>
+                  <m:e>
+                    <m:sSub>
+                      <m:sSubPr>
+                        <m:ctrlPr>
+                          <w:rPr>
+                            <w:rFonts w:ascii="Cambria Math" w:hAnsi="Cambria Math"/>
+                            <w:i/>
+                            <w:sz w:val="28"/>
+                            <w:szCs w:val="28"/>
+                          </w:rPr>
+                        </m:ctrlPr>
+                      </m:sSubPr>
+                      <m:e>
+                        <m:r>
+                          <w:rPr>
+                            <w:rFonts w:ascii="Cambria Math" w:hAnsi="Cambria Math"/>
+                            <w:sz w:val="28"/>
+                            <w:szCs w:val="28"/>
+                          </w:rPr>
+                          <m:t>s</m:t>
+                        </m:r>
+                      </m:e>
+                      <m:sub>
+                        <m:r>
+                          <w:rPr>
+                            <w:rFonts w:ascii="Cambria Math" w:hAnsi="Cambria Math"/>
+                            <w:sz w:val="28"/>
+                            <w:szCs w:val="28"/>
+                          </w:rPr>
+                          <m:t>i</m:t>
+                        </m:r>
+                      </m:sub>
+                    </m:sSub>
+                  </m:e>
+                </m:d>
+              </m:e>
+            </m:func>
+          </m:den>
+        </m:f>
+      </m:oMath>
+    </w:p>
+    <w:p>
+      <w:pPr>
+        <w:pStyle w:val="Listaszerbekezds"/>
+        <w:numPr>
+          <w:ilvl w:val="0"/>
+          <w:numId w:val="4"/>
+        </w:numPr>
+        <w:rPr>
+          <w:sz w:val="28"/>
+          <w:szCs w:val="28"/>
+        </w:rPr>
+      </w:pPr>
+      <w:r>
+        <w:rPr>
+          <w:rFonts w:eastAsiaTheme="minorEastAsia"/>
+          <w:sz w:val="28"/>
+          <w:szCs w:val="28"/>
+        </w:rPr>
+        <w:t>A ráta azt mutatja meg, hogy a résztvevőknek kiosztott információ mekkora a titok méretéhez képest.</w:t>
+      </w:r>
+    </w:p>
+    <w:p>
+      <w:pPr>
+        <w:pStyle w:val="Listaszerbekezds"/>
+        <w:numPr>
+          <w:ilvl w:val="0"/>
+          <w:numId w:val="4"/>
+        </w:numPr>
+        <w:rPr>
+          <w:sz w:val="28"/>
+          <w:szCs w:val="28"/>
+        </w:rPr>
+      </w:pPr>
+      <w:r>
+        <w:rPr>
+          <w:rFonts w:eastAsiaTheme="minorEastAsia"/>
+          <w:sz w:val="28"/>
+          <w:szCs w:val="28"/>
+        </w:rPr>
+        <w:t>Egy sémát ideálisnak nevezünk, ha p = 1. Ez azt jelenti, hogy a résztvevőknek nem kell a titoknál nagyobb adatot tárolniuk.</w:t>
+      </w:r>
+    </w:p>
+    <w:p>
+      <w:pPr>
+        <w:pStyle w:val="Listaszerbekezds"/>
+        <w:numPr>
+          <w:ilvl w:val="0"/>
+          <w:numId w:val="4"/>
+        </w:numPr>
+        <w:rPr>
+          <w:sz w:val="28"/>
+          <w:szCs w:val="28"/>
+        </w:rPr>
+      </w:pPr>
+      <w:r>
+        <w:rPr>
+          <w:rFonts w:eastAsiaTheme="minorEastAsia"/>
+          <w:sz w:val="28"/>
+          <w:szCs w:val="28"/>
+        </w:rPr>
+        <w:t>A hierarchikus modell kihívása:  Bonyolultabb struktúrák esetén a ráta nagyon könnyedén romlik. A dolgozat célja az ideális rátához minél közelebb maradni.</w:t>
+      </w:r>
+    </w:p>
+    <w:p>
+      <w:pPr>
+        <w:pStyle w:val="Cmsor3"/>
+      </w:pPr>
+      <w:r>
+        <w:t>Multilevel, Hierarchikus megközelítés (Simmons és Brickell)</w:t>
+      </w:r>
+    </w:p>
+    <w:p>
+      <w:pPr>
+        <w:rPr>
+          <w:sz w:val="28"/>
+          <w:szCs w:val="28"/>
+        </w:rPr>
+      </w:pPr>
+      <w:r>
+        <w:rPr>
+          <w:sz w:val="28"/>
+          <w:szCs w:val="28"/>
+        </w:rPr>
+        <w:t>Az 1980-as évek végén Simmons bevezett a többszintű hozzáférési struktúrákat. Ebben a modellben a résztvevők nem egyenrangúak, hanem szintekbe vannak sorolva.</w:t>
+      </w:r>
+    </w:p>
+    <w:p>
+      <w:pPr>
+        <w:pStyle w:val="Listaszerbekezds"/>
+        <w:numPr>
+          <w:ilvl w:val="0"/>
+          <w:numId w:val="4"/>
+        </w:numPr>
+        <w:rPr>
+          <w:sz w:val="28"/>
+          <w:szCs w:val="28"/>
+        </w:rPr>
+      </w:pPr>
+      <w:r>
+        <w:rPr>
+          <w:sz w:val="28"/>
+          <w:szCs w:val="28"/>
+        </w:rPr>
+        <w:lastRenderedPageBreak/>
+        <w:t xml:space="preserve">Simmons elve: Egy résztvevő szintje meghatározza, hogy hány darab egységi információt hordoz. Például egy magasabb rangú vezető több kulcsot kap, mint egy beosztott. </w:t>
+      </w:r>
+    </w:p>
+    <w:p>
+      <w:pPr>
+        <w:pStyle w:val="Listaszerbekezds"/>
+        <w:numPr>
+          <w:ilvl w:val="0"/>
+          <w:numId w:val="4"/>
+        </w:numPr>
+        <w:rPr>
+          <w:sz w:val="28"/>
+          <w:szCs w:val="28"/>
+        </w:rPr>
+      </w:pPr>
+      <w:r>
+        <w:rPr>
+          <w:sz w:val="28"/>
+          <w:szCs w:val="28"/>
+        </w:rPr>
+        <w:t>Brickell</w:t>
+      </w:r>
+      <w:r>
+        <w:rPr>
+          <w:sz w:val="28"/>
+          <w:szCs w:val="28"/>
+        </w:rPr>
+        <w:t xml:space="preserve"> bebizonyította, hogy tetszőleges többszintű struktúrához építhető ideális séma mátrix-alapű konstrukciókkal, amenniyben a választott véges test (GF(q)) mérete elég nagy.</w:t>
+      </w:r>
+    </w:p>
+    <w:p>
+      <w:pPr>
+        <w:pStyle w:val="Cmsor3"/>
+      </w:pPr>
+      <w:r>
+        <w:t>A javasolt hierarchikus modell elméleti alapvetése</w:t>
+      </w:r>
+    </w:p>
+    <w:p>
+      <w:pPr>
+        <w:rPr>
+          <w:sz w:val="28"/>
+          <w:szCs w:val="28"/>
+        </w:rPr>
+      </w:pPr>
+      <w:r>
+        <w:rPr>
+          <w:sz w:val="28"/>
+          <w:szCs w:val="28"/>
+        </w:rPr>
+        <w:t>Bár az irodalmi áttekintésben bemutatott (t, n)-küszöbséma minden résztvevőt egyenrangúnak kezel, maga Adi Shamir már az 1979-es alapművében (</w:t>
+      </w:r>
+      <w:r>
+        <w:rPr>
+          <w:i/>
+          <w:iCs/>
+          <w:sz w:val="28"/>
+          <w:szCs w:val="28"/>
+        </w:rPr>
+        <w:t>How to Share a Secret</w:t>
+      </w:r>
+      <w:r>
+        <w:rPr>
+          <w:sz w:val="28"/>
+          <w:szCs w:val="28"/>
+        </w:rPr>
+        <w:t>) utalt arra, hogy a modell kiterjeszthető hierarchikus rendszerekre is.</w:t>
+      </w:r>
+    </w:p>
+    <w:p>
+      <w:pPr>
+        <w:pStyle w:val="Cmsor3"/>
+      </w:pPr>
+      <w:r>
+        <w:t>A Shamir-féle "Check Signature" példa és a hierarchia igénye</w:t>
+      </w:r>
+    </w:p>
+    <w:p>
+      <w:pPr>
+        <w:rPr>
+          <w:sz w:val="28"/>
+          <w:szCs w:val="28"/>
+        </w:rPr>
+      </w:pPr>
+      <w:r>
+        <w:rPr>
+          <w:sz w:val="28"/>
+          <w:szCs w:val="28"/>
+        </w:rPr>
+        <w:t>Shamir felismerte, hogy bizonyos esetekben a titok (például egy banki átutalás engedélyezése vagy egy vállalati széf kódja) visszafejtéséhez szükséges rész-titkok száma függhet a résztvevő fontosságától.</w:t>
+      </w:r>
+    </w:p>
+    <w:p>
+      <w:pPr>
+        <w:numPr>
+          <w:ilvl w:val="0"/>
+          <w:numId w:val="5"/>
+        </w:numPr>
+        <w:rPr>
+          <w:sz w:val="28"/>
+          <w:szCs w:val="28"/>
+        </w:rPr>
+      </w:pPr>
+      <w:r>
+        <w:rPr>
+          <w:sz w:val="28"/>
+          <w:szCs w:val="28"/>
+        </w:rPr>
+        <w:t>A klasszikus példa: Egy vállalatnál egy csekk aláírásához szükség lehet két elnökhelyettesre, vagy egy elnökhelyettesre és három titkárra.</w:t>
+      </w:r>
+    </w:p>
+    <w:p>
+      <w:pPr>
+        <w:numPr>
+          <w:ilvl w:val="0"/>
+          <w:numId w:val="5"/>
+        </w:numPr>
+        <w:rPr>
+          <w:sz w:val="28"/>
+          <w:szCs w:val="28"/>
+        </w:rPr>
+      </w:pPr>
+      <w:r>
+        <w:rPr>
+          <w:sz w:val="28"/>
+          <w:szCs w:val="28"/>
+        </w:rPr>
+        <w:t>A megoldás kulcsa: Shamir javaslata szerint ez úgy érhető el, ha a fontosabb személyek több pontot (tuple of polynomial values) kapnak ugyanabból a polinomból.</w:t>
+      </w:r>
+    </w:p>
+    <w:p>
+      <w:pPr>
+        <w:rPr>
+          <w:sz w:val="28"/>
+          <w:szCs w:val="28"/>
+        </w:rPr>
+      </w:pPr>
+      <w:r>
+        <w:rPr>
+          <w:sz w:val="28"/>
+          <w:szCs w:val="28"/>
+        </w:rPr>
+        <w:t>Ez az észrevétel szolgáltatja a dolgozatom alapját: a hierarchikus koncepció nem egy utólagos kiegészítés, hanem a küszöbsémák egy mélyebb, strukturált felhasználási módja.</w:t>
+      </w:r>
+    </w:p>
+    <w:p>
+      <w:pPr>
+        <w:pStyle w:val="Cmsor3"/>
+      </w:pPr>
+      <w:r>
+        <w:t>A javasolt konstrukciós algoritmus célkitűzései</w:t>
+      </w:r>
+    </w:p>
+    <w:p>
+      <w:pPr>
+        <w:rPr>
+          <w:sz w:val="28"/>
+          <w:szCs w:val="28"/>
+        </w:rPr>
+      </w:pPr>
+      <w:r>
+        <w:rPr>
+          <w:sz w:val="28"/>
+          <w:szCs w:val="28"/>
+        </w:rPr>
+        <w:t>A szakdolgozatban bemutatott algoritmus célja egy olyan ideális titokmegosztási séma létrehozása, amely hűen tükrözi egy modern vállalat szervezeti felépítését. A konstrukció szakít a hagyományos "egyenrangú" (uniform) hozzáférési struktúrákkal, és a következő alapelvekre épül:</w:t>
+      </w:r>
+    </w:p>
+    <w:p>
+      <w:pPr>
+        <w:numPr>
+          <w:ilvl w:val="0"/>
+          <w:numId w:val="6"/>
+        </w:numPr>
+        <w:rPr>
+          <w:sz w:val="28"/>
+          <w:szCs w:val="28"/>
+        </w:rPr>
+      </w:pPr>
+      <w:r>
+        <w:rPr>
+          <w:sz w:val="28"/>
+          <w:szCs w:val="28"/>
+        </w:rPr>
+        <w:t>Nem-uniform hozzáférési struktúra: A kvalifikált részhalmazok összetétele a résztvevők rangjától függ, nem csupán a létszámuktól.</w:t>
+      </w:r>
+    </w:p>
+    <w:p>
+      <w:pPr>
+        <w:numPr>
+          <w:ilvl w:val="0"/>
+          <w:numId w:val="6"/>
+        </w:numPr>
+        <w:rPr>
+          <w:sz w:val="28"/>
+          <w:szCs w:val="28"/>
+        </w:rPr>
+      </w:pPr>
+      <w:r>
+        <w:rPr>
+          <w:sz w:val="28"/>
+          <w:szCs w:val="28"/>
+        </w:rPr>
+        <w:t>Fa-alapú reprezentáció: A hierarchiát egy gráf (fa) reprezentálja, ahol a csúcsok a résztvevők, az élek pedig a függőségi viszonyokat mutatják.</w:t>
+      </w:r>
+    </w:p>
+    <w:p>
+      <w:pPr>
+        <w:numPr>
+          <w:ilvl w:val="0"/>
+          <w:numId w:val="6"/>
+        </w:numPr>
+        <w:rPr>
+          <w:sz w:val="28"/>
+          <w:szCs w:val="28"/>
+        </w:rPr>
+      </w:pPr>
+      <w:r>
+        <w:rPr>
+          <w:sz w:val="28"/>
+          <w:szCs w:val="28"/>
+        </w:rPr>
+        <w:lastRenderedPageBreak/>
+        <w:t>Ideális információs ráta: Az algoritmus biztosítja, hogy minden résztvevő számára kiosztott információ arányos legyen a titok méretével ($\rho = 1$), így elkerülve az információs túlterhelést.</w:t>
+      </w:r>
+    </w:p>
+    <w:p>
+      <w:pPr>
+        <w:pStyle w:val="Cmsor3"/>
+      </w:pPr>
+      <w:r>
+        <w:t>A Dealer (Osztó) szerepe és a kétfázisú folyamat</w:t>
+      </w:r>
+    </w:p>
+    <w:p>
+      <w:pPr>
+        <w:rPr>
+          <w:sz w:val="28"/>
+          <w:szCs w:val="28"/>
+        </w:rPr>
+      </w:pPr>
+      <w:r>
+        <w:rPr>
+          <w:sz w:val="28"/>
+          <w:szCs w:val="28"/>
+        </w:rPr>
+        <w:t>A rendszerben a Dealer (aki lehet például az igazgatótanács vagy a rendszergazda) központi szerepet tölt be. A konstrukció két fő fázisra oszlik, amelyeket a szoftverem implementál:</w:t>
+      </w:r>
+    </w:p>
+    <w:p>
+      <w:pPr>
+        <w:pStyle w:val="Listaszerbekezds"/>
+        <w:numPr>
+          <w:ilvl w:val="0"/>
+          <w:numId w:val="4"/>
+        </w:numPr>
+        <w:rPr>
+          <w:sz w:val="28"/>
+          <w:szCs w:val="28"/>
+        </w:rPr>
+      </w:pPr>
+      <w:r>
+        <w:rPr>
+          <w:sz w:val="28"/>
+          <w:szCs w:val="28"/>
+        </w:rPr>
+        <w:t>I. fázis: Inicializáció és struktúraépítés: A hierarchia magasságának (h) meghatározása és a résztvevők besorolása a megfelelő szintekre (</w:t>
+      </w:r>
+      <w:r>
+        <w:rPr>
+          <w:sz w:val="28"/>
+          <w:szCs w:val="28"/>
+        </w:rPr>
+        <w:t>j</w:t>
+      </w:r>
+      <w:r>
+        <w:rPr>
+          <w:sz w:val="28"/>
+          <w:szCs w:val="28"/>
+        </w:rPr>
+        <w:t xml:space="preserve">=1, </w:t>
+      </w:r>
+      <w:r>
+        <w:rPr>
+          <w:sz w:val="28"/>
+          <w:szCs w:val="28"/>
+        </w:rPr>
+        <w:t xml:space="preserve">… </w:t>
+      </w:r>
+      <w:r>
+        <w:rPr>
+          <w:sz w:val="28"/>
+          <w:szCs w:val="28"/>
+        </w:rPr>
+        <w:t>, h). Ebben a szakaszban dől el a "játék szabályrendszere".</w:t>
+      </w:r>
+    </w:p>
+    <w:p>
+      <w:pPr>
+        <w:pStyle w:val="Listaszerbekezds"/>
+        <w:numPr>
+          <w:ilvl w:val="0"/>
+          <w:numId w:val="4"/>
+        </w:numPr>
+        <w:rPr>
+          <w:sz w:val="28"/>
+          <w:szCs w:val="28"/>
+        </w:rPr>
+      </w:pPr>
+      <w:r>
+        <w:rPr>
+          <w:sz w:val="28"/>
+          <w:szCs w:val="28"/>
+        </w:rPr>
+        <w:t>II. fázis: Titokfelosztás (Distribution): Itt történik a matematikai mag: a titok (K) bevitele, a véletlen polinom generálása, és a specifikus koordináták kiszámítása a rangok alapján.</w:t>
+      </w:r>
+    </w:p>
+    <w:p>
+      <w:pPr>
+        <w:rPr>
+          <w:sz w:val="28"/>
+          <w:szCs w:val="28"/>
+        </w:rPr>
+      </w:pPr>
+      <w:r>
+        <w:rPr>
+          <w:sz w:val="28"/>
+          <w:szCs w:val="28"/>
+        </w:rPr>
+        <w:t>Ez a kétfázisú megközelítés garantálja, hogy a rendszer rugalmas maradjon: a hierarchia változása esetén a Dealer képes újraszámolni a jogosultságokat anélkül, hogy a teljes matematikai modellt meg kellene változtatni.</w:t>
+      </w:r>
+    </w:p>
+    <w:p>
+      <w:pPr>
+        <w:rPr>
+          <w:sz w:val="28"/>
+          <w:szCs w:val="28"/>
+        </w:rPr>
+      </w:pPr>
+    </w:p>
+    <w:p>
+      <w:pPr>
         <w:pStyle w:val="Cmsor1"/>
       </w:pPr>
       <w:r>
         <w:t>Hiearchicai modell inicializálása</w:t>
       </w:r>
-    </w:p>
-    <w:p>
-      <w:pPr>
-        <w:rPr>
-          <w:sz w:val="28"/>
-          <w:szCs w:val="28"/>
-        </w:rPr>
-      </w:pPr>
     </w:p>
     <w:p>
       <w:pPr>
@@ -192,6 +1665,7 @@
           <w:sz w:val="28"/>
           <w:szCs w:val="28"/>
         </w:rPr>
+        <w:lastRenderedPageBreak/>
         <w:t>A hierarchikus szintek (Nj): A vállalat dolgozóit szintekre osztjuk. Az Nj halmaz tartalmazza az összes olyan dolgozót, aki a j-edik szinten tartózkodik.</w:t>
       </w:r>
     </w:p>
@@ -313,10 +1787,10 @@
       </w:pPr>
       <w:r>
         <w:rPr>
-          <w:sz w:val="28"/>
-          <w:szCs w:val="28"/>
-        </w:rPr>
-        <w:lastRenderedPageBreak/>
+          <w:noProof/>
+          <w:sz w:val="28"/>
+          <w:szCs w:val="28"/>
+        </w:rPr>
         <w:drawing>
           <wp:inline distT="0" distB="0" distL="0" distR="0" wp14:anchorId="46C87CFC" wp14:editId="6D017107">
             <wp:extent cx="5760720" cy="3815715"/>
@@ -401,6 +1875,7 @@
           <w:sz w:val="28"/>
           <w:szCs w:val="28"/>
         </w:rPr>
+        <w:lastRenderedPageBreak/>
         <w:t>Szintek eloszlása: A gráf 3 jól elkülöníthető szintet (h=3) mutat. A legfelső szinten helyezkedik el a legnagyobb súllyal rendelkező részvevő, fővezető (j=3), amíg az alsóbb szinteken a középvezetők (j=2) és a beosztottak (j=1)</w:t>
       </w:r>
     </w:p>
@@ -934,6 +2409,7 @@
       </w:r>
       <w:r>
         <w:rPr>
+          <w:noProof/>
           <w:sz w:val="28"/>
           <w:szCs w:val="28"/>
         </w:rPr>
@@ -1055,6 +2531,7 @@
       </w:r>
       <w:r>
         <w:rPr>
+          <w:noProof/>
           <w:sz w:val="28"/>
           <w:szCs w:val="28"/>
         </w:rPr>
@@ -1227,11 +2704,1674 @@
     </w:p>
     <w:p>
       <w:pPr>
-        <w:rPr>
-          <w:sz w:val="28"/>
-          <w:szCs w:val="28"/>
-        </w:rPr>
-      </w:pPr>
+        <w:pStyle w:val="Cmsor2"/>
+      </w:pPr>
+      <w:r>
+        <w:t>Implementációs technológia és felhasználói szemléltetési felület</w:t>
+      </w:r>
+    </w:p>
+    <w:p>
+      <w:pPr>
+        <w:rPr>
+          <w:sz w:val="28"/>
+          <w:szCs w:val="28"/>
+        </w:rPr>
+      </w:pPr>
+      <w:r>
+        <w:rPr>
+          <w:sz w:val="28"/>
+          <w:szCs w:val="28"/>
+        </w:rPr>
+        <w:t xml:space="preserve">A </w:t>
+      </w:r>
+      <w:r>
+        <w:rPr>
+          <w:sz w:val="28"/>
+          <w:szCs w:val="28"/>
+        </w:rPr>
+        <w:t>hierarchikus titokmegosztási séma gyakorlati megvalósításánál az elsődleges célem az átláthatóság volt. Ebben a fejezetben részletezem a választott eszközöket és a szoftver grafikus felületének felépítését.</w:t>
+      </w:r>
+    </w:p>
+    <w:p>
+      <w:pPr>
+        <w:pStyle w:val="Listaszerbekezds"/>
+        <w:numPr>
+          <w:ilvl w:val="0"/>
+          <w:numId w:val="1"/>
+        </w:numPr>
+        <w:rPr>
+          <w:sz w:val="28"/>
+          <w:szCs w:val="28"/>
+        </w:rPr>
+      </w:pPr>
+      <w:r>
+        <w:rPr>
+          <w:sz w:val="28"/>
+          <w:szCs w:val="28"/>
+        </w:rPr>
+        <w:t>Python és Tkinter</w:t>
+      </w:r>
+    </w:p>
+    <w:p>
+      <w:pPr>
+        <w:pStyle w:val="Listaszerbekezds"/>
+        <w:numPr>
+          <w:ilvl w:val="1"/>
+          <w:numId w:val="1"/>
+        </w:numPr>
+        <w:rPr>
+          <w:sz w:val="28"/>
+          <w:szCs w:val="28"/>
+        </w:rPr>
+      </w:pPr>
+      <w:r>
+        <w:rPr>
+          <w:sz w:val="28"/>
+          <w:szCs w:val="28"/>
+        </w:rPr>
+        <w:t>A fejlesztéshet a Python programozási nyelvet választottam. A választást több szempontból indolkoltam: A titokmegosztás matematikai alapjai (polonomok kezelése, véges testek feletti műveletek) Pythonban hatékonyan implementálhatók.</w:t>
+      </w:r>
+    </w:p>
+    <w:p>
+      <w:pPr>
+        <w:pStyle w:val="Listaszerbekezds"/>
+        <w:numPr>
+          <w:ilvl w:val="1"/>
+          <w:numId w:val="1"/>
+        </w:numPr>
+        <w:rPr>
+          <w:sz w:val="28"/>
+          <w:szCs w:val="28"/>
+        </w:rPr>
+      </w:pPr>
+      <w:r>
+        <w:rPr>
+          <w:sz w:val="28"/>
+          <w:szCs w:val="28"/>
+        </w:rPr>
+        <w:t>A nyelv tömörsége lehetővé tette, hogy az elméleti modellt gyorsan működő kóddá alakítsam</w:t>
+      </w:r>
+    </w:p>
+    <w:p>
+      <w:pPr>
+        <w:pStyle w:val="Listaszerbekezds"/>
+        <w:numPr>
+          <w:ilvl w:val="1"/>
+          <w:numId w:val="1"/>
+        </w:numPr>
+        <w:rPr>
+          <w:sz w:val="28"/>
+          <w:szCs w:val="28"/>
+        </w:rPr>
+      </w:pPr>
+      <w:r>
+        <w:rPr>
+          <w:sz w:val="28"/>
+          <w:szCs w:val="28"/>
+        </w:rPr>
+        <w:t xml:space="preserve">A grafikus felhasználói felület megvalósításához a Tkinter könyvtárat használtam. Ez a Python beépített, szabváányos GUI-csomagja. </w:t>
+      </w:r>
+    </w:p>
+    <w:p>
+      <w:pPr>
+        <w:pStyle w:val="Listaszerbekezds"/>
+        <w:numPr>
+          <w:ilvl w:val="1"/>
+          <w:numId w:val="1"/>
+        </w:numPr>
+        <w:rPr>
+          <w:sz w:val="28"/>
+          <w:szCs w:val="28"/>
+        </w:rPr>
+      </w:pPr>
+      <w:r>
+        <w:rPr>
+          <w:sz w:val="28"/>
+          <w:szCs w:val="28"/>
+        </w:rPr>
+        <w:t>A Tkinter natívan integrált, nem igényel külső függőségeket, így a mellékelt kód bármilyen standard Python környezetben azonnal futtatható.</w:t>
+      </w:r>
+    </w:p>
+    <w:p>
+      <w:pPr>
+        <w:pStyle w:val="Listaszerbekezds"/>
+        <w:numPr>
+          <w:ilvl w:val="0"/>
+          <w:numId w:val="1"/>
+        </w:numPr>
+        <w:rPr>
+          <w:sz w:val="28"/>
+          <w:szCs w:val="28"/>
+        </w:rPr>
+      </w:pPr>
+      <w:r>
+        <w:rPr>
+          <w:sz w:val="28"/>
+          <w:szCs w:val="28"/>
+        </w:rPr>
+        <w:t>A felhasználói felület felépítése:</w:t>
+      </w:r>
+    </w:p>
+    <w:p>
+      <w:pPr>
+        <w:pStyle w:val="Listaszerbekezds"/>
+        <w:numPr>
+          <w:ilvl w:val="1"/>
+          <w:numId w:val="1"/>
+        </w:numPr>
+        <w:rPr>
+          <w:sz w:val="28"/>
+          <w:szCs w:val="28"/>
+        </w:rPr>
+      </w:pPr>
+      <w:r>
+        <w:rPr>
+          <w:sz w:val="28"/>
+          <w:szCs w:val="28"/>
+        </w:rPr>
+        <w:t>A main.py fájlban definiált főablak a rendszer irányítóközpontja. A felület logikailag három fő egységre tagolható.</w:t>
+      </w:r>
+    </w:p>
+    <w:p>
+      <w:pPr>
+        <w:pStyle w:val="Listaszerbekezds"/>
+        <w:numPr>
+          <w:ilvl w:val="2"/>
+          <w:numId w:val="1"/>
+        </w:numPr>
+        <w:rPr>
+          <w:sz w:val="28"/>
+          <w:szCs w:val="28"/>
+        </w:rPr>
+      </w:pPr>
+      <w:r>
+        <w:rPr>
+          <w:sz w:val="28"/>
+          <w:szCs w:val="28"/>
+        </w:rPr>
+        <w:t>Az ablak tetején helyezkedik el a label_h objektum, amely dinamikusan jelzi a hierarchia aktuális magasságát (h). Ez a paraméter határozza meg a polinom fokszámát és a résztvevők számára választható maximális szintet.</w:t>
+      </w:r>
+    </w:p>
+    <w:p>
+      <w:pPr>
+        <w:pStyle w:val="Listaszerbekezds"/>
+        <w:numPr>
+          <w:ilvl w:val="2"/>
+          <w:numId w:val="1"/>
+        </w:numPr>
+        <w:rPr>
+          <w:sz w:val="28"/>
+          <w:szCs w:val="28"/>
+        </w:rPr>
+      </w:pPr>
+      <w:r>
+        <w:rPr>
+          <w:sz w:val="28"/>
+          <w:szCs w:val="28"/>
+        </w:rPr>
+        <w:lastRenderedPageBreak/>
+        <w:t>A vezérlőpultban a funkciók eléréséhez egy vízszintes gombelrendezést alkalmaztam. Ez a „Control Panel”, amely segíti a felhasználót a folyamat sorrendiségének betartásában is. A gombok (add, delete, new simulation, distribute, decrypt) a buttonfunctions.py modulban definiált logikát hívják meg</w:t>
+      </w:r>
+    </w:p>
+    <w:p>
+      <w:pPr>
+        <w:pStyle w:val="Listaszerbekezds"/>
+        <w:numPr>
+          <w:ilvl w:val="2"/>
+          <w:numId w:val="1"/>
+        </w:numPr>
+        <w:rPr>
+          <w:sz w:val="28"/>
+          <w:szCs w:val="28"/>
+        </w:rPr>
+      </w:pPr>
+      <w:r>
+        <w:rPr>
+          <w:sz w:val="28"/>
+          <w:szCs w:val="28"/>
+        </w:rPr>
+        <w:t>Adatmegjelenítő táblázat a résztvevők listázásához a ttk.Treeview komponenst választottam. Ez a modern táblázatos megjelenítő három oszlopot kezel:</w:t>
+      </w:r>
+    </w:p>
+    <w:p>
+      <w:pPr>
+        <w:pStyle w:val="Listaszerbekezds"/>
+        <w:numPr>
+          <w:ilvl w:val="3"/>
+          <w:numId w:val="1"/>
+        </w:numPr>
+        <w:rPr>
+          <w:sz w:val="28"/>
+          <w:szCs w:val="28"/>
+        </w:rPr>
+      </w:pPr>
+      <w:r>
+        <w:rPr>
+          <w:sz w:val="28"/>
+          <w:szCs w:val="28"/>
+        </w:rPr>
+        <w:t>ID: A résztvevő globálisan egyedi azonosítója (i).</w:t>
+      </w:r>
+    </w:p>
+    <w:p>
+      <w:pPr>
+        <w:pStyle w:val="Listaszerbekezds"/>
+        <w:numPr>
+          <w:ilvl w:val="3"/>
+          <w:numId w:val="1"/>
+        </w:numPr>
+        <w:rPr>
+          <w:sz w:val="28"/>
+          <w:szCs w:val="28"/>
+        </w:rPr>
+      </w:pPr>
+      <w:r>
+        <w:rPr>
+          <w:sz w:val="28"/>
+          <w:szCs w:val="28"/>
+        </w:rPr>
+        <w:t>Level: A hierarchikus rang (j), amely meghatározza a súlyt.</w:t>
+      </w:r>
+    </w:p>
+    <w:p>
+      <w:pPr>
+        <w:pStyle w:val="Listaszerbekezds"/>
+        <w:numPr>
+          <w:ilvl w:val="3"/>
+          <w:numId w:val="1"/>
+        </w:numPr>
+        <w:rPr>
+          <w:sz w:val="28"/>
+          <w:szCs w:val="28"/>
+        </w:rPr>
+      </w:pPr>
+      <w:r>
+        <w:rPr>
+          <w:sz w:val="28"/>
+          <w:szCs w:val="28"/>
+        </w:rPr>
+        <w:t>Shares: Itt jelennek meg a már kiosztott titok-töredékek.</w:t>
+      </w:r>
+    </w:p>
+    <w:p>
+      <w:pPr>
+        <w:pStyle w:val="Listaszerbekezds"/>
+        <w:numPr>
+          <w:ilvl w:val="2"/>
+          <w:numId w:val="1"/>
+        </w:numPr>
+        <w:rPr>
+          <w:sz w:val="28"/>
+          <w:szCs w:val="28"/>
+        </w:rPr>
+      </w:pPr>
+      <w:r>
+        <w:rPr>
+          <w:sz w:val="28"/>
+          <w:szCs w:val="28"/>
+        </w:rPr>
+        <w:t>Ez a vizuális reprezentáció engedélyezi az olvasót egyszerű használatra, átláthatóságra és a titkosítás működtetésére.</w:t>
+      </w:r>
+    </w:p>
+    <w:p>
+      <w:pPr>
+        <w:pStyle w:val="Listaszerbekezds"/>
+        <w:numPr>
+          <w:ilvl w:val="0"/>
+          <w:numId w:val="1"/>
+        </w:numPr>
+        <w:rPr>
+          <w:sz w:val="28"/>
+          <w:szCs w:val="28"/>
+        </w:rPr>
+      </w:pPr>
+      <w:r>
+        <w:rPr>
+          <w:sz w:val="28"/>
+          <w:szCs w:val="28"/>
+        </w:rPr>
+        <w:t>Perzisztens Adatkezelés: SQLite</w:t>
+      </w:r>
+    </w:p>
+    <w:p>
+      <w:pPr>
+        <w:pStyle w:val="Listaszerbekezds"/>
+        <w:numPr>
+          <w:ilvl w:val="1"/>
+          <w:numId w:val="1"/>
+        </w:numPr>
+        <w:rPr>
+          <w:sz w:val="28"/>
+          <w:szCs w:val="28"/>
+        </w:rPr>
+      </w:pPr>
+      <w:r>
+        <w:rPr>
+          <w:sz w:val="28"/>
+          <w:szCs w:val="28"/>
+        </w:rPr>
+        <w:t>A szoftver egyik legfontosabb jellemzője, hogy az adatokat nem csupán a memőriába tárolja, hanem egy adatbázisban is rögzíti. Ez biztosítja, hogy a szimuláció állapota a program bezárása és újraindítása után is megmaradjon.</w:t>
+      </w:r>
+    </w:p>
+    <w:p>
+      <w:pPr>
+        <w:pStyle w:val="Listaszerbekezds"/>
+        <w:numPr>
+          <w:ilvl w:val="1"/>
+          <w:numId w:val="1"/>
+        </w:numPr>
+        <w:rPr>
+          <w:sz w:val="28"/>
+          <w:szCs w:val="28"/>
+        </w:rPr>
+      </w:pPr>
+      <w:r>
+        <w:rPr>
+          <w:sz w:val="28"/>
+          <w:szCs w:val="28"/>
+        </w:rPr>
+        <w:t>Két táblát hoztam létre a hierarchy.db fájlba:</w:t>
+      </w:r>
+    </w:p>
+    <w:p>
+      <w:pPr>
+        <w:pStyle w:val="Listaszerbekezds"/>
+        <w:numPr>
+          <w:ilvl w:val="2"/>
+          <w:numId w:val="1"/>
+        </w:numPr>
+        <w:rPr>
+          <w:sz w:val="28"/>
+          <w:szCs w:val="28"/>
+        </w:rPr>
+      </w:pPr>
+      <w:r>
+        <w:rPr>
+          <w:sz w:val="28"/>
+          <w:szCs w:val="28"/>
+        </w:rPr>
+        <w:t>hierarchy_settings: Ez tárolja a rendszer globális konfigurációját, ami a fa magassága. Ez biztosítja, hogy a program tudja, milyen szabályrendszer szerint indult el legutóbb</w:t>
+      </w:r>
+    </w:p>
+    <w:p>
+      <w:pPr>
+        <w:pStyle w:val="Listaszerbekezds"/>
+        <w:numPr>
+          <w:ilvl w:val="2"/>
+          <w:numId w:val="1"/>
+        </w:numPr>
+        <w:rPr>
+          <w:sz w:val="28"/>
+          <w:szCs w:val="28"/>
+        </w:rPr>
+      </w:pPr>
+      <w:r>
+        <w:rPr>
+          <w:sz w:val="28"/>
+          <w:szCs w:val="28"/>
+        </w:rPr>
+        <w:t>participants: Itt tárolódnak a dolgozók adatai. A shares oszlop TEXT típust kapott, mivel egy résztvevőnek több koordinátája is lehet, amelyeket vesszővel elválasztott karakterláncként mentődik el, majd betöltéskoz visszaalakítódik listává.</w:t>
+      </w:r>
+    </w:p>
+    <w:p>
+      <w:pPr>
+        <w:pStyle w:val="Listaszerbekezds"/>
+        <w:numPr>
+          <w:ilvl w:val="0"/>
+          <w:numId w:val="1"/>
+        </w:numPr>
+        <w:rPr>
+          <w:sz w:val="28"/>
+          <w:szCs w:val="28"/>
+        </w:rPr>
+      </w:pPr>
+      <w:r>
+        <w:rPr>
+          <w:sz w:val="28"/>
+          <w:szCs w:val="28"/>
+        </w:rPr>
+        <w:t>Rendszer inicializálása:</w:t>
+      </w:r>
+    </w:p>
+    <w:p>
+      <w:pPr>
+        <w:pStyle w:val="Listaszerbekezds"/>
+        <w:numPr>
+          <w:ilvl w:val="1"/>
+          <w:numId w:val="1"/>
+        </w:numPr>
+        <w:rPr>
+          <w:sz w:val="28"/>
+          <w:szCs w:val="28"/>
+        </w:rPr>
+      </w:pPr>
+      <w:r>
+        <w:rPr>
+          <w:sz w:val="28"/>
+          <w:szCs w:val="28"/>
+        </w:rPr>
+        <w:t>A szoftver ind</w:t>
+      </w:r>
+      <w:r>
+        <w:rPr>
+          <w:sz w:val="28"/>
+          <w:szCs w:val="28"/>
+        </w:rPr>
+        <w:t xml:space="preserve">ításakor egy folyamat zajlik le, amely garantálja, hogy a modell és az adatbázis szinkronban legyen. </w:t>
+      </w:r>
+    </w:p>
+    <w:p>
+      <w:pPr>
+        <w:pStyle w:val="Listaszerbekezds"/>
+        <w:numPr>
+          <w:ilvl w:val="2"/>
+          <w:numId w:val="1"/>
+        </w:numPr>
+        <w:rPr>
+          <w:sz w:val="28"/>
+          <w:szCs w:val="28"/>
+        </w:rPr>
+      </w:pPr>
+      <w:r>
+        <w:rPr>
+          <w:sz w:val="28"/>
+          <w:szCs w:val="28"/>
+        </w:rPr>
+        <w:t xml:space="preserve">A program futása a sqlite3.connect(„hierarchy.db”) hívással kezdődik. Az SQLite egyik előnye, hogy ha a fájl nem létezik, automatikusan létrehozza azt. Ezt követően a rendszer </w:t>
+      </w:r>
+      <w:r>
+        <w:rPr>
+          <w:sz w:val="28"/>
+          <w:szCs w:val="28"/>
+        </w:rPr>
+        <w:lastRenderedPageBreak/>
+        <w:t>CREATE TABLE IF NOT EXISTS parancsokat futtat, amelyekkel biztosítja a participants és a hierarchy_settings táblák meglétét.</w:t>
+      </w:r>
+    </w:p>
+    <w:p>
+      <w:pPr>
+        <w:pStyle w:val="Listaszerbekezds"/>
+        <w:numPr>
+          <w:ilvl w:val="1"/>
+          <w:numId w:val="1"/>
+        </w:numPr>
+        <w:rPr>
+          <w:sz w:val="28"/>
+          <w:szCs w:val="28"/>
+        </w:rPr>
+      </w:pPr>
+      <w:r>
+        <w:rPr>
+          <w:sz w:val="28"/>
+          <w:szCs w:val="28"/>
+        </w:rPr>
+        <w:t>Az első indításkor, ha a hierarchy_settings tábla üres, vagy nem lett létrehozva, a program egy alapértelmezett értéket (h=3)-at szúr be, és ezzel hozza létre a Hierarchy objektumot.</w:t>
+      </w:r>
+    </w:p>
+    <w:p>
+      <w:pPr>
+        <w:pStyle w:val="Listaszerbekezds"/>
+        <w:numPr>
+          <w:ilvl w:val="2"/>
+          <w:numId w:val="1"/>
+        </w:numPr>
+        <w:rPr>
+          <w:sz w:val="28"/>
+          <w:szCs w:val="28"/>
+        </w:rPr>
+      </w:pPr>
+      <w:r>
+        <w:rPr>
+          <w:sz w:val="28"/>
+          <w:szCs w:val="28"/>
+        </w:rPr>
+        <w:t>Ha már van mentett érték, a rendszer beolvassa azt. Ez kritikus fontosságú, hiszen ha korábban már adtunk hozzá résztvevőket egy h = 5 magasságú rendszerhez, akkor a programnak ugyanazzal a keretrendszerrel kell indulnia, hogy a szintek validációja ne bukjon el.</w:t>
+      </w:r>
+    </w:p>
+    <w:p>
+      <w:pPr>
+        <w:pStyle w:val="Listaszerbekezds"/>
+        <w:numPr>
+          <w:ilvl w:val="1"/>
+          <w:numId w:val="1"/>
+        </w:numPr>
+        <w:rPr>
+          <w:sz w:val="28"/>
+          <w:szCs w:val="28"/>
+        </w:rPr>
+      </w:pPr>
+      <w:r>
+        <w:rPr>
+          <w:sz w:val="28"/>
+          <w:szCs w:val="28"/>
+        </w:rPr>
+        <w:t>Az inicializálás utolsó lépése, hogy a GUI frissítése</w:t>
+      </w:r>
+    </w:p>
+    <w:p>
+      <w:pPr>
+        <w:rPr>
+          <w:sz w:val="28"/>
+          <w:szCs w:val="28"/>
+        </w:rPr>
+      </w:pPr>
+      <w:r>
+        <w:rPr>
+          <w:sz w:val="28"/>
+          <w:szCs w:val="28"/>
+        </w:rPr>
+        <w:drawing>
+          <wp:inline distT="0" distB="0" distL="0" distR="0" wp14:anchorId="5393B5EB" wp14:editId="58609747">
+            <wp:extent cx="3740150" cy="2693799"/>
+            <wp:effectExtent l="0" t="0" r="0" b="0"/>
+            <wp:docPr id="706148071" name="Kép 1" descr="A képen szöveg, képernyőkép, képernyő, szoftver látható&#10;&#10;Előfordulhat, hogy az AI által létrehozott tartalom helytelen."/>
+            <wp:cNvGraphicFramePr>
+              <a:graphicFrameLocks xmlns:a="http://schemas.openxmlformats.org/drawingml/2006/main" noChangeAspect="1"/>
+            </wp:cNvGraphicFramePr>
+            <a:graphic xmlns:a="http://schemas.openxmlformats.org/drawingml/2006/main">
+              <a:graphicData uri="http://schemas.openxmlformats.org/drawingml/2006/picture">
+                <pic:pic xmlns:pic="http://schemas.openxmlformats.org/drawingml/2006/picture">
+                  <pic:nvPicPr>
+                    <pic:cNvPr id="706148071" name="Kép 1" descr="A képen szöveg, képernyőkép, képernyő, szoftver látható&#10;&#10;Előfordulhat, hogy az AI által létrehozott tartalom helytelen."/>
+                    <pic:cNvPicPr/>
+                  </pic:nvPicPr>
+                  <pic:blipFill>
+                    <a:blip r:embed="rId8"/>
+                    <a:stretch>
+                      <a:fillRect/>
+                    </a:stretch>
+                  </pic:blipFill>
+                  <pic:spPr>
+                    <a:xfrm>
+                      <a:off x="0" y="0"/>
+                      <a:ext cx="3747234" cy="2698901"/>
+                    </a:xfrm>
+                    <a:prstGeom prst="rect">
+                      <a:avLst/>
+                    </a:prstGeom>
+                  </pic:spPr>
+                </pic:pic>
+              </a:graphicData>
+            </a:graphic>
+          </wp:inline>
+        </w:drawing>
+      </w:r>
+      <w:r>
+        <w:rPr>
+          <w:sz w:val="28"/>
+          <w:szCs w:val="28"/>
+        </w:rPr>
+        <w:t xml:space="preserve"> </w:t>
+      </w:r>
+    </w:p>
+    <w:p>
+      <w:pPr>
+        <w:rPr>
+          <w:sz w:val="28"/>
+          <w:szCs w:val="28"/>
+        </w:rPr>
+      </w:pPr>
+      <w:r>
+        <w:rPr>
+          <w:sz w:val="28"/>
+          <w:szCs w:val="28"/>
+        </w:rPr>
+        <w:t>A fenti kép a UI</w:t>
+      </w:r>
+      <w:r>
+        <w:rPr>
+          <w:sz w:val="28"/>
+          <w:szCs w:val="28"/>
+        </w:rPr>
+        <w:t xml:space="preserve"> </w:t>
+      </w:r>
+    </w:p>
+    <w:p>
+      <w:pPr>
+        <w:pStyle w:val="Listaszerbekezds"/>
+        <w:numPr>
+          <w:ilvl w:val="0"/>
+          <w:numId w:val="1"/>
+        </w:numPr>
+        <w:rPr>
+          <w:sz w:val="28"/>
+          <w:szCs w:val="28"/>
+        </w:rPr>
+      </w:pPr>
+      <w:r>
+        <w:rPr>
+          <w:sz w:val="28"/>
+          <w:szCs w:val="28"/>
+        </w:rPr>
+        <w:t>a felső sorban</w:t>
+      </w:r>
+      <w:r>
+        <w:rPr>
+          <w:sz w:val="28"/>
+          <w:szCs w:val="28"/>
+        </w:rPr>
+        <w:t>: Hierarchy height (h): 3 a hierarchiai szinteket jelöli</w:t>
+      </w:r>
+    </w:p>
+    <w:p>
+      <w:pPr>
+        <w:pStyle w:val="Listaszerbekezds"/>
+        <w:numPr>
+          <w:ilvl w:val="0"/>
+          <w:numId w:val="1"/>
+        </w:numPr>
+        <w:rPr>
+          <w:sz w:val="28"/>
+          <w:szCs w:val="28"/>
+        </w:rPr>
+      </w:pPr>
+      <w:r>
+        <w:rPr>
+          <w:sz w:val="28"/>
+          <w:szCs w:val="28"/>
+        </w:rPr>
+        <w:t>Alatt megtalálhatóak a gombok amelyekkel a szimulációt vezérelni lehet, ezekről ezután lesz szó:</w:t>
+      </w:r>
+    </w:p>
+    <w:p>
+      <w:pPr>
+        <w:pStyle w:val="Listaszerbekezds"/>
+        <w:numPr>
+          <w:ilvl w:val="1"/>
+          <w:numId w:val="1"/>
+        </w:numPr>
+        <w:rPr>
+          <w:sz w:val="28"/>
+          <w:szCs w:val="28"/>
+        </w:rPr>
+      </w:pPr>
+      <w:r>
+        <w:rPr>
+          <w:sz w:val="28"/>
+          <w:szCs w:val="28"/>
+        </w:rPr>
+        <w:t>Add participant</w:t>
+      </w:r>
+    </w:p>
+    <w:p>
+      <w:pPr>
+        <w:pStyle w:val="Listaszerbekezds"/>
+        <w:numPr>
+          <w:ilvl w:val="1"/>
+          <w:numId w:val="1"/>
+        </w:numPr>
+        <w:rPr>
+          <w:sz w:val="28"/>
+          <w:szCs w:val="28"/>
+        </w:rPr>
+      </w:pPr>
+      <w:r>
+        <w:rPr>
+          <w:sz w:val="28"/>
+          <w:szCs w:val="28"/>
+        </w:rPr>
+        <w:t>Delete participant</w:t>
+      </w:r>
+    </w:p>
+    <w:p>
+      <w:pPr>
+        <w:pStyle w:val="Listaszerbekezds"/>
+        <w:numPr>
+          <w:ilvl w:val="1"/>
+          <w:numId w:val="1"/>
+        </w:numPr>
+        <w:rPr>
+          <w:sz w:val="28"/>
+          <w:szCs w:val="28"/>
+        </w:rPr>
+      </w:pPr>
+      <w:r>
+        <w:rPr>
+          <w:sz w:val="28"/>
+          <w:szCs w:val="28"/>
+        </w:rPr>
+        <w:t>New simulation</w:t>
+      </w:r>
+    </w:p>
+    <w:p>
+      <w:pPr>
+        <w:pStyle w:val="Listaszerbekezds"/>
+        <w:numPr>
+          <w:ilvl w:val="1"/>
+          <w:numId w:val="1"/>
+        </w:numPr>
+        <w:rPr>
+          <w:sz w:val="28"/>
+          <w:szCs w:val="28"/>
+        </w:rPr>
+      </w:pPr>
+      <w:r>
+        <w:rPr>
+          <w:sz w:val="28"/>
+          <w:szCs w:val="28"/>
+        </w:rPr>
+        <w:t>Distribute shares</w:t>
+      </w:r>
+    </w:p>
+    <w:p>
+      <w:pPr>
+        <w:pStyle w:val="Listaszerbekezds"/>
+        <w:numPr>
+          <w:ilvl w:val="1"/>
+          <w:numId w:val="1"/>
+        </w:numPr>
+        <w:rPr>
+          <w:sz w:val="28"/>
+          <w:szCs w:val="28"/>
+        </w:rPr>
+      </w:pPr>
+      <w:r>
+        <w:rPr>
+          <w:sz w:val="28"/>
+          <w:szCs w:val="28"/>
+        </w:rPr>
+        <w:t>Decrypt shares</w:t>
+      </w:r>
+    </w:p>
+    <w:p>
+      <w:pPr>
+        <w:pStyle w:val="Listaszerbekezds"/>
+        <w:numPr>
+          <w:ilvl w:val="0"/>
+          <w:numId w:val="1"/>
+        </w:numPr>
+        <w:rPr>
+          <w:sz w:val="28"/>
+          <w:szCs w:val="28"/>
+        </w:rPr>
+      </w:pPr>
+      <w:r>
+        <w:rPr>
+          <w:sz w:val="28"/>
+          <w:szCs w:val="28"/>
+        </w:rPr>
+        <w:t>Az alatt megtalálható tábla pedig a résztvevőket mutatja. Ehhez példaként hozzáadtam 5-öt</w:t>
+      </w:r>
+    </w:p>
+    <w:p>
+      <w:pPr>
+        <w:pStyle w:val="Listaszerbekezds"/>
+        <w:numPr>
+          <w:ilvl w:val="1"/>
+          <w:numId w:val="1"/>
+        </w:numPr>
+        <w:rPr>
+          <w:sz w:val="28"/>
+          <w:szCs w:val="28"/>
+        </w:rPr>
+      </w:pPr>
+      <w:r>
+        <w:rPr>
+          <w:sz w:val="28"/>
+          <w:szCs w:val="28"/>
+        </w:rPr>
+        <w:t>Ezzel leteszteltem, hogy az ID az mindig egyedi</w:t>
+      </w:r>
+    </w:p>
+    <w:p>
+      <w:pPr>
+        <w:pStyle w:val="Listaszerbekezds"/>
+        <w:numPr>
+          <w:ilvl w:val="1"/>
+          <w:numId w:val="1"/>
+        </w:numPr>
+        <w:rPr>
+          <w:sz w:val="28"/>
+          <w:szCs w:val="28"/>
+        </w:rPr>
+      </w:pPr>
+      <w:r>
+        <w:rPr>
+          <w:sz w:val="28"/>
+          <w:szCs w:val="28"/>
+        </w:rPr>
+        <w:t>A program újratöltésénél ezek az adatok megmaradnak</w:t>
+      </w:r>
+    </w:p>
+    <w:p>
+      <w:pPr>
+        <w:rPr>
+          <w:sz w:val="28"/>
+          <w:szCs w:val="28"/>
+        </w:rPr>
+      </w:pPr>
+      <w:r>
+        <w:rPr>
+          <w:sz w:val="28"/>
+          <w:szCs w:val="28"/>
+        </w:rPr>
+        <w:lastRenderedPageBreak/>
+        <w:drawing>
+          <wp:inline distT="0" distB="0" distL="0" distR="0" wp14:anchorId="5B187FF0" wp14:editId="090CEACA">
+            <wp:extent cx="3752850" cy="2690122"/>
+            <wp:effectExtent l="0" t="0" r="0" b="0"/>
+            <wp:docPr id="1707343880" name="Kép 1" descr="A képen szöveg, képernyőkép, képernyő, szám látható&#10;&#10;Előfordulhat, hogy az AI által létrehozott tartalom helytelen."/>
+            <wp:cNvGraphicFramePr>
+              <a:graphicFrameLocks xmlns:a="http://schemas.openxmlformats.org/drawingml/2006/main" noChangeAspect="1"/>
+            </wp:cNvGraphicFramePr>
+            <a:graphic xmlns:a="http://schemas.openxmlformats.org/drawingml/2006/main">
+              <a:graphicData uri="http://schemas.openxmlformats.org/drawingml/2006/picture">
+                <pic:pic xmlns:pic="http://schemas.openxmlformats.org/drawingml/2006/picture">
+                  <pic:nvPicPr>
+                    <pic:cNvPr id="1707343880" name="Kép 1" descr="A képen szöveg, képernyőkép, képernyő, szám látható&#10;&#10;Előfordulhat, hogy az AI által létrehozott tartalom helytelen."/>
+                    <pic:cNvPicPr/>
+                  </pic:nvPicPr>
+                  <pic:blipFill>
+                    <a:blip r:embed="rId9"/>
+                    <a:stretch>
+                      <a:fillRect/>
+                    </a:stretch>
+                  </pic:blipFill>
+                  <pic:spPr>
+                    <a:xfrm>
+                      <a:off x="0" y="0"/>
+                      <a:ext cx="3762124" cy="2696770"/>
+                    </a:xfrm>
+                    <a:prstGeom prst="rect">
+                      <a:avLst/>
+                    </a:prstGeom>
+                  </pic:spPr>
+                </pic:pic>
+              </a:graphicData>
+            </a:graphic>
+          </wp:inline>
+        </w:drawing>
+      </w:r>
+    </w:p>
+    <w:p>
+      <w:pPr>
+        <w:pStyle w:val="Listaszerbekezds"/>
+        <w:numPr>
+          <w:ilvl w:val="0"/>
+          <w:numId w:val="1"/>
+        </w:numPr>
+        <w:rPr>
+          <w:sz w:val="28"/>
+          <w:szCs w:val="28"/>
+        </w:rPr>
+      </w:pPr>
+      <w:r>
+        <w:rPr>
+          <w:sz w:val="28"/>
+          <w:szCs w:val="28"/>
+        </w:rPr>
+        <w:t>Program újratöltése után sikeresen betölti az adatokat a program</w:t>
+      </w:r>
+    </w:p>
+    <w:p>
+      <w:pPr>
+        <w:rPr>
+          <w:sz w:val="28"/>
+          <w:szCs w:val="28"/>
+        </w:rPr>
+      </w:pPr>
+      <w:r>
+        <w:rPr>
+          <w:sz w:val="28"/>
+          <w:szCs w:val="28"/>
+        </w:rPr>
+        <w:drawing>
+          <wp:inline distT="0" distB="0" distL="0" distR="0" wp14:anchorId="46F7AB70" wp14:editId="2678C054">
+            <wp:extent cx="3752850" cy="2690122"/>
+            <wp:effectExtent l="0" t="0" r="0" b="0"/>
+            <wp:docPr id="1562578343" name="Kép 1" descr="A képen szöveg, képernyőkép, képernyő, szám látható&#10;&#10;Előfordulhat, hogy az AI által létrehozott tartalom helytelen."/>
+            <wp:cNvGraphicFramePr>
+              <a:graphicFrameLocks xmlns:a="http://schemas.openxmlformats.org/drawingml/2006/main" noChangeAspect="1"/>
+            </wp:cNvGraphicFramePr>
+            <a:graphic xmlns:a="http://schemas.openxmlformats.org/drawingml/2006/main">
+              <a:graphicData uri="http://schemas.openxmlformats.org/drawingml/2006/picture">
+                <pic:pic xmlns:pic="http://schemas.openxmlformats.org/drawingml/2006/picture">
+                  <pic:nvPicPr>
+                    <pic:cNvPr id="1707343880" name="Kép 1" descr="A képen szöveg, képernyőkép, képernyő, szám látható&#10;&#10;Előfordulhat, hogy az AI által létrehozott tartalom helytelen."/>
+                    <pic:cNvPicPr/>
+                  </pic:nvPicPr>
+                  <pic:blipFill>
+                    <a:blip r:embed="rId9"/>
+                    <a:stretch>
+                      <a:fillRect/>
+                    </a:stretch>
+                  </pic:blipFill>
+                  <pic:spPr>
+                    <a:xfrm>
+                      <a:off x="0" y="0"/>
+                      <a:ext cx="3762124" cy="2696770"/>
+                    </a:xfrm>
+                    <a:prstGeom prst="rect">
+                      <a:avLst/>
+                    </a:prstGeom>
+                  </pic:spPr>
+                </pic:pic>
+              </a:graphicData>
+            </a:graphic>
+          </wp:inline>
+        </w:drawing>
+      </w:r>
+    </w:p>
+    <w:p>
+      <w:pPr>
+        <w:rPr>
+          <w:sz w:val="28"/>
+          <w:szCs w:val="28"/>
+        </w:rPr>
+      </w:pPr>
+    </w:p>
+    <w:p>
+      <w:pPr>
+        <w:pStyle w:val="Cmsor3"/>
+      </w:pPr>
+      <w:r>
+        <w:t>Új résztvevő hozzáadása (Add Participant button logic)</w:t>
+      </w:r>
+    </w:p>
+    <w:p>
+      <w:pPr>
+        <w:pStyle w:val="Listaszerbekezds"/>
+        <w:numPr>
+          <w:ilvl w:val="0"/>
+          <w:numId w:val="1"/>
+        </w:numPr>
+        <w:rPr>
+          <w:sz w:val="28"/>
+          <w:szCs w:val="28"/>
+        </w:rPr>
+      </w:pPr>
+      <w:r>
+        <w:rPr>
+          <w:sz w:val="28"/>
+          <w:szCs w:val="28"/>
+        </w:rPr>
+        <w:t xml:space="preserve">Az új résztvevő hozzáadása az nem csak egyszerű adatrögzítés, hanem egy validációs folyamat is. Az open_add_participants függvény a buttonfunctions.py-ban található meg, ez felelős új résztvevők hozzáadásáért. </w:t>
+      </w:r>
+    </w:p>
+    <w:p>
+      <w:pPr>
+        <w:pStyle w:val="Listaszerbekezds"/>
+        <w:numPr>
+          <w:ilvl w:val="0"/>
+          <w:numId w:val="1"/>
+        </w:numPr>
+        <w:rPr>
+          <w:sz w:val="28"/>
+          <w:szCs w:val="28"/>
+        </w:rPr>
+      </w:pPr>
+      <w:r>
+        <w:rPr>
+          <w:sz w:val="28"/>
+          <w:szCs w:val="28"/>
+        </w:rPr>
+        <w:t>Egy különálló, felugró dialógusablakot nyit meg.</w:t>
+      </w:r>
+    </w:p>
+    <w:p>
+      <w:pPr>
+        <w:pStyle w:val="Listaszerbekezds"/>
+        <w:numPr>
+          <w:ilvl w:val="0"/>
+          <w:numId w:val="1"/>
+        </w:numPr>
+        <w:rPr>
+          <w:sz w:val="28"/>
+          <w:szCs w:val="28"/>
+        </w:rPr>
+      </w:pPr>
+      <w:r>
+        <w:rPr>
+          <w:sz w:val="28"/>
+          <w:szCs w:val="28"/>
+        </w:rPr>
+        <w:t xml:space="preserve">A rendszer első védelmi vonala a bemeneti adat ellenőrzése. Mivel a hierarchikus modell magassága fixált, a programnak meg kell akadályozni, hogy a felhasználó olyan szintet adjon meg, amely nem létezik. (például h </w:t>
+      </w:r>
+      <w:r>
+        <w:rPr>
+          <w:sz w:val="28"/>
+          <w:szCs w:val="28"/>
+        </w:rPr>
+        <w:lastRenderedPageBreak/>
+        <w:t>= 3 esetén egy 4.szintű dolgozó felvétele). A kódban található if not (1&lt;=level&lt;=hierarchy.h) feltétel garantálja.</w:t>
+      </w:r>
+    </w:p>
+    <w:p>
+      <w:pPr>
+        <w:pStyle w:val="Listaszerbekezds"/>
+        <w:numPr>
+          <w:ilvl w:val="1"/>
+          <w:numId w:val="1"/>
+        </w:numPr>
+        <w:rPr>
+          <w:sz w:val="28"/>
+          <w:szCs w:val="28"/>
+        </w:rPr>
+      </w:pPr>
+      <w:r>
+        <w:rPr>
+          <w:sz w:val="28"/>
+          <w:szCs w:val="28"/>
+        </w:rPr>
+        <w:t>Amennyiben ez erre nem megfelelő a program jelez a felhasználónak</w:t>
+      </w:r>
+    </w:p>
+    <w:p>
+      <w:pPr>
+        <w:pStyle w:val="Listaszerbekezds"/>
+        <w:numPr>
+          <w:ilvl w:val="1"/>
+          <w:numId w:val="1"/>
+        </w:numPr>
+        <w:rPr>
+          <w:sz w:val="28"/>
+          <w:szCs w:val="28"/>
+        </w:rPr>
+      </w:pPr>
+      <w:r>
+        <w:rPr>
+          <w:sz w:val="28"/>
+          <w:szCs w:val="28"/>
+        </w:rPr>
+        <w:drawing>
+          <wp:inline distT="0" distB="0" distL="0" distR="0" wp14:anchorId="1263893B" wp14:editId="489C45E0">
+            <wp:extent cx="2921150" cy="1409772"/>
+            <wp:effectExtent l="0" t="0" r="0" b="0"/>
+            <wp:docPr id="98097751" name="Kép 1" descr="A képen szöveg, képernyőkép, Betűtípus, sor látható&#10;&#10;Előfordulhat, hogy az AI által létrehozott tartalom helytelen."/>
+            <wp:cNvGraphicFramePr>
+              <a:graphicFrameLocks xmlns:a="http://schemas.openxmlformats.org/drawingml/2006/main" noChangeAspect="1"/>
+            </wp:cNvGraphicFramePr>
+            <a:graphic xmlns:a="http://schemas.openxmlformats.org/drawingml/2006/main">
+              <a:graphicData uri="http://schemas.openxmlformats.org/drawingml/2006/picture">
+                <pic:pic xmlns:pic="http://schemas.openxmlformats.org/drawingml/2006/picture">
+                  <pic:nvPicPr>
+                    <pic:cNvPr id="98097751" name="Kép 1" descr="A képen szöveg, képernyőkép, Betűtípus, sor látható&#10;&#10;Előfordulhat, hogy az AI által létrehozott tartalom helytelen."/>
+                    <pic:cNvPicPr/>
+                  </pic:nvPicPr>
+                  <pic:blipFill>
+                    <a:blip r:embed="rId10"/>
+                    <a:stretch>
+                      <a:fillRect/>
+                    </a:stretch>
+                  </pic:blipFill>
+                  <pic:spPr>
+                    <a:xfrm>
+                      <a:off x="0" y="0"/>
+                      <a:ext cx="2921150" cy="1409772"/>
+                    </a:xfrm>
+                    <a:prstGeom prst="rect">
+                      <a:avLst/>
+                    </a:prstGeom>
+                  </pic:spPr>
+                </pic:pic>
+              </a:graphicData>
+            </a:graphic>
+          </wp:inline>
+        </w:drawing>
+      </w:r>
+    </w:p>
+    <w:p>
+      <w:pPr>
+        <w:pStyle w:val="Listaszerbekezds"/>
+        <w:numPr>
+          <w:ilvl w:val="0"/>
+          <w:numId w:val="1"/>
+        </w:numPr>
+        <w:rPr>
+          <w:sz w:val="28"/>
+          <w:szCs w:val="28"/>
+        </w:rPr>
+      </w:pPr>
+      <w:r>
+        <w:rPr>
+          <w:sz w:val="28"/>
+          <w:szCs w:val="28"/>
+        </w:rPr>
+        <w:t>Minden résztvevő egyedi i azonosítóval kell rendelkezzen. A program nem bízza rá a felhasználóra az ID megadását, amely ütközésekhez vezetne, és a felhasználói élményt is javítja</w:t>
+      </w:r>
+    </w:p>
+    <w:p>
+      <w:pPr>
+        <w:pStyle w:val="Listaszerbekezds"/>
+        <w:numPr>
+          <w:ilvl w:val="1"/>
+          <w:numId w:val="1"/>
+        </w:numPr>
+        <w:rPr>
+          <w:sz w:val="28"/>
+          <w:szCs w:val="28"/>
+        </w:rPr>
+      </w:pPr>
+      <w:r>
+        <w:rPr>
+          <w:sz w:val="28"/>
+          <w:szCs w:val="28"/>
+        </w:rPr>
+        <w:t>A technikai megvalósításban a függvény lekérdezi az adatbázisból az aktuális legmagasabb ID-t: SELECT MAX(id) FROM participants.</w:t>
+      </w:r>
+    </w:p>
+    <w:p>
+      <w:pPr>
+        <w:pStyle w:val="Listaszerbekezds"/>
+        <w:numPr>
+          <w:ilvl w:val="1"/>
+          <w:numId w:val="1"/>
+        </w:numPr>
+        <w:rPr>
+          <w:sz w:val="28"/>
+          <w:szCs w:val="28"/>
+        </w:rPr>
+      </w:pPr>
+      <w:r>
+        <w:rPr>
+          <w:sz w:val="28"/>
+          <w:szCs w:val="28"/>
+        </w:rPr>
+        <w:t>Amennyibben a az adatbázis üres, az első résztvevő 1-es azonosítót kap, minden további esetben a max_id + 1 formul</w:t>
+      </w:r>
+      <w:r>
+        <w:rPr>
+          <w:sz w:val="28"/>
+          <w:szCs w:val="28"/>
+        </w:rPr>
+        <w:t>a határozza meg a résztvevő azonosítóját. Ez a módszer biztonságos, mivel figyelembe veszi a korábbi munkamenetek során rögzített adatokat is.</w:t>
+      </w:r>
+    </w:p>
+    <w:p>
+      <w:pPr>
+        <w:pStyle w:val="Listaszerbekezds"/>
+        <w:numPr>
+          <w:ilvl w:val="0"/>
+          <w:numId w:val="1"/>
+        </w:numPr>
+        <w:rPr>
+          <w:sz w:val="28"/>
+          <w:szCs w:val="28"/>
+        </w:rPr>
+      </w:pPr>
+      <w:r>
+        <w:rPr>
+          <w:sz w:val="28"/>
+          <w:szCs w:val="28"/>
+        </w:rPr>
+        <w:t>A sikeres validáció után a program három helyen is frissíti az állapotot:</w:t>
+      </w:r>
+    </w:p>
+    <w:p>
+      <w:pPr>
+        <w:pStyle w:val="Listaszerbekezds"/>
+        <w:numPr>
+          <w:ilvl w:val="1"/>
+          <w:numId w:val="1"/>
+        </w:numPr>
+        <w:rPr>
+          <w:sz w:val="28"/>
+          <w:szCs w:val="28"/>
+        </w:rPr>
+      </w:pPr>
+      <w:r>
+        <w:rPr>
+          <w:sz w:val="28"/>
+          <w:szCs w:val="28"/>
+        </w:rPr>
+        <w:t>Adatbázisban az INSERT parancs véglegesíti az adatot a fizikai tárolón. A shares mező ekkor még NULL, jelezve, hogy a titokfelosztás még nem történt meg.</w:t>
+      </w:r>
+    </w:p>
+    <w:p>
+      <w:pPr>
+        <w:pStyle w:val="Listaszerbekezds"/>
+        <w:numPr>
+          <w:ilvl w:val="1"/>
+          <w:numId w:val="1"/>
+        </w:numPr>
+        <w:rPr>
+          <w:sz w:val="28"/>
+          <w:szCs w:val="28"/>
+        </w:rPr>
+      </w:pPr>
+      <w:r>
+        <w:rPr>
+          <w:sz w:val="28"/>
+          <w:szCs w:val="28"/>
+        </w:rPr>
+        <w:t>A memória modellbe létrejön egy új Participant objektum, amelyet a hierarchy.add_participant() metódus besorol a megfelelő szint listájába</w:t>
+      </w:r>
+    </w:p>
+    <w:p>
+      <w:pPr>
+        <w:pStyle w:val="Listaszerbekezds"/>
+        <w:numPr>
+          <w:ilvl w:val="1"/>
+          <w:numId w:val="1"/>
+        </w:numPr>
+        <w:rPr>
+          <w:sz w:val="28"/>
+          <w:szCs w:val="28"/>
+        </w:rPr>
+      </w:pPr>
+      <w:r>
+        <w:rPr>
+          <w:sz w:val="28"/>
+          <w:szCs w:val="28"/>
+        </w:rPr>
+        <w:t>UI: A tree.insert() hívás azonnal dinamikusan láthatóvá teszi az új sort a táblázatban, így a felhasználó azonnal értesül a hozzáadás sikerességéről</w:t>
+      </w:r>
+    </w:p>
+    <w:p>
+      <w:pPr>
+        <w:pStyle w:val="Cmsor3"/>
+      </w:pPr>
+      <w:r>
+        <w:t>Résztvevő eltávolítása</w:t>
+      </w:r>
+    </w:p>
+    <w:p>
+      <w:pPr>
+        <w:rPr>
+          <w:sz w:val="28"/>
+          <w:szCs w:val="28"/>
+        </w:rPr>
+      </w:pPr>
+      <w:r>
+        <w:rPr>
+          <w:sz w:val="28"/>
+          <w:szCs w:val="28"/>
+        </w:rPr>
+        <w:t>A törlés folyamatában egy elem eltávolítása nem hagyhat megmaradt adatokat vagy logikai réseket a rendszerben. A open_delete_participant függvény az azonosító (ID) alapján végzi el a törlést.</w:t>
+      </w:r>
+    </w:p>
+    <w:p>
+      <w:pPr>
+        <w:pStyle w:val="Listaszerbekezds"/>
+        <w:numPr>
+          <w:ilvl w:val="0"/>
+          <w:numId w:val="1"/>
+        </w:numPr>
+        <w:rPr>
+          <w:sz w:val="28"/>
+          <w:szCs w:val="28"/>
+        </w:rPr>
+      </w:pPr>
+      <w:r>
+        <w:rPr>
+          <w:sz w:val="28"/>
+          <w:szCs w:val="28"/>
+        </w:rPr>
+        <w:t xml:space="preserve">A törlés alapfeltétele létező ID megadása. A program az execute(„DELETE FROM participants WHERE id = ?”) paranccsal próbálja eltávolítani a </w:t>
+      </w:r>
+      <w:r>
+        <w:rPr>
+          <w:sz w:val="28"/>
+          <w:szCs w:val="28"/>
+        </w:rPr>
+        <w:lastRenderedPageBreak/>
+        <w:t>rekodot. A cursor.rowcount == 0 ellenőrzés egy biztonsági elem: ha a felhasználó olyan ID-t ad meg, amelyik nem létezik a rendszer hibaüzenetet küld</w:t>
+      </w:r>
+    </w:p>
+    <w:p>
+      <w:pPr>
+        <w:pStyle w:val="Listaszerbekezds"/>
+        <w:numPr>
+          <w:ilvl w:val="0"/>
+          <w:numId w:val="1"/>
+        </w:numPr>
+        <w:rPr>
+          <w:sz w:val="28"/>
+          <w:szCs w:val="28"/>
+        </w:rPr>
+      </w:pPr>
+      <w:r>
+        <w:rPr>
+          <w:sz w:val="28"/>
+          <w:szCs w:val="28"/>
+        </w:rPr>
+        <w:drawing>
+          <wp:inline distT="0" distB="0" distL="0" distR="0" wp14:anchorId="55571761" wp14:editId="135E23A8">
+            <wp:extent cx="2082800" cy="1405571"/>
+            <wp:effectExtent l="0" t="0" r="0" b="4445"/>
+            <wp:docPr id="2023792101" name="Kép 1" descr="A képen szöveg, képernyőkép, Betűtípus, embléma látható&#10;&#10;Előfordulhat, hogy az AI által létrehozott tartalom helytelen."/>
+            <wp:cNvGraphicFramePr>
+              <a:graphicFrameLocks xmlns:a="http://schemas.openxmlformats.org/drawingml/2006/main" noChangeAspect="1"/>
+            </wp:cNvGraphicFramePr>
+            <a:graphic xmlns:a="http://schemas.openxmlformats.org/drawingml/2006/main">
+              <a:graphicData uri="http://schemas.openxmlformats.org/drawingml/2006/picture">
+                <pic:pic xmlns:pic="http://schemas.openxmlformats.org/drawingml/2006/picture">
+                  <pic:nvPicPr>
+                    <pic:cNvPr id="2023792101" name="Kép 1" descr="A képen szöveg, képernyőkép, Betűtípus, embléma látható&#10;&#10;Előfordulhat, hogy az AI által létrehozott tartalom helytelen."/>
+                    <pic:cNvPicPr/>
+                  </pic:nvPicPr>
+                  <pic:blipFill>
+                    <a:blip r:embed="rId11"/>
+                    <a:stretch>
+                      <a:fillRect/>
+                    </a:stretch>
+                  </pic:blipFill>
+                  <pic:spPr>
+                    <a:xfrm>
+                      <a:off x="0" y="0"/>
+                      <a:ext cx="2086359" cy="1407973"/>
+                    </a:xfrm>
+                    <a:prstGeom prst="rect">
+                      <a:avLst/>
+                    </a:prstGeom>
+                  </pic:spPr>
+                </pic:pic>
+              </a:graphicData>
+            </a:graphic>
+          </wp:inline>
+        </w:drawing>
+      </w:r>
+      <w:r>
+        <w:rPr>
+          <w:sz w:val="28"/>
+          <w:szCs w:val="28"/>
+        </w:rPr>
+        <w:t xml:space="preserve"> </w:t>
+      </w:r>
+    </w:p>
+    <w:p>
+      <w:pPr>
+        <w:pStyle w:val="Listaszerbekezds"/>
+        <w:numPr>
+          <w:ilvl w:val="0"/>
+          <w:numId w:val="1"/>
+        </w:numPr>
+        <w:rPr>
+          <w:sz w:val="28"/>
+          <w:szCs w:val="28"/>
+        </w:rPr>
+      </w:pPr>
+      <w:r>
+        <w:rPr>
+          <w:sz w:val="28"/>
+          <w:szCs w:val="28"/>
+        </w:rPr>
+        <w:t>Az adatbázisból történő törlés után a memóriában található Hiearchy objektumot is frissíteni kell, különben a későbbi titokmegosztási számítások olyan résztvevővel is számolnának, aki már nincs a rendszerben.</w:t>
+      </w:r>
+    </w:p>
+    <w:p>
+      <w:pPr>
+        <w:pStyle w:val="Listaszerbekezds"/>
+        <w:numPr>
+          <w:ilvl w:val="1"/>
+          <w:numId w:val="1"/>
+        </w:numPr>
+        <w:rPr>
+          <w:sz w:val="28"/>
+          <w:szCs w:val="28"/>
+        </w:rPr>
+      </w:pPr>
+      <w:r>
+        <w:rPr>
+          <w:sz w:val="28"/>
+          <w:szCs w:val="28"/>
+        </w:rPr>
+        <w:t xml:space="preserve">A program végigiterál a hierarchy.levels szótár összes listáján, és eltávolítja az adott azonosítóval rendelkező objektumot (résztvevőt) a hierarchiából. </w:t>
+      </w:r>
+    </w:p>
+    <w:p>
+      <w:pPr>
+        <w:pStyle w:val="Listaszerbekezds"/>
+        <w:numPr>
+          <w:ilvl w:val="0"/>
+          <w:numId w:val="1"/>
+        </w:numPr>
+        <w:rPr>
+          <w:sz w:val="28"/>
+          <w:szCs w:val="28"/>
+        </w:rPr>
+      </w:pPr>
+      <w:r>
+        <w:rPr>
+          <w:sz w:val="28"/>
+          <w:szCs w:val="28"/>
+        </w:rPr>
+        <w:t>A grafikus felület azonnal frissít, így értesíti a felhasználót a sikeres törlésől. A program végigkeresi a Treeview elemeit, és az ID egyezése esetén eltávolítja a megfelelő sort (tree.delete(item)).</w:t>
+      </w:r>
+    </w:p>
+    <w:p>
+      <w:pPr>
+        <w:pStyle w:val="Cmsor3"/>
+      </w:pPr>
+      <w:r>
+        <w:t>Új szimuláció indítása</w:t>
+      </w:r>
+    </w:p>
+    <w:p>
+      <w:pPr>
+        <w:rPr>
+          <w:sz w:val="28"/>
+          <w:szCs w:val="28"/>
+        </w:rPr>
+      </w:pPr>
+      <w:r>
+        <w:rPr>
+          <w:sz w:val="28"/>
+          <w:szCs w:val="28"/>
+        </w:rPr>
+        <w:t>A New Simulation gomb funkciója a rendszer alaphelyzetbe állítása, resetelése. Ez a művelet lehetővé teszi a teljes vállalati struktúra újraalkotását.</w:t>
+      </w:r>
+    </w:p>
+    <w:p>
+      <w:pPr>
+        <w:pStyle w:val="Listaszerbekezds"/>
+        <w:numPr>
+          <w:ilvl w:val="0"/>
+          <w:numId w:val="1"/>
+        </w:numPr>
+        <w:rPr>
+          <w:sz w:val="28"/>
+          <w:szCs w:val="28"/>
+        </w:rPr>
+      </w:pPr>
+      <w:r>
+        <w:rPr>
+          <w:sz w:val="28"/>
+          <w:szCs w:val="28"/>
+        </w:rPr>
+        <w:t xml:space="preserve">A reset_hierarchy függvény első lépése a participants tábla teljes tartalmának a törlése (DELETE FROM participants). Ezt követően a program frissíti a hierarchy_settings táblát, és ezt is az újonnan megadott h értékkel. Ez biztosítja, hogy a következő indításkor a hierarchy_settings-ből kiszedett </w:t>
+      </w:r>
+      <w:r>
+        <w:rPr>
+          <w:sz w:val="28"/>
+          <w:szCs w:val="28"/>
+        </w:rPr>
+        <w:t>paraméter megfelelő legyen, és a program helyesen induljon.</w:t>
+      </w:r>
+    </w:p>
+    <w:p>
+      <w:pPr>
+        <w:pStyle w:val="Listaszerbekezds"/>
+        <w:numPr>
+          <w:ilvl w:val="0"/>
+          <w:numId w:val="1"/>
+        </w:numPr>
+        <w:rPr>
+          <w:sz w:val="28"/>
+          <w:szCs w:val="28"/>
+        </w:rPr>
+      </w:pPr>
+      <w:r>
+        <w:rPr>
+          <w:sz w:val="28"/>
+          <w:szCs w:val="28"/>
+        </w:rPr>
+        <w:t>A törlés után a memóriában lévő Hierarchy objektumot is alaphelyzetbe kell állítani.</w:t>
+      </w:r>
+    </w:p>
+    <w:p>
+      <w:pPr>
+        <w:pStyle w:val="Listaszerbekezds"/>
+        <w:numPr>
+          <w:ilvl w:val="1"/>
+          <w:numId w:val="1"/>
+        </w:numPr>
+        <w:rPr>
+          <w:sz w:val="28"/>
+          <w:szCs w:val="28"/>
+        </w:rPr>
+      </w:pPr>
+      <w:r>
+        <w:rPr>
+          <w:sz w:val="28"/>
+          <w:szCs w:val="28"/>
+        </w:rPr>
+        <w:t>Az új magasság beállítása: hierarchy.h = new_h</w:t>
+      </w:r>
+    </w:p>
+    <w:p>
+      <w:pPr>
+        <w:pStyle w:val="Listaszerbekezds"/>
+        <w:numPr>
+          <w:ilvl w:val="1"/>
+          <w:numId w:val="1"/>
+        </w:numPr>
+        <w:rPr>
+          <w:sz w:val="28"/>
+          <w:szCs w:val="28"/>
+        </w:rPr>
+      </w:pPr>
+      <w:r>
+        <w:rPr>
+          <w:sz w:val="28"/>
+          <w:szCs w:val="28"/>
+        </w:rPr>
+        <w:t>Szintek újragenerálása: A hierarcy.levels szótár kiürül, és az új h értéknek megfelelő számú üres lista jön létre. Ez azért fontos, mert ha például h=5-ről h=2-re váltunk, a 3.,4.,5. szintű listáknak meg kell szűnniük.</w:t>
+      </w:r>
+    </w:p>
+    <w:p>
+      <w:pPr>
+        <w:pStyle w:val="Listaszerbekezds"/>
+        <w:numPr>
+          <w:ilvl w:val="0"/>
+          <w:numId w:val="1"/>
+        </w:numPr>
+        <w:rPr>
+          <w:sz w:val="28"/>
+          <w:szCs w:val="28"/>
+        </w:rPr>
+      </w:pPr>
+      <w:r>
+        <w:rPr>
+          <w:sz w:val="28"/>
+          <w:szCs w:val="28"/>
+        </w:rPr>
+        <w:lastRenderedPageBreak/>
+        <w:t xml:space="preserve">A folyamat végén a táblázat összes sora törlődik, és a főablak tetején lévő felirat is frissűl az új magasságra. </w:t>
+      </w:r>
+    </w:p>
+    <w:p>
+      <w:pPr>
+        <w:rPr>
+          <w:sz w:val="28"/>
+          <w:szCs w:val="28"/>
+        </w:rPr>
+      </w:pPr>
+      <w:r>
+        <w:rPr>
+          <w:sz w:val="28"/>
+          <w:szCs w:val="28"/>
+        </w:rPr>
+        <w:drawing>
+          <wp:inline distT="0" distB="0" distL="0" distR="0" wp14:anchorId="445E55AB" wp14:editId="060CDB99">
+            <wp:extent cx="4904624" cy="3517900"/>
+            <wp:effectExtent l="0" t="0" r="0" b="6350"/>
+            <wp:docPr id="282899380" name="Kép 1" descr="A képen szöveg, képernyőkép, képernyő, szoftver látható&#10;&#10;Előfordulhat, hogy az AI által létrehozott tartalom helytelen."/>
+            <wp:cNvGraphicFramePr>
+              <a:graphicFrameLocks xmlns:a="http://schemas.openxmlformats.org/drawingml/2006/main" noChangeAspect="1"/>
+            </wp:cNvGraphicFramePr>
+            <a:graphic xmlns:a="http://schemas.openxmlformats.org/drawingml/2006/main">
+              <a:graphicData uri="http://schemas.openxmlformats.org/drawingml/2006/picture">
+                <pic:pic xmlns:pic="http://schemas.openxmlformats.org/drawingml/2006/picture">
+                  <pic:nvPicPr>
+                    <pic:cNvPr id="282899380" name="Kép 1" descr="A képen szöveg, képernyőkép, képernyő, szoftver látható&#10;&#10;Előfordulhat, hogy az AI által létrehozott tartalom helytelen."/>
+                    <pic:cNvPicPr/>
+                  </pic:nvPicPr>
+                  <pic:blipFill>
+                    <a:blip r:embed="rId12"/>
+                    <a:stretch>
+                      <a:fillRect/>
+                    </a:stretch>
+                  </pic:blipFill>
+                  <pic:spPr>
+                    <a:xfrm>
+                      <a:off x="0" y="0"/>
+                      <a:ext cx="4909989" cy="3521748"/>
+                    </a:xfrm>
+                    <a:prstGeom prst="rect">
+                      <a:avLst/>
+                    </a:prstGeom>
+                  </pic:spPr>
+                </pic:pic>
+              </a:graphicData>
+            </a:graphic>
+          </wp:inline>
+        </w:drawing>
+      </w:r>
+    </w:p>
+    <w:p>
+      <w:pPr>
+        <w:rPr>
+          <w:sz w:val="28"/>
+          <w:szCs w:val="28"/>
+        </w:rPr>
+      </w:pPr>
+      <w:r>
+        <w:rPr>
+          <w:sz w:val="28"/>
+          <w:szCs w:val="28"/>
+        </w:rPr>
+        <w:t>A new simulation gomb megnyomása utána, hogyha megadom hogy h = 5 legyen és elindítom az új szimulációt:</w:t>
+      </w:r>
+    </w:p>
+    <w:p>
+      <w:pPr>
+        <w:rPr>
+          <w:sz w:val="28"/>
+          <w:szCs w:val="28"/>
+        </w:rPr>
+      </w:pPr>
+      <w:r>
+        <w:rPr>
+          <w:sz w:val="28"/>
+          <w:szCs w:val="28"/>
+        </w:rPr>
+        <w:drawing>
+          <wp:inline distT="0" distB="0" distL="0" distR="0" wp14:anchorId="60066A73" wp14:editId="5F810867">
+            <wp:extent cx="5071395" cy="3676650"/>
+            <wp:effectExtent l="0" t="0" r="0" b="0"/>
+            <wp:docPr id="940943480" name="Kép 1" descr="A képen szöveg, képernyőkép, képernyő, szoftver látható&#10;&#10;Előfordulhat, hogy az AI által létrehozott tartalom helytelen."/>
+            <wp:cNvGraphicFramePr>
+              <a:graphicFrameLocks xmlns:a="http://schemas.openxmlformats.org/drawingml/2006/main" noChangeAspect="1"/>
+            </wp:cNvGraphicFramePr>
+            <a:graphic xmlns:a="http://schemas.openxmlformats.org/drawingml/2006/main">
+              <a:graphicData uri="http://schemas.openxmlformats.org/drawingml/2006/picture">
+                <pic:pic xmlns:pic="http://schemas.openxmlformats.org/drawingml/2006/picture">
+                  <pic:nvPicPr>
+                    <pic:cNvPr id="940943480" name="Kép 1" descr="A képen szöveg, képernyőkép, képernyő, szoftver látható&#10;&#10;Előfordulhat, hogy az AI által létrehozott tartalom helytelen."/>
+                    <pic:cNvPicPr/>
+                  </pic:nvPicPr>
+                  <pic:blipFill>
+                    <a:blip r:embed="rId13"/>
+                    <a:stretch>
+                      <a:fillRect/>
+                    </a:stretch>
+                  </pic:blipFill>
+                  <pic:spPr>
+                    <a:xfrm>
+                      <a:off x="0" y="0"/>
+                      <a:ext cx="5080405" cy="3683182"/>
+                    </a:xfrm>
+                    <a:prstGeom prst="rect">
+                      <a:avLst/>
+                    </a:prstGeom>
+                  </pic:spPr>
+                </pic:pic>
+              </a:graphicData>
+            </a:graphic>
+          </wp:inline>
+        </w:drawing>
+      </w:r>
     </w:p>
     <w:sectPr>
       <w:pgSz w:w="11906" w:h="16838"/>
@@ -1357,6 +4497,528 @@
     </w:lvl>
   </w:abstractNum>
   <w:abstractNum w:abstractNumId="1" w15:restartNumberingAfterBreak="0">
+    <w:nsid w:val="07771710"/>
+    <w:multiLevelType w:val="hybridMultilevel"/>
+    <w:tmpl w:val="884A0494"/>
+    <w:lvl w:ilvl="0" w:tplc="F0127D96">
+      <w:numFmt w:val="bullet"/>
+      <w:lvlText w:val="-"/>
+      <w:lvlJc w:val="left"/>
+      <w:pPr>
+        <w:ind w:left="720" w:hanging="360"/>
+      </w:pPr>
+      <w:rPr>
+        <w:rFonts w:ascii="Calibri" w:eastAsiaTheme="minorHAnsi" w:hAnsi="Calibri" w:cs="Calibri" w:hint="default"/>
+      </w:rPr>
+    </w:lvl>
+    <w:lvl w:ilvl="1" w:tplc="040E0003">
+      <w:start w:val="1"/>
+      <w:numFmt w:val="bullet"/>
+      <w:lvlText w:val="o"/>
+      <w:lvlJc w:val="left"/>
+      <w:pPr>
+        <w:ind w:left="1440" w:hanging="360"/>
+      </w:pPr>
+      <w:rPr>
+        <w:rFonts w:ascii="Courier New" w:hAnsi="Courier New" w:cs="Courier New" w:hint="default"/>
+      </w:rPr>
+    </w:lvl>
+    <w:lvl w:ilvl="2" w:tplc="040E0005" w:tentative="1">
+      <w:start w:val="1"/>
+      <w:numFmt w:val="bullet"/>
+      <w:lvlText w:val=""/>
+      <w:lvlJc w:val="left"/>
+      <w:pPr>
+        <w:ind w:left="2160" w:hanging="360"/>
+      </w:pPr>
+      <w:rPr>
+        <w:rFonts w:ascii="Wingdings" w:hAnsi="Wingdings" w:hint="default"/>
+      </w:rPr>
+    </w:lvl>
+    <w:lvl w:ilvl="3" w:tplc="040E0001" w:tentative="1">
+      <w:start w:val="1"/>
+      <w:numFmt w:val="bullet"/>
+      <w:lvlText w:val=""/>
+      <w:lvlJc w:val="left"/>
+      <w:pPr>
+        <w:ind w:left="2880" w:hanging="360"/>
+      </w:pPr>
+      <w:rPr>
+        <w:rFonts w:ascii="Symbol" w:hAnsi="Symbol" w:hint="default"/>
+      </w:rPr>
+    </w:lvl>
+    <w:lvl w:ilvl="4" w:tplc="040E0003" w:tentative="1">
+      <w:start w:val="1"/>
+      <w:numFmt w:val="bullet"/>
+      <w:lvlText w:val="o"/>
+      <w:lvlJc w:val="left"/>
+      <w:pPr>
+        <w:ind w:left="3600" w:hanging="360"/>
+      </w:pPr>
+      <w:rPr>
+        <w:rFonts w:ascii="Courier New" w:hAnsi="Courier New" w:cs="Courier New" w:hint="default"/>
+      </w:rPr>
+    </w:lvl>
+    <w:lvl w:ilvl="5" w:tplc="040E0005" w:tentative="1">
+      <w:start w:val="1"/>
+      <w:numFmt w:val="bullet"/>
+      <w:lvlText w:val=""/>
+      <w:lvlJc w:val="left"/>
+      <w:pPr>
+        <w:ind w:left="4320" w:hanging="360"/>
+      </w:pPr>
+      <w:rPr>
+        <w:rFonts w:ascii="Wingdings" w:hAnsi="Wingdings" w:hint="default"/>
+      </w:rPr>
+    </w:lvl>
+    <w:lvl w:ilvl="6" w:tplc="040E0001" w:tentative="1">
+      <w:start w:val="1"/>
+      <w:numFmt w:val="bullet"/>
+      <w:lvlText w:val=""/>
+      <w:lvlJc w:val="left"/>
+      <w:pPr>
+        <w:ind w:left="5040" w:hanging="360"/>
+      </w:pPr>
+      <w:rPr>
+        <w:rFonts w:ascii="Symbol" w:hAnsi="Symbol" w:hint="default"/>
+      </w:rPr>
+    </w:lvl>
+    <w:lvl w:ilvl="7" w:tplc="040E0003" w:tentative="1">
+      <w:start w:val="1"/>
+      <w:numFmt w:val="bullet"/>
+      <w:lvlText w:val="o"/>
+      <w:lvlJc w:val="left"/>
+      <w:pPr>
+        <w:ind w:left="5760" w:hanging="360"/>
+      </w:pPr>
+      <w:rPr>
+        <w:rFonts w:ascii="Courier New" w:hAnsi="Courier New" w:cs="Courier New" w:hint="default"/>
+      </w:rPr>
+    </w:lvl>
+    <w:lvl w:ilvl="8" w:tplc="040E0005" w:tentative="1">
+      <w:start w:val="1"/>
+      <w:numFmt w:val="bullet"/>
+      <w:lvlText w:val=""/>
+      <w:lvlJc w:val="left"/>
+      <w:pPr>
+        <w:ind w:left="6480" w:hanging="360"/>
+      </w:pPr>
+      <w:rPr>
+        <w:rFonts w:ascii="Wingdings" w:hAnsi="Wingdings" w:hint="default"/>
+      </w:rPr>
+    </w:lvl>
+  </w:abstractNum>
+  <w:abstractNum w:abstractNumId="2" w15:restartNumberingAfterBreak="0">
+    <w:nsid w:val="1BA07409"/>
+    <w:multiLevelType w:val="hybridMultilevel"/>
+    <w:tmpl w:val="7A8827B4"/>
+    <w:lvl w:ilvl="0" w:tplc="6BB432E8">
+      <w:numFmt w:val="bullet"/>
+      <w:lvlText w:val="-"/>
+      <w:lvlJc w:val="left"/>
+      <w:pPr>
+        <w:ind w:left="720" w:hanging="360"/>
+      </w:pPr>
+      <w:rPr>
+        <w:rFonts w:ascii="Calibri" w:eastAsiaTheme="minorHAnsi" w:hAnsi="Calibri" w:cs="Calibri" w:hint="default"/>
+      </w:rPr>
+    </w:lvl>
+    <w:lvl w:ilvl="1" w:tplc="040E0003" w:tentative="1">
+      <w:start w:val="1"/>
+      <w:numFmt w:val="bullet"/>
+      <w:lvlText w:val="o"/>
+      <w:lvlJc w:val="left"/>
+      <w:pPr>
+        <w:ind w:left="1440" w:hanging="360"/>
+      </w:pPr>
+      <w:rPr>
+        <w:rFonts w:ascii="Courier New" w:hAnsi="Courier New" w:cs="Courier New" w:hint="default"/>
+      </w:rPr>
+    </w:lvl>
+    <w:lvl w:ilvl="2" w:tplc="040E0005" w:tentative="1">
+      <w:start w:val="1"/>
+      <w:numFmt w:val="bullet"/>
+      <w:lvlText w:val=""/>
+      <w:lvlJc w:val="left"/>
+      <w:pPr>
+        <w:ind w:left="2160" w:hanging="360"/>
+      </w:pPr>
+      <w:rPr>
+        <w:rFonts w:ascii="Wingdings" w:hAnsi="Wingdings" w:hint="default"/>
+      </w:rPr>
+    </w:lvl>
+    <w:lvl w:ilvl="3" w:tplc="040E0001" w:tentative="1">
+      <w:start w:val="1"/>
+      <w:numFmt w:val="bullet"/>
+      <w:lvlText w:val=""/>
+      <w:lvlJc w:val="left"/>
+      <w:pPr>
+        <w:ind w:left="2880" w:hanging="360"/>
+      </w:pPr>
+      <w:rPr>
+        <w:rFonts w:ascii="Symbol" w:hAnsi="Symbol" w:hint="default"/>
+      </w:rPr>
+    </w:lvl>
+    <w:lvl w:ilvl="4" w:tplc="040E0003" w:tentative="1">
+      <w:start w:val="1"/>
+      <w:numFmt w:val="bullet"/>
+      <w:lvlText w:val="o"/>
+      <w:lvlJc w:val="left"/>
+      <w:pPr>
+        <w:ind w:left="3600" w:hanging="360"/>
+      </w:pPr>
+      <w:rPr>
+        <w:rFonts w:ascii="Courier New" w:hAnsi="Courier New" w:cs="Courier New" w:hint="default"/>
+      </w:rPr>
+    </w:lvl>
+    <w:lvl w:ilvl="5" w:tplc="040E0005" w:tentative="1">
+      <w:start w:val="1"/>
+      <w:numFmt w:val="bullet"/>
+      <w:lvlText w:val=""/>
+      <w:lvlJc w:val="left"/>
+      <w:pPr>
+        <w:ind w:left="4320" w:hanging="360"/>
+      </w:pPr>
+      <w:rPr>
+        <w:rFonts w:ascii="Wingdings" w:hAnsi="Wingdings" w:hint="default"/>
+      </w:rPr>
+    </w:lvl>
+    <w:lvl w:ilvl="6" w:tplc="040E0001" w:tentative="1">
+      <w:start w:val="1"/>
+      <w:numFmt w:val="bullet"/>
+      <w:lvlText w:val=""/>
+      <w:lvlJc w:val="left"/>
+      <w:pPr>
+        <w:ind w:left="5040" w:hanging="360"/>
+      </w:pPr>
+      <w:rPr>
+        <w:rFonts w:ascii="Symbol" w:hAnsi="Symbol" w:hint="default"/>
+      </w:rPr>
+    </w:lvl>
+    <w:lvl w:ilvl="7" w:tplc="040E0003" w:tentative="1">
+      <w:start w:val="1"/>
+      <w:numFmt w:val="bullet"/>
+      <w:lvlText w:val="o"/>
+      <w:lvlJc w:val="left"/>
+      <w:pPr>
+        <w:ind w:left="5760" w:hanging="360"/>
+      </w:pPr>
+      <w:rPr>
+        <w:rFonts w:ascii="Courier New" w:hAnsi="Courier New" w:cs="Courier New" w:hint="default"/>
+      </w:rPr>
+    </w:lvl>
+    <w:lvl w:ilvl="8" w:tplc="040E0005" w:tentative="1">
+      <w:start w:val="1"/>
+      <w:numFmt w:val="bullet"/>
+      <w:lvlText w:val=""/>
+      <w:lvlJc w:val="left"/>
+      <w:pPr>
+        <w:ind w:left="6480" w:hanging="360"/>
+      </w:pPr>
+      <w:rPr>
+        <w:rFonts w:ascii="Wingdings" w:hAnsi="Wingdings" w:hint="default"/>
+      </w:rPr>
+    </w:lvl>
+  </w:abstractNum>
+  <w:abstractNum w:abstractNumId="3" w15:restartNumberingAfterBreak="0">
+    <w:nsid w:val="40F7031C"/>
+    <w:multiLevelType w:val="multilevel"/>
+    <w:tmpl w:val="E0223A58"/>
+    <w:lvl w:ilvl="0">
+      <w:start w:val="1"/>
+      <w:numFmt w:val="bullet"/>
+      <w:lvlText w:val=""/>
+      <w:lvlJc w:val="left"/>
+      <w:pPr>
+        <w:tabs>
+          <w:tab w:val="num" w:pos="720"/>
+        </w:tabs>
+        <w:ind w:left="720" w:hanging="360"/>
+      </w:pPr>
+      <w:rPr>
+        <w:rFonts w:ascii="Symbol" w:hAnsi="Symbol" w:hint="default"/>
+        <w:sz w:val="20"/>
+      </w:rPr>
+    </w:lvl>
+    <w:lvl w:ilvl="1" w:tentative="1">
+      <w:start w:val="1"/>
+      <w:numFmt w:val="bullet"/>
+      <w:lvlText w:val="o"/>
+      <w:lvlJc w:val="left"/>
+      <w:pPr>
+        <w:tabs>
+          <w:tab w:val="num" w:pos="1440"/>
+        </w:tabs>
+        <w:ind w:left="1440" w:hanging="360"/>
+      </w:pPr>
+      <w:rPr>
+        <w:rFonts w:ascii="Courier New" w:hAnsi="Courier New" w:hint="default"/>
+        <w:sz w:val="20"/>
+      </w:rPr>
+    </w:lvl>
+    <w:lvl w:ilvl="2" w:tentative="1">
+      <w:start w:val="1"/>
+      <w:numFmt w:val="bullet"/>
+      <w:lvlText w:val=""/>
+      <w:lvlJc w:val="left"/>
+      <w:pPr>
+        <w:tabs>
+          <w:tab w:val="num" w:pos="2160"/>
+        </w:tabs>
+        <w:ind w:left="2160" w:hanging="360"/>
+      </w:pPr>
+      <w:rPr>
+        <w:rFonts w:ascii="Wingdings" w:hAnsi="Wingdings" w:hint="default"/>
+        <w:sz w:val="20"/>
+      </w:rPr>
+    </w:lvl>
+    <w:lvl w:ilvl="3" w:tentative="1">
+      <w:start w:val="1"/>
+      <w:numFmt w:val="bullet"/>
+      <w:lvlText w:val=""/>
+      <w:lvlJc w:val="left"/>
+      <w:pPr>
+        <w:tabs>
+          <w:tab w:val="num" w:pos="2880"/>
+        </w:tabs>
+        <w:ind w:left="2880" w:hanging="360"/>
+      </w:pPr>
+      <w:rPr>
+        <w:rFonts w:ascii="Wingdings" w:hAnsi="Wingdings" w:hint="default"/>
+        <w:sz w:val="20"/>
+      </w:rPr>
+    </w:lvl>
+    <w:lvl w:ilvl="4" w:tentative="1">
+      <w:start w:val="1"/>
+      <w:numFmt w:val="bullet"/>
+      <w:lvlText w:val=""/>
+      <w:lvlJc w:val="left"/>
+      <w:pPr>
+        <w:tabs>
+          <w:tab w:val="num" w:pos="3600"/>
+        </w:tabs>
+        <w:ind w:left="3600" w:hanging="360"/>
+      </w:pPr>
+      <w:rPr>
+        <w:rFonts w:ascii="Wingdings" w:hAnsi="Wingdings" w:hint="default"/>
+        <w:sz w:val="20"/>
+      </w:rPr>
+    </w:lvl>
+    <w:lvl w:ilvl="5" w:tentative="1">
+      <w:start w:val="1"/>
+      <w:numFmt w:val="bullet"/>
+      <w:lvlText w:val=""/>
+      <w:lvlJc w:val="left"/>
+      <w:pPr>
+        <w:tabs>
+          <w:tab w:val="num" w:pos="4320"/>
+        </w:tabs>
+        <w:ind w:left="4320" w:hanging="360"/>
+      </w:pPr>
+      <w:rPr>
+        <w:rFonts w:ascii="Wingdings" w:hAnsi="Wingdings" w:hint="default"/>
+        <w:sz w:val="20"/>
+      </w:rPr>
+    </w:lvl>
+    <w:lvl w:ilvl="6" w:tentative="1">
+      <w:start w:val="1"/>
+      <w:numFmt w:val="bullet"/>
+      <w:lvlText w:val=""/>
+      <w:lvlJc w:val="left"/>
+      <w:pPr>
+        <w:tabs>
+          <w:tab w:val="num" w:pos="5040"/>
+        </w:tabs>
+        <w:ind w:left="5040" w:hanging="360"/>
+      </w:pPr>
+      <w:rPr>
+        <w:rFonts w:ascii="Wingdings" w:hAnsi="Wingdings" w:hint="default"/>
+        <w:sz w:val="20"/>
+      </w:rPr>
+    </w:lvl>
+    <w:lvl w:ilvl="7" w:tentative="1">
+      <w:start w:val="1"/>
+      <w:numFmt w:val="bullet"/>
+      <w:lvlText w:val=""/>
+      <w:lvlJc w:val="left"/>
+      <w:pPr>
+        <w:tabs>
+          <w:tab w:val="num" w:pos="5760"/>
+        </w:tabs>
+        <w:ind w:left="5760" w:hanging="360"/>
+      </w:pPr>
+      <w:rPr>
+        <w:rFonts w:ascii="Wingdings" w:hAnsi="Wingdings" w:hint="default"/>
+        <w:sz w:val="20"/>
+      </w:rPr>
+    </w:lvl>
+    <w:lvl w:ilvl="8" w:tentative="1">
+      <w:start w:val="1"/>
+      <w:numFmt w:val="bullet"/>
+      <w:lvlText w:val=""/>
+      <w:lvlJc w:val="left"/>
+      <w:pPr>
+        <w:tabs>
+          <w:tab w:val="num" w:pos="6480"/>
+        </w:tabs>
+        <w:ind w:left="6480" w:hanging="360"/>
+      </w:pPr>
+      <w:rPr>
+        <w:rFonts w:ascii="Wingdings" w:hAnsi="Wingdings" w:hint="default"/>
+        <w:sz w:val="20"/>
+      </w:rPr>
+    </w:lvl>
+  </w:abstractNum>
+  <w:abstractNum w:abstractNumId="4" w15:restartNumberingAfterBreak="0">
+    <w:nsid w:val="52362668"/>
+    <w:multiLevelType w:val="multilevel"/>
+    <w:tmpl w:val="2EFA759A"/>
+    <w:lvl w:ilvl="0">
+      <w:start w:val="1"/>
+      <w:numFmt w:val="bullet"/>
+      <w:lvlText w:val=""/>
+      <w:lvlJc w:val="left"/>
+      <w:pPr>
+        <w:tabs>
+          <w:tab w:val="num" w:pos="720"/>
+        </w:tabs>
+        <w:ind w:left="720" w:hanging="360"/>
+      </w:pPr>
+      <w:rPr>
+        <w:rFonts w:ascii="Symbol" w:hAnsi="Symbol" w:hint="default"/>
+        <w:sz w:val="20"/>
+      </w:rPr>
+    </w:lvl>
+    <w:lvl w:ilvl="1" w:tentative="1">
+      <w:start w:val="1"/>
+      <w:numFmt w:val="bullet"/>
+      <w:lvlText w:val="o"/>
+      <w:lvlJc w:val="left"/>
+      <w:pPr>
+        <w:tabs>
+          <w:tab w:val="num" w:pos="1440"/>
+        </w:tabs>
+        <w:ind w:left="1440" w:hanging="360"/>
+      </w:pPr>
+      <w:rPr>
+        <w:rFonts w:ascii="Courier New" w:hAnsi="Courier New" w:hint="default"/>
+        <w:sz w:val="20"/>
+      </w:rPr>
+    </w:lvl>
+    <w:lvl w:ilvl="2" w:tentative="1">
+      <w:start w:val="1"/>
+      <w:numFmt w:val="bullet"/>
+      <w:lvlText w:val=""/>
+      <w:lvlJc w:val="left"/>
+      <w:pPr>
+        <w:tabs>
+          <w:tab w:val="num" w:pos="2160"/>
+        </w:tabs>
+        <w:ind w:left="2160" w:hanging="360"/>
+      </w:pPr>
+      <w:rPr>
+        <w:rFonts w:ascii="Wingdings" w:hAnsi="Wingdings" w:hint="default"/>
+        <w:sz w:val="20"/>
+      </w:rPr>
+    </w:lvl>
+    <w:lvl w:ilvl="3" w:tentative="1">
+      <w:start w:val="1"/>
+      <w:numFmt w:val="bullet"/>
+      <w:lvlText w:val=""/>
+      <w:lvlJc w:val="left"/>
+      <w:pPr>
+        <w:tabs>
+          <w:tab w:val="num" w:pos="2880"/>
+        </w:tabs>
+        <w:ind w:left="2880" w:hanging="360"/>
+      </w:pPr>
+      <w:rPr>
+        <w:rFonts w:ascii="Wingdings" w:hAnsi="Wingdings" w:hint="default"/>
+        <w:sz w:val="20"/>
+      </w:rPr>
+    </w:lvl>
+    <w:lvl w:ilvl="4" w:tentative="1">
+      <w:start w:val="1"/>
+      <w:numFmt w:val="bullet"/>
+      <w:lvlText w:val=""/>
+      <w:lvlJc w:val="left"/>
+      <w:pPr>
+        <w:tabs>
+          <w:tab w:val="num" w:pos="3600"/>
+        </w:tabs>
+        <w:ind w:left="3600" w:hanging="360"/>
+      </w:pPr>
+      <w:rPr>
+        <w:rFonts w:ascii="Wingdings" w:hAnsi="Wingdings" w:hint="default"/>
+        <w:sz w:val="20"/>
+      </w:rPr>
+    </w:lvl>
+    <w:lvl w:ilvl="5" w:tentative="1">
+      <w:start w:val="1"/>
+      <w:numFmt w:val="bullet"/>
+      <w:lvlText w:val=""/>
+      <w:lvlJc w:val="left"/>
+      <w:pPr>
+        <w:tabs>
+          <w:tab w:val="num" w:pos="4320"/>
+        </w:tabs>
+        <w:ind w:left="4320" w:hanging="360"/>
+      </w:pPr>
+      <w:rPr>
+        <w:rFonts w:ascii="Wingdings" w:hAnsi="Wingdings" w:hint="default"/>
+        <w:sz w:val="20"/>
+      </w:rPr>
+    </w:lvl>
+    <w:lvl w:ilvl="6" w:tentative="1">
+      <w:start w:val="1"/>
+      <w:numFmt w:val="bullet"/>
+      <w:lvlText w:val=""/>
+      <w:lvlJc w:val="left"/>
+      <w:pPr>
+        <w:tabs>
+          <w:tab w:val="num" w:pos="5040"/>
+        </w:tabs>
+        <w:ind w:left="5040" w:hanging="360"/>
+      </w:pPr>
+      <w:rPr>
+        <w:rFonts w:ascii="Wingdings" w:hAnsi="Wingdings" w:hint="default"/>
+        <w:sz w:val="20"/>
+      </w:rPr>
+    </w:lvl>
+    <w:lvl w:ilvl="7" w:tentative="1">
+      <w:start w:val="1"/>
+      <w:numFmt w:val="bullet"/>
+      <w:lvlText w:val=""/>
+      <w:lvlJc w:val="left"/>
+      <w:pPr>
+        <w:tabs>
+          <w:tab w:val="num" w:pos="5760"/>
+        </w:tabs>
+        <w:ind w:left="5760" w:hanging="360"/>
+      </w:pPr>
+      <w:rPr>
+        <w:rFonts w:ascii="Wingdings" w:hAnsi="Wingdings" w:hint="default"/>
+        <w:sz w:val="20"/>
+      </w:rPr>
+    </w:lvl>
+    <w:lvl w:ilvl="8" w:tentative="1">
+      <w:start w:val="1"/>
+      <w:numFmt w:val="bullet"/>
+      <w:lvlText w:val=""/>
+      <w:lvlJc w:val="left"/>
+      <w:pPr>
+        <w:tabs>
+          <w:tab w:val="num" w:pos="6480"/>
+        </w:tabs>
+        <w:ind w:left="6480" w:hanging="360"/>
+      </w:pPr>
+      <w:rPr>
+        <w:rFonts w:ascii="Wingdings" w:hAnsi="Wingdings" w:hint="default"/>
+        <w:sz w:val="20"/>
+      </w:rPr>
+    </w:lvl>
+  </w:abstractNum>
+  <w:abstractNum w:abstractNumId="5" w15:restartNumberingAfterBreak="0">
     <w:nsid w:val="573713F5"/>
     <w:multiLevelType w:val="hybridMultilevel"/>
     <w:tmpl w:val="98CC3E2E"/>
@@ -1442,11 +5104,139 @@
       </w:pPr>
     </w:lvl>
   </w:abstractNum>
+  <w:abstractNum w:abstractNumId="6" w15:restartNumberingAfterBreak="0">
+    <w:nsid w:val="57A177F9"/>
+    <w:multiLevelType w:val="multilevel"/>
+    <w:tmpl w:val="A3A6C9AE"/>
+    <w:lvl w:ilvl="0">
+      <w:start w:val="1"/>
+      <w:numFmt w:val="decimal"/>
+      <w:lvlText w:val="%1."/>
+      <w:lvlJc w:val="left"/>
+      <w:pPr>
+        <w:tabs>
+          <w:tab w:val="num" w:pos="720"/>
+        </w:tabs>
+        <w:ind w:left="720" w:hanging="360"/>
+      </w:pPr>
+    </w:lvl>
+    <w:lvl w:ilvl="1" w:tentative="1">
+      <w:start w:val="1"/>
+      <w:numFmt w:val="decimal"/>
+      <w:lvlText w:val="%2."/>
+      <w:lvlJc w:val="left"/>
+      <w:pPr>
+        <w:tabs>
+          <w:tab w:val="num" w:pos="1440"/>
+        </w:tabs>
+        <w:ind w:left="1440" w:hanging="360"/>
+      </w:pPr>
+    </w:lvl>
+    <w:lvl w:ilvl="2" w:tentative="1">
+      <w:start w:val="1"/>
+      <w:numFmt w:val="decimal"/>
+      <w:lvlText w:val="%3."/>
+      <w:lvlJc w:val="left"/>
+      <w:pPr>
+        <w:tabs>
+          <w:tab w:val="num" w:pos="2160"/>
+        </w:tabs>
+        <w:ind w:left="2160" w:hanging="360"/>
+      </w:pPr>
+    </w:lvl>
+    <w:lvl w:ilvl="3" w:tentative="1">
+      <w:start w:val="1"/>
+      <w:numFmt w:val="decimal"/>
+      <w:lvlText w:val="%4."/>
+      <w:lvlJc w:val="left"/>
+      <w:pPr>
+        <w:tabs>
+          <w:tab w:val="num" w:pos="2880"/>
+        </w:tabs>
+        <w:ind w:left="2880" w:hanging="360"/>
+      </w:pPr>
+    </w:lvl>
+    <w:lvl w:ilvl="4" w:tentative="1">
+      <w:start w:val="1"/>
+      <w:numFmt w:val="decimal"/>
+      <w:lvlText w:val="%5."/>
+      <w:lvlJc w:val="left"/>
+      <w:pPr>
+        <w:tabs>
+          <w:tab w:val="num" w:pos="3600"/>
+        </w:tabs>
+        <w:ind w:left="3600" w:hanging="360"/>
+      </w:pPr>
+    </w:lvl>
+    <w:lvl w:ilvl="5" w:tentative="1">
+      <w:start w:val="1"/>
+      <w:numFmt w:val="decimal"/>
+      <w:lvlText w:val="%6."/>
+      <w:lvlJc w:val="left"/>
+      <w:pPr>
+        <w:tabs>
+          <w:tab w:val="num" w:pos="4320"/>
+        </w:tabs>
+        <w:ind w:left="4320" w:hanging="360"/>
+      </w:pPr>
+    </w:lvl>
+    <w:lvl w:ilvl="6" w:tentative="1">
+      <w:start w:val="1"/>
+      <w:numFmt w:val="decimal"/>
+      <w:lvlText w:val="%7."/>
+      <w:lvlJc w:val="left"/>
+      <w:pPr>
+        <w:tabs>
+          <w:tab w:val="num" w:pos="5040"/>
+        </w:tabs>
+        <w:ind w:left="5040" w:hanging="360"/>
+      </w:pPr>
+    </w:lvl>
+    <w:lvl w:ilvl="7" w:tentative="1">
+      <w:start w:val="1"/>
+      <w:numFmt w:val="decimal"/>
+      <w:lvlText w:val="%8."/>
+      <w:lvlJc w:val="left"/>
+      <w:pPr>
+        <w:tabs>
+          <w:tab w:val="num" w:pos="5760"/>
+        </w:tabs>
+        <w:ind w:left="5760" w:hanging="360"/>
+      </w:pPr>
+    </w:lvl>
+    <w:lvl w:ilvl="8" w:tentative="1">
+      <w:start w:val="1"/>
+      <w:numFmt w:val="decimal"/>
+      <w:lvlText w:val="%9."/>
+      <w:lvlJc w:val="left"/>
+      <w:pPr>
+        <w:tabs>
+          <w:tab w:val="num" w:pos="6480"/>
+        </w:tabs>
+        <w:ind w:left="6480" w:hanging="360"/>
+      </w:pPr>
+    </w:lvl>
+  </w:abstractNum>
   <w:num w:numId="1" w16cid:durableId="2123303062">
     <w:abstractNumId w:val="0"/>
   </w:num>
   <w:num w:numId="2" w16cid:durableId="2078743805">
+    <w:abstractNumId w:val="5"/>
+  </w:num>
+  <w:num w:numId="3" w16cid:durableId="1731271519">
+    <w:abstractNumId w:val="2"/>
+  </w:num>
+  <w:num w:numId="4" w16cid:durableId="1688369106">
     <w:abstractNumId w:val="1"/>
+  </w:num>
+  <w:num w:numId="5" w16cid:durableId="1247374285">
+    <w:abstractNumId w:val="3"/>
+  </w:num>
+  <w:num w:numId="6" w16cid:durableId="1705977816">
+    <w:abstractNumId w:val="6"/>
+  </w:num>
+  <w:num w:numId="7" w16cid:durableId="415051143">
+    <w:abstractNumId w:val="4"/>
   </w:num>
 </w:numbering>
 </file>
@@ -1901,7 +5691,6 @@
     <w:next w:val="Norml"/>
     <w:link w:val="Cmsor3Char"/>
     <w:uiPriority w:val="9"/>
-    <w:semiHidden/>
     <w:unhideWhenUsed/>
     <w:qFormat/>
     <w:rsid w:val="00BC0E77"/>
@@ -2107,7 +5896,6 @@
     <w:basedOn w:val="Bekezdsalapbettpusa"/>
     <w:link w:val="Cmsor3"/>
     <w:uiPriority w:val="9"/>
-    <w:semiHidden/>
     <w:rsid w:val="00BC0E77"/>
     <w:rPr>
       <w:rFonts w:eastAsiaTheme="majorEastAsia" w:cstheme="majorBidi"/>

</xml_diff>

<commit_message>
documentation: deleted unnecessary blank page
</commit_message>
<xml_diff>
--- a/AronPap_thesis.docx
+++ b/AronPap_thesis.docx
@@ -1366,7 +1366,21 @@
           <w:szCs w:val="28"/>
         </w:rPr>
         <w:lastRenderedPageBreak/>
-        <w:t>Ideális információs ráta: Az algoritmus biztosítja, hogy minden résztvevő számára kiosztott információ arányos legyen a titok méretével ($\rho = 1$), így elkerülve az információs túlterhelést.</w:t>
+        <w:t>Ideális információs ráta: Az algoritmus biztosítja, hogy minden résztvevő számára kiosztott információ arányos legyen a titok méretével (</w:t>
+      </w:r>
+      <w:r>
+        <w:rPr>
+          <w:sz w:val="28"/>
+          <w:szCs w:val="28"/>
+        </w:rPr>
+        <w:t>p</w:t>
+      </w:r>
+      <w:r>
+        <w:rPr>
+          <w:sz w:val="28"/>
+          <w:szCs w:val="28"/>
+        </w:rPr>
+        <w:t xml:space="preserve"> = 1), így elkerülve az információs túlterhelést.</w:t>
       </w:r>
     </w:p>
     <w:p>
@@ -1409,35 +1423,7 @@
           <w:sz w:val="28"/>
           <w:szCs w:val="28"/>
         </w:rPr>
-        <w:t>I. fázis: Inicializáció és struktúraépítés: A hierarchia magasságának (h) meghatározása és a résztvevők besorolása a megfelelő szintekre (</w:t>
-      </w:r>
-      <w:r>
-        <w:rPr>
-          <w:sz w:val="28"/>
-          <w:szCs w:val="28"/>
-        </w:rPr>
-        <w:t>j</w:t>
-      </w:r>
-      <w:r>
-        <w:rPr>
-          <w:sz w:val="28"/>
-          <w:szCs w:val="28"/>
-        </w:rPr>
-        <w:t xml:space="preserve">=1, </w:t>
-      </w:r>
-      <w:r>
-        <w:rPr>
-          <w:sz w:val="28"/>
-          <w:szCs w:val="28"/>
-        </w:rPr>
-        <w:t xml:space="preserve">… </w:t>
-      </w:r>
-      <w:r>
-        <w:rPr>
-          <w:sz w:val="28"/>
-          <w:szCs w:val="28"/>
-        </w:rPr>
-        <w:t>, h). Ebben a szakaszban dől el a "játék szabályrendszere".</w:t>
+        <w:t>I. fázis: Inicializáció és struktúraépítés: A hierarchia magasságának (h) meghatározása és a résztvevők besorolása a megfelelő szintekre (j=1, … , h). Ebben a szakaszban dől el a "játék szabályrendszere".</w:t>
       </w:r>
     </w:p>
     <w:p>
@@ -1979,25 +1965,9 @@
     </w:p>
     <w:p>
       <w:pPr>
-        <w:rPr>
-          <w:sz w:val="28"/>
-          <w:szCs w:val="28"/>
-        </w:rPr>
-      </w:pPr>
-      <w:r>
-        <w:rPr>
-          <w:sz w:val="28"/>
-          <w:szCs w:val="28"/>
-        </w:rPr>
-        <w:br w:type="page"/>
-      </w:r>
-    </w:p>
-    <w:p>
-      <w:pPr>
         <w:pStyle w:val="Cmsor2"/>
       </w:pPr>
       <w:r>
-        <w:lastRenderedPageBreak/>
         <w:t>Implementáció: Az adatmodell és a hierarchia felépítése</w:t>
       </w:r>
     </w:p>
@@ -2217,6 +2187,7 @@
           <w:sz w:val="28"/>
           <w:szCs w:val="28"/>
         </w:rPr>
+        <w:lastRenderedPageBreak/>
         <w:t>A titokmegosztási sémának a biztonságáért felelős, hogy csak a meghatározott hozzáférési struktúrába tartozó részhalmazok legyenek képesek a titok rekonstrukciójára. Az implementáció során egy négypilléres szűrőrendszert dolgoztam ki, amely a matematikai feltételeket és szoftveres integritást egyaránt felügyeli.</w:t>
       </w:r>
     </w:p>
@@ -2277,15 +2248,7 @@
           <w:sz w:val="28"/>
           <w:szCs w:val="28"/>
         </w:rPr>
-        <w:t xml:space="preserve">Logikája, és feltétele, A Python set() adatszerekeztét használva összehasonlítjuk a vizsgált csoport (subset) </w:t>
-      </w:r>
-      <w:r>
-        <w:rPr>
-          <w:sz w:val="28"/>
-          <w:szCs w:val="28"/>
-        </w:rPr>
-        <w:lastRenderedPageBreak/>
-        <w:t>hosszát a benne lévő egyedi objektumok számával. len(set(subset)) == len(subset)</w:t>
+        <w:t>Logikája, és feltétele, A Python set() adatszerekeztét használva összehasonlítjuk a vizsgált csoport (subset) hosszát a benne lévő egyedi objektumok számával. len(set(subset)) == len(subset)</w:t>
       </w:r>
     </w:p>
     <w:p>
@@ -2507,7 +2470,15 @@
           <w:sz w:val="28"/>
           <w:szCs w:val="28"/>
         </w:rPr>
-        <w:t>A szűrési rész szabálya, amely megakadályozza, hogy azonos szinten lévő résztvevők túl nagy csoportja önhatalmúlag hozzáférjen a titokhoz. Ez kényszeríti ki a szintek közötti együttműködést.</w:t>
+        <w:t xml:space="preserve">A szűrési rész szabálya, amely megakadályozza, hogy azonos szinten lévő résztvevők túl nagy csoportja önhatalmúlag </w:t>
+      </w:r>
+      <w:r>
+        <w:rPr>
+          <w:sz w:val="28"/>
+          <w:szCs w:val="28"/>
+        </w:rPr>
+        <w:lastRenderedPageBreak/>
+        <w:t>hozzáférjen a titokhoz. Ez kényszeríti ki a szintek közötti együttműködést.</w:t>
       </w:r>
     </w:p>
     <w:p>
@@ -2631,15 +2602,238 @@
           <w:sz w:val="28"/>
           <w:szCs w:val="28"/>
         </w:rPr>
-        <w:t xml:space="preserve">A -1 konstans biztosítja, hogy egyetlen szint képviselői önmagukban se lehessenek elegendőek a titok </w:t>
-      </w:r>
+        <w:t>A -1 konstans biztosítja, hogy egyetlen szint képviselői önmagukban se lehessenek elegendőek a titok visszafejtéséhez, még akkor sem, ha az összesített súlyuk elérni vagy meghaladná a h+1 küszönértéket.</w:t>
+      </w:r>
+    </w:p>
+    <w:p>
+      <w:pPr>
+        <w:pStyle w:val="Listaszerbekezds"/>
+        <w:numPr>
+          <w:ilvl w:val="2"/>
+          <w:numId w:val="1"/>
+        </w:numPr>
+        <w:rPr>
+          <w:sz w:val="28"/>
+          <w:szCs w:val="28"/>
+        </w:rPr>
+      </w:pPr>
+      <w:r>
+        <w:rPr>
+          <w:sz w:val="28"/>
+          <w:szCs w:val="28"/>
+        </w:rPr>
+        <w:t>Célja, hogy azonos szinten lévő szereplők (például j=2 szinten elhelyezkedő középvezetők) a többi hierarchiai szint tudta és közreműködése nélkül hozzáférjenek a titokhoz.</w:t>
+      </w:r>
+    </w:p>
+    <w:p>
+      <w:pPr>
+        <w:pStyle w:val="Listaszerbekezds"/>
+        <w:numPr>
+          <w:ilvl w:val="2"/>
+          <w:numId w:val="1"/>
+        </w:numPr>
+        <w:rPr>
+          <w:sz w:val="28"/>
+          <w:szCs w:val="28"/>
+        </w:rPr>
+      </w:pPr>
+      <w:r>
+        <w:rPr>
+          <w:sz w:val="28"/>
+          <w:szCs w:val="28"/>
+        </w:rPr>
+        <w:t>Ez kikényszeríti a kooperációt a szintek között. A kvalifikált csoportoknak résztvevői muszáj több különböző szinten elhelyezkedniük.</w:t>
+      </w:r>
+    </w:p>
+    <w:p>
+      <w:pPr>
+        <w:pStyle w:val="Listaszerbekezds"/>
+        <w:numPr>
+          <w:ilvl w:val="2"/>
+          <w:numId w:val="1"/>
+        </w:numPr>
+        <w:rPr>
+          <w:sz w:val="28"/>
+          <w:szCs w:val="28"/>
+        </w:rPr>
+      </w:pPr>
+      <w:r>
+        <w:rPr>
+          <w:sz w:val="28"/>
+          <w:szCs w:val="28"/>
+        </w:rPr>
+        <w:t>A visszaélések elleni védelemben is segít, ha egy adott szinten nagy számú résztvevő tartózkodik, ez a korlát biztosítja, hogy ők ne tudják túlerővel felülbírálni a hierarchikus rendet.</w:t>
+      </w:r>
+    </w:p>
+    <w:p>
+      <w:pPr>
+        <w:pStyle w:val="Cmsor2"/>
+      </w:pPr>
+      <w:r>
+        <w:t>Implementációs technológia és felhasználói szemléltetési felület</w:t>
+      </w:r>
+    </w:p>
+    <w:p>
+      <w:pPr>
+        <w:rPr>
+          <w:sz w:val="28"/>
+          <w:szCs w:val="28"/>
+        </w:rPr>
+      </w:pPr>
+      <w:r>
+        <w:rPr>
+          <w:sz w:val="28"/>
+          <w:szCs w:val="28"/>
+        </w:rPr>
+        <w:t xml:space="preserve">A </w:t>
+      </w:r>
+      <w:r>
+        <w:rPr>
+          <w:sz w:val="28"/>
+          <w:szCs w:val="28"/>
+        </w:rPr>
+        <w:t>hierarchikus titokmegosztási séma gyakorlati megvalósításánál az elsődleges célem az átláthatóság volt. Ebben a fejezetben részletezem a választott eszközöket és a szoftver grafikus felületének felépítését.</w:t>
+      </w:r>
+    </w:p>
+    <w:p>
+      <w:pPr>
+        <w:pStyle w:val="Listaszerbekezds"/>
+        <w:numPr>
+          <w:ilvl w:val="0"/>
+          <w:numId w:val="1"/>
+        </w:numPr>
+        <w:rPr>
+          <w:sz w:val="28"/>
+          <w:szCs w:val="28"/>
+        </w:rPr>
+      </w:pPr>
+      <w:r>
+        <w:rPr>
+          <w:sz w:val="28"/>
+          <w:szCs w:val="28"/>
+        </w:rPr>
+        <w:t>Python és Tkinter</w:t>
+      </w:r>
+    </w:p>
+    <w:p>
+      <w:pPr>
+        <w:pStyle w:val="Listaszerbekezds"/>
+        <w:numPr>
+          <w:ilvl w:val="1"/>
+          <w:numId w:val="1"/>
+        </w:numPr>
+        <w:rPr>
+          <w:sz w:val="28"/>
+          <w:szCs w:val="28"/>
+        </w:rPr>
+      </w:pPr>
+      <w:r>
+        <w:rPr>
+          <w:sz w:val="28"/>
+          <w:szCs w:val="28"/>
+        </w:rPr>
+        <w:t>A fejlesztéshet a Python programozási nyelvet választottam. A választást több szempontból indolkoltam: A titokmegosztás matematikai alapjai (polonomok kezelése, véges testek feletti műveletek) Pythonban hatékonyan implementálhatók.</w:t>
+      </w:r>
+    </w:p>
+    <w:p>
+      <w:pPr>
+        <w:pStyle w:val="Listaszerbekezds"/>
+        <w:numPr>
+          <w:ilvl w:val="1"/>
+          <w:numId w:val="1"/>
+        </w:numPr>
+        <w:rPr>
+          <w:sz w:val="28"/>
+          <w:szCs w:val="28"/>
+        </w:rPr>
+      </w:pPr>
+      <w:r>
+        <w:rPr>
+          <w:sz w:val="28"/>
+          <w:szCs w:val="28"/>
+        </w:rPr>
+        <w:t>A nyelv tömörsége lehetővé tette, hogy az elméleti modellt gyorsan működő kóddá alakítsam</w:t>
+      </w:r>
+    </w:p>
+    <w:p>
+      <w:pPr>
+        <w:pStyle w:val="Listaszerbekezds"/>
+        <w:numPr>
+          <w:ilvl w:val="1"/>
+          <w:numId w:val="1"/>
+        </w:numPr>
+        <w:rPr>
+          <w:sz w:val="28"/>
+          <w:szCs w:val="28"/>
+        </w:rPr>
+      </w:pPr>
       <w:r>
         <w:rPr>
           <w:sz w:val="28"/>
           <w:szCs w:val="28"/>
         </w:rPr>
         <w:lastRenderedPageBreak/>
-        <w:t>visszafejtéséhez, még akkor sem, ha az összesített súlyuk elérni vagy meghaladná a h+1 küszönértéket.</w:t>
+        <w:t xml:space="preserve">A grafikus felhasználói felület megvalósításához a Tkinter könyvtárat használtam. Ez a Python beépített, szabváányos GUI-csomagja. </w:t>
+      </w:r>
+    </w:p>
+    <w:p>
+      <w:pPr>
+        <w:pStyle w:val="Listaszerbekezds"/>
+        <w:numPr>
+          <w:ilvl w:val="1"/>
+          <w:numId w:val="1"/>
+        </w:numPr>
+        <w:rPr>
+          <w:sz w:val="28"/>
+          <w:szCs w:val="28"/>
+        </w:rPr>
+      </w:pPr>
+      <w:r>
+        <w:rPr>
+          <w:sz w:val="28"/>
+          <w:szCs w:val="28"/>
+        </w:rPr>
+        <w:t>A Tkinter natívan integrált, nem igényel külső függőségeket, így a mellékelt kód bármilyen standard Python környezetben azonnal futtatható.</w:t>
+      </w:r>
+    </w:p>
+    <w:p>
+      <w:pPr>
+        <w:pStyle w:val="Listaszerbekezds"/>
+        <w:numPr>
+          <w:ilvl w:val="0"/>
+          <w:numId w:val="1"/>
+        </w:numPr>
+        <w:rPr>
+          <w:sz w:val="28"/>
+          <w:szCs w:val="28"/>
+        </w:rPr>
+      </w:pPr>
+      <w:r>
+        <w:rPr>
+          <w:sz w:val="28"/>
+          <w:szCs w:val="28"/>
+        </w:rPr>
+        <w:t>A felhasználói felület felépítése:</w:t>
+      </w:r>
+    </w:p>
+    <w:p>
+      <w:pPr>
+        <w:pStyle w:val="Listaszerbekezds"/>
+        <w:numPr>
+          <w:ilvl w:val="1"/>
+          <w:numId w:val="1"/>
+        </w:numPr>
+        <w:rPr>
+          <w:sz w:val="28"/>
+          <w:szCs w:val="28"/>
+        </w:rPr>
+      </w:pPr>
+      <w:r>
+        <w:rPr>
+          <w:sz w:val="28"/>
+          <w:szCs w:val="28"/>
+        </w:rPr>
+        <w:t>A main.py fájlban definiált főablak a rendszer irányítóközpontja. A felület logikailag három fő egységre tagolható.</w:t>
       </w:r>
     </w:p>
     <w:p>
@@ -2659,7 +2853,7 @@
           <w:sz w:val="28"/>
           <w:szCs w:val="28"/>
         </w:rPr>
-        <w:t>Célja, hogy azonos szinten lévő szereplők (például j=2 szinten elhelyezkedő középvezetők) a többi hierarchiai szint tudta és közreműködése nélkül hozzáférjenek a titokhoz.</w:t>
+        <w:t>Az ablak tetején helyezkedik el a label_h objektum, amely dinamikusan jelzi a hierarchia aktuális magasságát (h). Ez a paraméter határozza meg a polinom fokszámát és a résztvevők számára választható maximális szintet.</w:t>
       </w:r>
     </w:p>
     <w:p>
@@ -2679,7 +2873,7 @@
           <w:sz w:val="28"/>
           <w:szCs w:val="28"/>
         </w:rPr>
-        <w:t>Ez kikényszeríti a kooperációt a szintek között. A kvalifikált csoportoknak résztvevői muszáj több különböző szinten elhelyezkedniük.</w:t>
+        <w:t>A vezérlőpultban a funkciók eléréséhez egy vízszintes gombelrendezést alkalmaztam. Ez a „Control Panel”, amely segíti a felhasználót a folyamat sorrendiségének betartásában is. A gombok (add, delete, new simulation, distribute, decrypt) a buttonfunctions.py modulban definiált logikát hívják meg</w:t>
       </w:r>
     </w:p>
     <w:p>
@@ -2699,37 +2893,87 @@
           <w:sz w:val="28"/>
           <w:szCs w:val="28"/>
         </w:rPr>
-        <w:t>A visszaélések elleni védelemben is segít, ha egy adott szinten nagy számú résztvevő tartózkodik, ez a korlát biztosítja, hogy ők ne tudják túlerővel felülbírálni a hierarchikus rendet.</w:t>
-      </w:r>
-    </w:p>
-    <w:p>
-      <w:pPr>
-        <w:pStyle w:val="Cmsor2"/>
-      </w:pPr>
-      <w:r>
-        <w:t>Implementációs technológia és felhasználói szemléltetési felület</w:t>
-      </w:r>
-    </w:p>
-    <w:p>
-      <w:pPr>
-        <w:rPr>
-          <w:sz w:val="28"/>
-          <w:szCs w:val="28"/>
-        </w:rPr>
-      </w:pPr>
-      <w:r>
-        <w:rPr>
-          <w:sz w:val="28"/>
-          <w:szCs w:val="28"/>
-        </w:rPr>
-        <w:t xml:space="preserve">A </w:t>
-      </w:r>
-      <w:r>
-        <w:rPr>
-          <w:sz w:val="28"/>
-          <w:szCs w:val="28"/>
-        </w:rPr>
-        <w:t>hierarchikus titokmegosztási séma gyakorlati megvalósításánál az elsődleges célem az átláthatóság volt. Ebben a fejezetben részletezem a választott eszközöket és a szoftver grafikus felületének felépítését.</w:t>
+        <w:t>Adatmegjelenítő táblázat a résztvevők listázásához a ttk.Treeview komponenst választottam. Ez a modern táblázatos megjelenítő három oszlopot kezel:</w:t>
+      </w:r>
+    </w:p>
+    <w:p>
+      <w:pPr>
+        <w:pStyle w:val="Listaszerbekezds"/>
+        <w:numPr>
+          <w:ilvl w:val="3"/>
+          <w:numId w:val="1"/>
+        </w:numPr>
+        <w:rPr>
+          <w:sz w:val="28"/>
+          <w:szCs w:val="28"/>
+        </w:rPr>
+      </w:pPr>
+      <w:r>
+        <w:rPr>
+          <w:sz w:val="28"/>
+          <w:szCs w:val="28"/>
+        </w:rPr>
+        <w:t>ID: A résztvevő globálisan egyedi azonosítója (i).</w:t>
+      </w:r>
+    </w:p>
+    <w:p>
+      <w:pPr>
+        <w:pStyle w:val="Listaszerbekezds"/>
+        <w:numPr>
+          <w:ilvl w:val="3"/>
+          <w:numId w:val="1"/>
+        </w:numPr>
+        <w:rPr>
+          <w:sz w:val="28"/>
+          <w:szCs w:val="28"/>
+        </w:rPr>
+      </w:pPr>
+      <w:r>
+        <w:rPr>
+          <w:sz w:val="28"/>
+          <w:szCs w:val="28"/>
+        </w:rPr>
+        <w:t>Level: A hierarchikus rang (j), amely meghatározza a súlyt.</w:t>
+      </w:r>
+    </w:p>
+    <w:p>
+      <w:pPr>
+        <w:pStyle w:val="Listaszerbekezds"/>
+        <w:numPr>
+          <w:ilvl w:val="3"/>
+          <w:numId w:val="1"/>
+        </w:numPr>
+        <w:rPr>
+          <w:sz w:val="28"/>
+          <w:szCs w:val="28"/>
+        </w:rPr>
+      </w:pPr>
+      <w:r>
+        <w:rPr>
+          <w:sz w:val="28"/>
+          <w:szCs w:val="28"/>
+        </w:rPr>
+        <w:t>Shares: Itt jelennek meg a már kiosztott titok-töredékek.</w:t>
+      </w:r>
+    </w:p>
+    <w:p>
+      <w:pPr>
+        <w:pStyle w:val="Listaszerbekezds"/>
+        <w:numPr>
+          <w:ilvl w:val="2"/>
+          <w:numId w:val="1"/>
+        </w:numPr>
+        <w:rPr>
+          <w:sz w:val="28"/>
+          <w:szCs w:val="28"/>
+        </w:rPr>
+      </w:pPr>
+      <w:r>
+        <w:rPr>
+          <w:sz w:val="28"/>
+          <w:szCs w:val="28"/>
+        </w:rPr>
+        <w:t>Ez a vizuális reprezentáció engedélyezi az olvasót egyszerű használatra, átláthatóságra és a titkosítás működtetésére.</w:t>
       </w:r>
     </w:p>
     <w:p>
@@ -2749,7 +2993,7 @@
           <w:sz w:val="28"/>
           <w:szCs w:val="28"/>
         </w:rPr>
-        <w:t>Python és Tkinter</w:t>
+        <w:t>Perzisztens Adatkezelés: SQLite</w:t>
       </w:r>
     </w:p>
     <w:p>
@@ -2769,7 +3013,7 @@
           <w:sz w:val="28"/>
           <w:szCs w:val="28"/>
         </w:rPr>
-        <w:t>A fejlesztéshet a Python programozási nyelvet választottam. A választást több szempontból indolkoltam: A titokmegosztás matematikai alapjai (polonomok kezelése, véges testek feletti műveletek) Pythonban hatékonyan implementálhatók.</w:t>
+        <w:t>A szoftver egyik legfontosabb jellemzője, hogy az adatokat nem csupán a memőriába tárolja, hanem egy adatbázisban is rögzíti. Ez biztosítja, hogy a szimuláció állapota a program bezárása és újraindítása után is megmaradjon.</w:t>
       </w:r>
     </w:p>
     <w:p>
@@ -2789,7 +3033,75 @@
           <w:sz w:val="28"/>
           <w:szCs w:val="28"/>
         </w:rPr>
-        <w:t>A nyelv tömörsége lehetővé tette, hogy az elméleti modellt gyorsan működő kóddá alakítsam</w:t>
+        <w:t>Két táblát hoztam létre a hierarchy.db fájlba:</w:t>
+      </w:r>
+    </w:p>
+    <w:p>
+      <w:pPr>
+        <w:pStyle w:val="Listaszerbekezds"/>
+        <w:numPr>
+          <w:ilvl w:val="2"/>
+          <w:numId w:val="1"/>
+        </w:numPr>
+        <w:rPr>
+          <w:sz w:val="28"/>
+          <w:szCs w:val="28"/>
+        </w:rPr>
+      </w:pPr>
+      <w:r>
+        <w:rPr>
+          <w:sz w:val="28"/>
+          <w:szCs w:val="28"/>
+        </w:rPr>
+        <w:t xml:space="preserve">hierarchy_settings: Ez tárolja a rendszer globális konfigurációját, ami a fa magassága. Ez biztosítja, hogy a </w:t>
+      </w:r>
+      <w:r>
+        <w:rPr>
+          <w:sz w:val="28"/>
+          <w:szCs w:val="28"/>
+        </w:rPr>
+        <w:lastRenderedPageBreak/>
+        <w:t>program tudja, milyen szabályrendszer szerint indult el legutóbb</w:t>
+      </w:r>
+    </w:p>
+    <w:p>
+      <w:pPr>
+        <w:pStyle w:val="Listaszerbekezds"/>
+        <w:numPr>
+          <w:ilvl w:val="2"/>
+          <w:numId w:val="1"/>
+        </w:numPr>
+        <w:rPr>
+          <w:sz w:val="28"/>
+          <w:szCs w:val="28"/>
+        </w:rPr>
+      </w:pPr>
+      <w:r>
+        <w:rPr>
+          <w:sz w:val="28"/>
+          <w:szCs w:val="28"/>
+        </w:rPr>
+        <w:t>participants: Itt tárolódnak a dolgozók adatai. A shares oszlop TEXT típust kapott, mivel egy résztvevőnek több koordinátája is lehet, amelyeket vesszővel elválasztott karakterláncként mentődik el, majd betöltéskoz visszaalakítódik listává.</w:t>
+      </w:r>
+    </w:p>
+    <w:p>
+      <w:pPr>
+        <w:pStyle w:val="Listaszerbekezds"/>
+        <w:numPr>
+          <w:ilvl w:val="0"/>
+          <w:numId w:val="1"/>
+        </w:numPr>
+        <w:rPr>
+          <w:sz w:val="28"/>
+          <w:szCs w:val="28"/>
+        </w:rPr>
+      </w:pPr>
+      <w:r>
+        <w:rPr>
+          <w:sz w:val="28"/>
+          <w:szCs w:val="28"/>
+        </w:rPr>
+        <w:t>Rendszer inicializálása:</w:t>
       </w:r>
     </w:p>
     <w:p>
@@ -2809,7 +3121,34 @@
           <w:sz w:val="28"/>
           <w:szCs w:val="28"/>
         </w:rPr>
-        <w:t xml:space="preserve">A grafikus felhasználói felület megvalósításához a Tkinter könyvtárat használtam. Ez a Python beépített, szabváányos GUI-csomagja. </w:t>
+        <w:t>A szoftver ind</w:t>
+      </w:r>
+      <w:r>
+        <w:rPr>
+          <w:sz w:val="28"/>
+          <w:szCs w:val="28"/>
+        </w:rPr>
+        <w:t xml:space="preserve">ításakor egy folyamat zajlik le, amely garantálja, hogy a modell és az adatbázis szinkronban legyen. </w:t>
+      </w:r>
+    </w:p>
+    <w:p>
+      <w:pPr>
+        <w:pStyle w:val="Listaszerbekezds"/>
+        <w:numPr>
+          <w:ilvl w:val="2"/>
+          <w:numId w:val="1"/>
+        </w:numPr>
+        <w:rPr>
+          <w:sz w:val="28"/>
+          <w:szCs w:val="28"/>
+        </w:rPr>
+      </w:pPr>
+      <w:r>
+        <w:rPr>
+          <w:sz w:val="28"/>
+          <w:szCs w:val="28"/>
+        </w:rPr>
+        <w:t>A program futása a sqlite3.connect(„hierarchy.db”) hívással kezdődik. Az SQLite egyik előnye, hogy ha a fájl nem létezik, automatikusan létrehozza azt. Ezt követően a rendszer CREATE TABLE IF NOT EXISTS parancsokat futtat, amelyekkel biztosítja a participants és a hierarchy_settings táblák meglétét.</w:t>
       </w:r>
     </w:p>
     <w:p>
@@ -2829,27 +3168,27 @@
           <w:sz w:val="28"/>
           <w:szCs w:val="28"/>
         </w:rPr>
-        <w:t>A Tkinter natívan integrált, nem igényel külső függőségeket, így a mellékelt kód bármilyen standard Python környezetben azonnal futtatható.</w:t>
-      </w:r>
-    </w:p>
-    <w:p>
-      <w:pPr>
-        <w:pStyle w:val="Listaszerbekezds"/>
-        <w:numPr>
-          <w:ilvl w:val="0"/>
-          <w:numId w:val="1"/>
-        </w:numPr>
-        <w:rPr>
-          <w:sz w:val="28"/>
-          <w:szCs w:val="28"/>
-        </w:rPr>
-      </w:pPr>
-      <w:r>
-        <w:rPr>
-          <w:sz w:val="28"/>
-          <w:szCs w:val="28"/>
-        </w:rPr>
-        <w:t>A felhasználói felület felépítése:</w:t>
+        <w:t>Az első indításkor, ha a hierarchy_settings tábla üres, vagy nem lett létrehozva, a program egy alapértelmezett értéket (h=3)-at szúr be, és ezzel hozza létre a Hierarchy objektumot.</w:t>
+      </w:r>
+    </w:p>
+    <w:p>
+      <w:pPr>
+        <w:pStyle w:val="Listaszerbekezds"/>
+        <w:numPr>
+          <w:ilvl w:val="2"/>
+          <w:numId w:val="1"/>
+        </w:numPr>
+        <w:rPr>
+          <w:sz w:val="28"/>
+          <w:szCs w:val="28"/>
+        </w:rPr>
+      </w:pPr>
+      <w:r>
+        <w:rPr>
+          <w:sz w:val="28"/>
+          <w:szCs w:val="28"/>
+        </w:rPr>
+        <w:t>Ha már van mentett érték, a rendszer beolvassa azt. Ez kritikus fontosságú, hiszen ha korábban már adtunk hozzá résztvevőket egy h = 5 magasságú rendszerhez, akkor a programnak ugyanazzal a keretrendszerrel kell indulnia, hogy a szintek validációja ne bukjon el.</w:t>
       </w:r>
     </w:p>
     <w:p>
@@ -2869,382 +3208,6 @@
           <w:sz w:val="28"/>
           <w:szCs w:val="28"/>
         </w:rPr>
-        <w:t>A main.py fájlban definiált főablak a rendszer irányítóközpontja. A felület logikailag három fő egységre tagolható.</w:t>
-      </w:r>
-    </w:p>
-    <w:p>
-      <w:pPr>
-        <w:pStyle w:val="Listaszerbekezds"/>
-        <w:numPr>
-          <w:ilvl w:val="2"/>
-          <w:numId w:val="1"/>
-        </w:numPr>
-        <w:rPr>
-          <w:sz w:val="28"/>
-          <w:szCs w:val="28"/>
-        </w:rPr>
-      </w:pPr>
-      <w:r>
-        <w:rPr>
-          <w:sz w:val="28"/>
-          <w:szCs w:val="28"/>
-        </w:rPr>
-        <w:t>Az ablak tetején helyezkedik el a label_h objektum, amely dinamikusan jelzi a hierarchia aktuális magasságát (h). Ez a paraméter határozza meg a polinom fokszámát és a résztvevők számára választható maximális szintet.</w:t>
-      </w:r>
-    </w:p>
-    <w:p>
-      <w:pPr>
-        <w:pStyle w:val="Listaszerbekezds"/>
-        <w:numPr>
-          <w:ilvl w:val="2"/>
-          <w:numId w:val="1"/>
-        </w:numPr>
-        <w:rPr>
-          <w:sz w:val="28"/>
-          <w:szCs w:val="28"/>
-        </w:rPr>
-      </w:pPr>
-      <w:r>
-        <w:rPr>
-          <w:sz w:val="28"/>
-          <w:szCs w:val="28"/>
-        </w:rPr>
-        <w:lastRenderedPageBreak/>
-        <w:t>A vezérlőpultban a funkciók eléréséhez egy vízszintes gombelrendezést alkalmaztam. Ez a „Control Panel”, amely segíti a felhasználót a folyamat sorrendiségének betartásában is. A gombok (add, delete, new simulation, distribute, decrypt) a buttonfunctions.py modulban definiált logikát hívják meg</w:t>
-      </w:r>
-    </w:p>
-    <w:p>
-      <w:pPr>
-        <w:pStyle w:val="Listaszerbekezds"/>
-        <w:numPr>
-          <w:ilvl w:val="2"/>
-          <w:numId w:val="1"/>
-        </w:numPr>
-        <w:rPr>
-          <w:sz w:val="28"/>
-          <w:szCs w:val="28"/>
-        </w:rPr>
-      </w:pPr>
-      <w:r>
-        <w:rPr>
-          <w:sz w:val="28"/>
-          <w:szCs w:val="28"/>
-        </w:rPr>
-        <w:t>Adatmegjelenítő táblázat a résztvevők listázásához a ttk.Treeview komponenst választottam. Ez a modern táblázatos megjelenítő három oszlopot kezel:</w:t>
-      </w:r>
-    </w:p>
-    <w:p>
-      <w:pPr>
-        <w:pStyle w:val="Listaszerbekezds"/>
-        <w:numPr>
-          <w:ilvl w:val="3"/>
-          <w:numId w:val="1"/>
-        </w:numPr>
-        <w:rPr>
-          <w:sz w:val="28"/>
-          <w:szCs w:val="28"/>
-        </w:rPr>
-      </w:pPr>
-      <w:r>
-        <w:rPr>
-          <w:sz w:val="28"/>
-          <w:szCs w:val="28"/>
-        </w:rPr>
-        <w:t>ID: A résztvevő globálisan egyedi azonosítója (i).</w:t>
-      </w:r>
-    </w:p>
-    <w:p>
-      <w:pPr>
-        <w:pStyle w:val="Listaszerbekezds"/>
-        <w:numPr>
-          <w:ilvl w:val="3"/>
-          <w:numId w:val="1"/>
-        </w:numPr>
-        <w:rPr>
-          <w:sz w:val="28"/>
-          <w:szCs w:val="28"/>
-        </w:rPr>
-      </w:pPr>
-      <w:r>
-        <w:rPr>
-          <w:sz w:val="28"/>
-          <w:szCs w:val="28"/>
-        </w:rPr>
-        <w:t>Level: A hierarchikus rang (j), amely meghatározza a súlyt.</w:t>
-      </w:r>
-    </w:p>
-    <w:p>
-      <w:pPr>
-        <w:pStyle w:val="Listaszerbekezds"/>
-        <w:numPr>
-          <w:ilvl w:val="3"/>
-          <w:numId w:val="1"/>
-        </w:numPr>
-        <w:rPr>
-          <w:sz w:val="28"/>
-          <w:szCs w:val="28"/>
-        </w:rPr>
-      </w:pPr>
-      <w:r>
-        <w:rPr>
-          <w:sz w:val="28"/>
-          <w:szCs w:val="28"/>
-        </w:rPr>
-        <w:t>Shares: Itt jelennek meg a már kiosztott titok-töredékek.</w:t>
-      </w:r>
-    </w:p>
-    <w:p>
-      <w:pPr>
-        <w:pStyle w:val="Listaszerbekezds"/>
-        <w:numPr>
-          <w:ilvl w:val="2"/>
-          <w:numId w:val="1"/>
-        </w:numPr>
-        <w:rPr>
-          <w:sz w:val="28"/>
-          <w:szCs w:val="28"/>
-        </w:rPr>
-      </w:pPr>
-      <w:r>
-        <w:rPr>
-          <w:sz w:val="28"/>
-          <w:szCs w:val="28"/>
-        </w:rPr>
-        <w:t>Ez a vizuális reprezentáció engedélyezi az olvasót egyszerű használatra, átláthatóságra és a titkosítás működtetésére.</w:t>
-      </w:r>
-    </w:p>
-    <w:p>
-      <w:pPr>
-        <w:pStyle w:val="Listaszerbekezds"/>
-        <w:numPr>
-          <w:ilvl w:val="0"/>
-          <w:numId w:val="1"/>
-        </w:numPr>
-        <w:rPr>
-          <w:sz w:val="28"/>
-          <w:szCs w:val="28"/>
-        </w:rPr>
-      </w:pPr>
-      <w:r>
-        <w:rPr>
-          <w:sz w:val="28"/>
-          <w:szCs w:val="28"/>
-        </w:rPr>
-        <w:t>Perzisztens Adatkezelés: SQLite</w:t>
-      </w:r>
-    </w:p>
-    <w:p>
-      <w:pPr>
-        <w:pStyle w:val="Listaszerbekezds"/>
-        <w:numPr>
-          <w:ilvl w:val="1"/>
-          <w:numId w:val="1"/>
-        </w:numPr>
-        <w:rPr>
-          <w:sz w:val="28"/>
-          <w:szCs w:val="28"/>
-        </w:rPr>
-      </w:pPr>
-      <w:r>
-        <w:rPr>
-          <w:sz w:val="28"/>
-          <w:szCs w:val="28"/>
-        </w:rPr>
-        <w:t>A szoftver egyik legfontosabb jellemzője, hogy az adatokat nem csupán a memőriába tárolja, hanem egy adatbázisban is rögzíti. Ez biztosítja, hogy a szimuláció állapota a program bezárása és újraindítása után is megmaradjon.</w:t>
-      </w:r>
-    </w:p>
-    <w:p>
-      <w:pPr>
-        <w:pStyle w:val="Listaszerbekezds"/>
-        <w:numPr>
-          <w:ilvl w:val="1"/>
-          <w:numId w:val="1"/>
-        </w:numPr>
-        <w:rPr>
-          <w:sz w:val="28"/>
-          <w:szCs w:val="28"/>
-        </w:rPr>
-      </w:pPr>
-      <w:r>
-        <w:rPr>
-          <w:sz w:val="28"/>
-          <w:szCs w:val="28"/>
-        </w:rPr>
-        <w:t>Két táblát hoztam létre a hierarchy.db fájlba:</w:t>
-      </w:r>
-    </w:p>
-    <w:p>
-      <w:pPr>
-        <w:pStyle w:val="Listaszerbekezds"/>
-        <w:numPr>
-          <w:ilvl w:val="2"/>
-          <w:numId w:val="1"/>
-        </w:numPr>
-        <w:rPr>
-          <w:sz w:val="28"/>
-          <w:szCs w:val="28"/>
-        </w:rPr>
-      </w:pPr>
-      <w:r>
-        <w:rPr>
-          <w:sz w:val="28"/>
-          <w:szCs w:val="28"/>
-        </w:rPr>
-        <w:t>hierarchy_settings: Ez tárolja a rendszer globális konfigurációját, ami a fa magassága. Ez biztosítja, hogy a program tudja, milyen szabályrendszer szerint indult el legutóbb</w:t>
-      </w:r>
-    </w:p>
-    <w:p>
-      <w:pPr>
-        <w:pStyle w:val="Listaszerbekezds"/>
-        <w:numPr>
-          <w:ilvl w:val="2"/>
-          <w:numId w:val="1"/>
-        </w:numPr>
-        <w:rPr>
-          <w:sz w:val="28"/>
-          <w:szCs w:val="28"/>
-        </w:rPr>
-      </w:pPr>
-      <w:r>
-        <w:rPr>
-          <w:sz w:val="28"/>
-          <w:szCs w:val="28"/>
-        </w:rPr>
-        <w:t>participants: Itt tárolódnak a dolgozók adatai. A shares oszlop TEXT típust kapott, mivel egy résztvevőnek több koordinátája is lehet, amelyeket vesszővel elválasztott karakterláncként mentődik el, majd betöltéskoz visszaalakítódik listává.</w:t>
-      </w:r>
-    </w:p>
-    <w:p>
-      <w:pPr>
-        <w:pStyle w:val="Listaszerbekezds"/>
-        <w:numPr>
-          <w:ilvl w:val="0"/>
-          <w:numId w:val="1"/>
-        </w:numPr>
-        <w:rPr>
-          <w:sz w:val="28"/>
-          <w:szCs w:val="28"/>
-        </w:rPr>
-      </w:pPr>
-      <w:r>
-        <w:rPr>
-          <w:sz w:val="28"/>
-          <w:szCs w:val="28"/>
-        </w:rPr>
-        <w:t>Rendszer inicializálása:</w:t>
-      </w:r>
-    </w:p>
-    <w:p>
-      <w:pPr>
-        <w:pStyle w:val="Listaszerbekezds"/>
-        <w:numPr>
-          <w:ilvl w:val="1"/>
-          <w:numId w:val="1"/>
-        </w:numPr>
-        <w:rPr>
-          <w:sz w:val="28"/>
-          <w:szCs w:val="28"/>
-        </w:rPr>
-      </w:pPr>
-      <w:r>
-        <w:rPr>
-          <w:sz w:val="28"/>
-          <w:szCs w:val="28"/>
-        </w:rPr>
-        <w:t>A szoftver ind</w:t>
-      </w:r>
-      <w:r>
-        <w:rPr>
-          <w:sz w:val="28"/>
-          <w:szCs w:val="28"/>
-        </w:rPr>
-        <w:t xml:space="preserve">ításakor egy folyamat zajlik le, amely garantálja, hogy a modell és az adatbázis szinkronban legyen. </w:t>
-      </w:r>
-    </w:p>
-    <w:p>
-      <w:pPr>
-        <w:pStyle w:val="Listaszerbekezds"/>
-        <w:numPr>
-          <w:ilvl w:val="2"/>
-          <w:numId w:val="1"/>
-        </w:numPr>
-        <w:rPr>
-          <w:sz w:val="28"/>
-          <w:szCs w:val="28"/>
-        </w:rPr>
-      </w:pPr>
-      <w:r>
-        <w:rPr>
-          <w:sz w:val="28"/>
-          <w:szCs w:val="28"/>
-        </w:rPr>
-        <w:t xml:space="preserve">A program futása a sqlite3.connect(„hierarchy.db”) hívással kezdődik. Az SQLite egyik előnye, hogy ha a fájl nem létezik, automatikusan létrehozza azt. Ezt követően a rendszer </w:t>
-      </w:r>
-      <w:r>
-        <w:rPr>
-          <w:sz w:val="28"/>
-          <w:szCs w:val="28"/>
-        </w:rPr>
-        <w:lastRenderedPageBreak/>
-        <w:t>CREATE TABLE IF NOT EXISTS parancsokat futtat, amelyekkel biztosítja a participants és a hierarchy_settings táblák meglétét.</w:t>
-      </w:r>
-    </w:p>
-    <w:p>
-      <w:pPr>
-        <w:pStyle w:val="Listaszerbekezds"/>
-        <w:numPr>
-          <w:ilvl w:val="1"/>
-          <w:numId w:val="1"/>
-        </w:numPr>
-        <w:rPr>
-          <w:sz w:val="28"/>
-          <w:szCs w:val="28"/>
-        </w:rPr>
-      </w:pPr>
-      <w:r>
-        <w:rPr>
-          <w:sz w:val="28"/>
-          <w:szCs w:val="28"/>
-        </w:rPr>
-        <w:t>Az első indításkor, ha a hierarchy_settings tábla üres, vagy nem lett létrehozva, a program egy alapértelmezett értéket (h=3)-at szúr be, és ezzel hozza létre a Hierarchy objektumot.</w:t>
-      </w:r>
-    </w:p>
-    <w:p>
-      <w:pPr>
-        <w:pStyle w:val="Listaszerbekezds"/>
-        <w:numPr>
-          <w:ilvl w:val="2"/>
-          <w:numId w:val="1"/>
-        </w:numPr>
-        <w:rPr>
-          <w:sz w:val="28"/>
-          <w:szCs w:val="28"/>
-        </w:rPr>
-      </w:pPr>
-      <w:r>
-        <w:rPr>
-          <w:sz w:val="28"/>
-          <w:szCs w:val="28"/>
-        </w:rPr>
-        <w:t>Ha már van mentett érték, a rendszer beolvassa azt. Ez kritikus fontosságú, hiszen ha korábban már adtunk hozzá résztvevőket egy h = 5 magasságú rendszerhez, akkor a programnak ugyanazzal a keretrendszerrel kell indulnia, hogy a szintek validációja ne bukjon el.</w:t>
-      </w:r>
-    </w:p>
-    <w:p>
-      <w:pPr>
-        <w:pStyle w:val="Listaszerbekezds"/>
-        <w:numPr>
-          <w:ilvl w:val="1"/>
-          <w:numId w:val="1"/>
-        </w:numPr>
-        <w:rPr>
-          <w:sz w:val="28"/>
-          <w:szCs w:val="28"/>
-        </w:rPr>
-      </w:pPr>
-      <w:r>
-        <w:rPr>
-          <w:sz w:val="28"/>
-          <w:szCs w:val="28"/>
-        </w:rPr>
         <w:t>Az inicializálás utolsó lépése, hogy a GUI frissítése</w:t>
       </w:r>
     </w:p>
@@ -3257,6 +3220,7 @@
       </w:pPr>
       <w:r>
         <w:rPr>
+          <w:noProof/>
           <w:sz w:val="28"/>
           <w:szCs w:val="28"/>
         </w:rPr>
@@ -3316,6 +3280,7 @@
           <w:sz w:val="28"/>
           <w:szCs w:val="28"/>
         </w:rPr>
+        <w:lastRenderedPageBreak/>
         <w:t>A fenti kép a UI</w:t>
       </w:r>
       <w:r>
@@ -3542,10 +3507,10 @@
       </w:pPr>
       <w:r>
         <w:rPr>
-          <w:sz w:val="28"/>
-          <w:szCs w:val="28"/>
-        </w:rPr>
-        <w:lastRenderedPageBreak/>
+          <w:noProof/>
+          <w:sz w:val="28"/>
+          <w:szCs w:val="28"/>
+        </w:rPr>
         <w:drawing>
           <wp:inline distT="0" distB="0" distL="0" distR="0" wp14:anchorId="5B187FF0" wp14:editId="090CEACA">
             <wp:extent cx="3752850" cy="2690122"/>
@@ -3612,9 +3577,11 @@
       </w:pPr>
       <w:r>
         <w:rPr>
-          <w:sz w:val="28"/>
-          <w:szCs w:val="28"/>
-        </w:rPr>
+          <w:noProof/>
+          <w:sz w:val="28"/>
+          <w:szCs w:val="28"/>
+        </w:rPr>
+        <w:lastRenderedPageBreak/>
         <w:drawing>
           <wp:inline distT="0" distB="0" distL="0" distR="0" wp14:anchorId="46F7AB70" wp14:editId="2678C054">
             <wp:extent cx="3752850" cy="2690122"/>
@@ -3725,15 +3692,7 @@
           <w:sz w:val="28"/>
           <w:szCs w:val="28"/>
         </w:rPr>
-        <w:t xml:space="preserve">A rendszer első védelmi vonala a bemeneti adat ellenőrzése. Mivel a hierarchikus modell magassága fixált, a programnak meg kell akadályozni, hogy a felhasználó olyan szintet adjon meg, amely nem létezik. (például h </w:t>
-      </w:r>
-      <w:r>
-        <w:rPr>
-          <w:sz w:val="28"/>
-          <w:szCs w:val="28"/>
-        </w:rPr>
-        <w:lastRenderedPageBreak/>
-        <w:t>= 3 esetén egy 4.szintű dolgozó felvétele). A kódban található if not (1&lt;=level&lt;=hierarchy.h) feltétel garantálja.</w:t>
+        <w:t>A rendszer első védelmi vonala a bemeneti adat ellenőrzése. Mivel a hierarchikus modell magassága fixált, a programnak meg kell akadályozni, hogy a felhasználó olyan szintet adjon meg, amely nem létezik. (például h = 3 esetén egy 4.szintű dolgozó felvétele). A kódban található if not (1&lt;=level&lt;=hierarchy.h) feltétel garantálja.</w:t>
       </w:r>
     </w:p>
     <w:p>
@@ -3770,6 +3729,7 @@
       </w:pPr>
       <w:r>
         <w:rPr>
+          <w:noProof/>
           <w:sz w:val="28"/>
           <w:szCs w:val="28"/>
         </w:rPr>
@@ -3867,6 +3827,7 @@
           <w:sz w:val="28"/>
           <w:szCs w:val="28"/>
         </w:rPr>
+        <w:lastRenderedPageBreak/>
         <w:t>Amennyibben a az adatbázis üres, az első résztvevő 1-es azonosítót kap, minden további esetben a max_id + 1 formul</w:t>
       </w:r>
       <w:r>
@@ -3997,15 +3958,7 @@
           <w:sz w:val="28"/>
           <w:szCs w:val="28"/>
         </w:rPr>
-        <w:t xml:space="preserve">A törlés alapfeltétele létező ID megadása. A program az execute(„DELETE FROM participants WHERE id = ?”) paranccsal próbálja eltávolítani a </w:t>
-      </w:r>
-      <w:r>
-        <w:rPr>
-          <w:sz w:val="28"/>
-          <w:szCs w:val="28"/>
-        </w:rPr>
-        <w:lastRenderedPageBreak/>
-        <w:t>rekodot. A cursor.rowcount == 0 ellenőrzés egy biztonsági elem: ha a felhasználó olyan ID-t ad meg, amelyik nem létezik a rendszer hibaüzenetet küld</w:t>
+        <w:t>A törlés alapfeltétele létező ID megadása. A program az execute(„DELETE FROM participants WHERE id = ?”) paranccsal próbálja eltávolítani a rekodot. A cursor.rowcount == 0 ellenőrzés egy biztonsági elem: ha a felhasználó olyan ID-t ad meg, amelyik nem létezik a rendszer hibaüzenetet küld</w:t>
       </w:r>
     </w:p>
     <w:p>
@@ -4022,6 +3975,7 @@
       </w:pPr>
       <w:r>
         <w:rPr>
+          <w:noProof/>
           <w:sz w:val="28"/>
           <w:szCs w:val="28"/>
         </w:rPr>
@@ -4106,6 +4060,7 @@
           <w:sz w:val="28"/>
           <w:szCs w:val="28"/>
         </w:rPr>
+        <w:lastRenderedPageBreak/>
         <w:t xml:space="preserve">A program végigiterál a hierarchy.levels szótár összes listáján, és eltávolítja az adott azonosítóval rendelkező objektumot (résztvevőt) a hierarchiából. </w:t>
       </w:r>
     </w:p>
@@ -4256,22 +4211,23 @@
           <w:sz w:val="28"/>
           <w:szCs w:val="28"/>
         </w:rPr>
+        <w:t xml:space="preserve">A folyamat végén a táblázat összes sora törlődik, és a főablak tetején lévő felirat is frissűl az új magasságra. </w:t>
+      </w:r>
+    </w:p>
+    <w:p>
+      <w:pPr>
+        <w:rPr>
+          <w:sz w:val="28"/>
+          <w:szCs w:val="28"/>
+        </w:rPr>
+      </w:pPr>
+      <w:r>
+        <w:rPr>
+          <w:noProof/>
+          <w:sz w:val="28"/>
+          <w:szCs w:val="28"/>
+        </w:rPr>
         <w:lastRenderedPageBreak/>
-        <w:t xml:space="preserve">A folyamat végén a táblázat összes sora törlődik, és a főablak tetején lévő felirat is frissűl az új magasságra. </w:t>
-      </w:r>
-    </w:p>
-    <w:p>
-      <w:pPr>
-        <w:rPr>
-          <w:sz w:val="28"/>
-          <w:szCs w:val="28"/>
-        </w:rPr>
-      </w:pPr>
-      <w:r>
-        <w:rPr>
-          <w:sz w:val="28"/>
-          <w:szCs w:val="28"/>
-        </w:rPr>
         <w:drawing>
           <wp:inline distT="0" distB="0" distL="0" distR="0" wp14:anchorId="445E55AB" wp14:editId="060CDB99">
             <wp:extent cx="4904624" cy="3517900"/>
@@ -4333,6 +4289,7 @@
       </w:pPr>
       <w:r>
         <w:rPr>
+          <w:noProof/>
           <w:sz w:val="28"/>
           <w:szCs w:val="28"/>
         </w:rPr>
@@ -5842,6 +5799,7 @@
   <w:style w:type="character" w:default="1" w:styleId="Bekezdsalapbettpusa">
     <w:name w:val="Default Paragraph Font"/>
     <w:uiPriority w:val="1"/>
+    <w:semiHidden/>
     <w:unhideWhenUsed/>
   </w:style>
   <w:style w:type="table" w:default="1" w:styleId="Normltblzat">

</xml_diff>